<commit_message>
Restructure consent pack: lead with short form copy (Part A), reference pack (Part B)
Part A is the patient-facing tick-box wording for the form builder; Part B
is the detailed compliance reference for the data adviser. Regenerated docx,
HTML, and PDF so all three match.

Co-Authored-By: Claude Opus 4.8 <noreply@anthropic.com>
Claude-Session: https://claude.ai/code/session_01Qk44oiJ6G4KGcJdussGzUo
</commit_message>
<xml_diff>
--- a/outputs/schoeman-clinic/Schoeman-Clinic-Consent-DataProtection-Pack.docx
+++ b/outputs/schoeman-clinic/Schoeman-Clinic-Consent-DataProtection-Pack.docx
@@ -46,6 +46,327 @@
     </w:p>
     <w:p>
       <w:pPr>
+        <w:spacing w:after="160" w:before="0"/>
+      </w:pPr>
+      <w:r>
+        <w:rPr>
+          <w:b w:val="0"/>
+          <w:i w:val="0"/>
+          <w:sz w:val="21"/>
+        </w:rPr>
+        <w:t>How to read this. There are two parts. Part A is the short wording that goes on the forms — a tick box and one line, and that is all the patient ever sees. Part B is the detail behind it, for the data-protection adviser to review and sign off once. The patient never reads Part B; the full terms they can click through to are the existing Privacy Policy.</w:t>
+      </w:r>
+    </w:p>
+    <w:tbl>
+      <w:tblPr>
+        <w:tblStyle w:val="TableGrid"/>
+        <w:tblW w:type="auto" w:w="0"/>
+        <w:tblLook w:firstColumn="1" w:firstRow="1" w:lastColumn="0" w:lastRow="0" w:noHBand="0" w:noVBand="1" w:val="04A0"/>
+      </w:tblPr>
+      <w:tblGrid>
+        <w:gridCol w:w="9792"/>
+      </w:tblGrid>
+      <w:tr>
+        <w:tc>
+          <w:tcPr>
+            <w:tcW w:type="dxa" w:w="9792"/>
+            <w:shd w:val="clear" w:fill="142A28"/>
+          </w:tcPr>
+          <w:p>
+            <w:pPr>
+              <w:spacing w:after="0"/>
+            </w:pPr>
+            <w:r>
+              <w:rPr>
+                <w:b/>
+                <w:color w:val="9FC4BD"/>
+                <w:sz w:val="16"/>
+              </w:rPr>
+              <w:t>PART A — FOR THE FORM BUILDER</w:t>
+            </w:r>
+          </w:p>
+          <w:p>
+            <w:pPr>
+              <w:spacing w:before="0"/>
+            </w:pPr>
+            <w:r>
+              <w:rPr>
+                <w:b/>
+                <w:color w:val="FFFFFF"/>
+                <w:sz w:val="28"/>
+              </w:rPr>
+              <w:t>The form copy: what the patient actually sees</w:t>
+            </w:r>
+          </w:p>
+        </w:tc>
+      </w:tr>
+    </w:tbl>
+    <w:p>
+      <w:pPr>
+        <w:spacing w:after="80" w:before="0"/>
+      </w:pPr>
+    </w:p>
+    <w:p>
+      <w:pPr>
+        <w:spacing w:after="80" w:before="0"/>
+      </w:pPr>
+      <w:r>
+        <w:rPr>
+          <w:b w:val="0"/>
+          <w:i/>
+          <w:color w:val="55605F"/>
+          <w:sz w:val="21"/>
+        </w:rPr>
+        <w:t>Short and simple. Each patient sees a tick box and one line, with a link to the Privacy Policy if they want the full detail. Required boxes are unticked by default; optional boxes are clearly optional.</w:t>
+      </w:r>
+    </w:p>
+    <w:p>
+      <w:pPr>
+        <w:spacing w:before="140" w:after="40"/>
+      </w:pPr>
+      <w:r>
+        <w:rPr>
+          <w:b/>
+          <w:color w:val="0B534E"/>
+          <w:sz w:val="22"/>
+        </w:rPr>
+        <w:t>On the enquiry form</w:t>
+      </w:r>
+    </w:p>
+    <w:tbl>
+      <w:tblPr>
+        <w:tblStyle w:val="TableGrid"/>
+        <w:tblW w:type="auto" w:w="0"/>
+        <w:tblLook w:firstColumn="1" w:firstRow="1" w:lastColumn="0" w:lastRow="0" w:noHBand="0" w:noVBand="1" w:val="04A0"/>
+      </w:tblPr>
+      <w:tblGrid>
+        <w:gridCol w:w="9792"/>
+      </w:tblGrid>
+      <w:tr>
+        <w:tc>
+          <w:tcPr>
+            <w:tcW w:type="dxa" w:w="9792"/>
+            <w:shd w:val="clear" w:fill="F4F6F5"/>
+          </w:tcPr>
+          <w:p>
+            <w:pPr>
+              <w:spacing w:after="20"/>
+            </w:pPr>
+            <w:r>
+              <w:rPr>
+                <w:b/>
+                <w:i w:val="0"/>
+                <w:sz w:val="20"/>
+              </w:rPr>
+              <w:t>Enquiry consent</w:t>
+            </w:r>
+          </w:p>
+          <w:p>
+            <w:pPr>
+              <w:spacing w:after="20"/>
+            </w:pPr>
+            <w:r>
+              <w:rPr>
+                <w:b/>
+                <w:i w:val="0"/>
+                <w:sz w:val="20"/>
+              </w:rPr>
+              <w:t>☐  I consent to The Schoeman Clinic using my details, including any health information I share, to respond to my enquiry and guide me through the next steps. (See our Privacy Policy.)   [REQUIRED]</w:t>
+            </w:r>
+          </w:p>
+          <w:p>
+            <w:pPr>
+              <w:spacing w:after="20"/>
+            </w:pPr>
+            <w:r>
+              <w:rPr>
+                <w:sz w:val="20"/>
+              </w:rPr>
+              <w:t>☐  Keep me updated with clinic news and health information by email.   [OPTIONAL]</w:t>
+            </w:r>
+          </w:p>
+          <w:p>
+            <w:pPr>
+              <w:spacing w:after="20"/>
+            </w:pPr>
+            <w:r>
+              <w:rPr>
+                <w:sz w:val="20"/>
+              </w:rPr>
+              <w:t>☐ Email    ☐ WhatsApp    ☐ SMS / phone   — how would you like us to contact you about your care?</w:t>
+            </w:r>
+          </w:p>
+          <w:p>
+            <w:pPr>
+              <w:spacing w:after="20"/>
+            </w:pPr>
+            <w:r>
+              <w:rPr>
+                <w:b w:val="0"/>
+                <w:i/>
+                <w:color w:val="55605F"/>
+                <w:sz w:val="20"/>
+              </w:rPr>
+              <w:t>WhatsApp is used for appointment reminders and service messages, not marketing. You can change your preferences or unsubscribe at any time.</w:t>
+            </w:r>
+          </w:p>
+        </w:tc>
+      </w:tr>
+    </w:tbl>
+    <w:p>
+      <w:pPr>
+        <w:spacing w:after="80" w:before="0"/>
+      </w:pPr>
+    </w:p>
+    <w:p>
+      <w:pPr>
+        <w:spacing w:before="140" w:after="40"/>
+      </w:pPr>
+      <w:r>
+        <w:rPr>
+          <w:b/>
+          <w:color w:val="0B534E"/>
+          <w:sz w:val="22"/>
+        </w:rPr>
+        <w:t>On the registration form</w:t>
+      </w:r>
+    </w:p>
+    <w:tbl>
+      <w:tblPr>
+        <w:tblStyle w:val="TableGrid"/>
+        <w:tblW w:type="auto" w:w="0"/>
+        <w:tblLook w:firstColumn="1" w:firstRow="1" w:lastColumn="0" w:lastRow="0" w:noHBand="0" w:noVBand="1" w:val="04A0"/>
+      </w:tblPr>
+      <w:tblGrid>
+        <w:gridCol w:w="9792"/>
+      </w:tblGrid>
+      <w:tr>
+        <w:tc>
+          <w:tcPr>
+            <w:tcW w:type="dxa" w:w="9792"/>
+            <w:shd w:val="clear" w:fill="F4F6F5"/>
+          </w:tcPr>
+          <w:p>
+            <w:pPr>
+              <w:spacing w:after="20"/>
+            </w:pPr>
+            <w:r>
+              <w:rPr>
+                <w:b/>
+                <w:i w:val="0"/>
+                <w:sz w:val="20"/>
+              </w:rPr>
+              <w:t>Registration consent</w:t>
+            </w:r>
+          </w:p>
+          <w:p>
+            <w:pPr>
+              <w:spacing w:after="20"/>
+            </w:pPr>
+            <w:r>
+              <w:rPr>
+                <w:b/>
+                <w:i w:val="0"/>
+                <w:sz w:val="20"/>
+              </w:rPr>
+              <w:t>☐  I confirm my details are accurate and I understand how The Schoeman Clinic will use my information to provide my care, as set out in the Patient Privacy Policy.   [REQUIRED]</w:t>
+            </w:r>
+          </w:p>
+          <w:p>
+            <w:pPr>
+              <w:spacing w:after="20"/>
+            </w:pPr>
+            <w:r>
+              <w:rPr>
+                <w:sz w:val="20"/>
+              </w:rPr>
+              <w:t>☐  Keep me updated with clinic news and updates by email.   [OPTIONAL]</w:t>
+            </w:r>
+          </w:p>
+          <w:p>
+            <w:pPr>
+              <w:spacing w:after="20"/>
+            </w:pPr>
+            <w:r>
+              <w:rPr>
+                <w:sz w:val="20"/>
+              </w:rPr>
+              <w:t>☐ Email    ☐ WhatsApp    ☐ SMS / phone   — how we contact you about your care</w:t>
+            </w:r>
+          </w:p>
+          <w:p>
+            <w:pPr>
+              <w:spacing w:after="20"/>
+            </w:pPr>
+            <w:r>
+              <w:rPr>
+                <w:b w:val="0"/>
+                <w:i/>
+                <w:color w:val="55605F"/>
+                <w:sz w:val="20"/>
+              </w:rPr>
+              <w:t>Carry the contact and email preference across from the enquiry rather than asking again, unless it was not captured cleanly.</w:t>
+            </w:r>
+          </w:p>
+        </w:tc>
+      </w:tr>
+    </w:tbl>
+    <w:p>
+      <w:pPr>
+        <w:spacing w:after="80" w:before="0"/>
+      </w:pPr>
+    </w:p>
+    <w:tbl>
+      <w:tblPr>
+        <w:tblStyle w:val="TableGrid"/>
+        <w:tblW w:type="auto" w:w="0"/>
+        <w:tblLook w:firstColumn="1" w:firstRow="1" w:lastColumn="0" w:lastRow="0" w:noHBand="0" w:noVBand="1" w:val="04A0"/>
+      </w:tblPr>
+      <w:tblGrid>
+        <w:gridCol w:w="9792"/>
+      </w:tblGrid>
+      <w:tr>
+        <w:tc>
+          <w:tcPr>
+            <w:tcW w:type="dxa" w:w="9792"/>
+            <w:shd w:val="clear" w:fill="142A28"/>
+          </w:tcPr>
+          <w:p>
+            <w:pPr>
+              <w:spacing w:after="0"/>
+            </w:pPr>
+            <w:r>
+              <w:rPr>
+                <w:b/>
+                <w:color w:val="9FC4BD"/>
+                <w:sz w:val="16"/>
+              </w:rPr>
+              <w:t>PART B — FOR THE DATA-PROTECTION ADVISER</w:t>
+            </w:r>
+          </w:p>
+          <w:p>
+            <w:pPr>
+              <w:spacing w:before="0"/>
+            </w:pPr>
+            <w:r>
+              <w:rPr>
+                <w:b/>
+                <w:color w:val="FFFFFF"/>
+                <w:sz w:val="28"/>
+              </w:rPr>
+              <w:t>The reference pack behind the wording</w:t>
+            </w:r>
+          </w:p>
+        </w:tc>
+      </w:tr>
+    </w:tbl>
+    <w:p>
+      <w:pPr>
+        <w:spacing w:after="80" w:before="0"/>
+      </w:pPr>
+    </w:p>
+    <w:p>
+      <w:pPr>
         <w:spacing w:after="20" w:before="0"/>
       </w:pPr>
       <w:r>
@@ -67,7 +388,7 @@
           <w:i w:val="0"/>
           <w:sz w:val="21"/>
         </w:rPr>
-        <w:t>This pack turns the clinic’s consent capture into something defensible under UK GDPR and PECR as communications move into GoHighLevel. It covers what the enquiry and registration forms should ask, how to capture email and WhatsApp preferences properly, the lawful basis for each activity, the updated list of the systems that touch patient data, and the specific edits the existing privacy policies need. It is written to be handed to your data-protection adviser for final sign-off before anything goes live.</w:t>
+        <w:t>This part turns the clinic’s consent capture into something defensible under UK GDPR and PECR as communications move into GoHighLevel. It sets out the lawful basis for each activity, why the enquiry and registration wording reads as it does, the systems that touch patient data, and the specific edits the existing privacy policies need. It is written to be handed to your data-protection adviser for final sign-off before anything goes live.</w:t>
       </w:r>
     </w:p>
     <w:p>

</xml_diff>

<commit_message>
Harden consent pack for external data-team review
Add retention schedule, patients' rights, international-transfer basis,
Article 28 + 72-hour breach note, DPIA flag, adults-only statement,
version/date line, expanded sign-off checklist and a review sign-off block.
Regenerated docx, HTML, and PDF so all three match.

Co-Authored-By: Claude Opus 4.8 <noreply@anthropic.com>
Claude-Session: https://claude.ai/code/session_01Qk44oiJ6G4KGcJdussGzUo
</commit_message>
<xml_diff>
--- a/outputs/schoeman-clinic/Schoeman-Clinic-Consent-DataProtection-Pack.docx
+++ b/outputs/schoeman-clinic/Schoeman-Clinic-Consent-DataProtection-Pack.docx
@@ -32,7 +32,7 @@
     </w:p>
     <w:p>
       <w:pPr>
-        <w:spacing w:after="120" w:before="0"/>
+        <w:spacing w:after="40" w:before="0"/>
       </w:pPr>
       <w:r>
         <w:rPr>
@@ -46,6 +46,20 @@
     </w:p>
     <w:p>
       <w:pPr>
+        <w:spacing w:after="120" w:before="0"/>
+      </w:pPr>
+      <w:r>
+        <w:rPr>
+          <w:b w:val="0"/>
+          <w:i w:val="0"/>
+          <w:color w:val="55605F"/>
+          <w:sz w:val="18"/>
+        </w:rPr>
+        <w:t>Version 1.0   ·   Draft for review   ·   30 July 2026   ·   Prepared by WILBA for The Schoeman Clinic</w:t>
+      </w:r>
+    </w:p>
+    <w:p>
+      <w:pPr>
         <w:spacing w:after="160" w:before="0"/>
       </w:pPr>
       <w:r>
@@ -54,7 +68,7 @@
           <w:i w:val="0"/>
           <w:sz w:val="21"/>
         </w:rPr>
-        <w:t>How to read this. There are two parts. Part A is the short wording that goes on the forms — a tick box and one line, and that is all the patient ever sees. Part B is the detail behind it, for the data-protection adviser to review and sign off once. The patient never reads Part B; the full terms they can click through to are the existing Privacy Policy.</w:t>
+        <w:t>How to read this. There are two parts. Part A is the short wording that goes on the forms: just a tick box and one line, and that is all the patient ever sees. Part B is the detail behind it, for the data-protection adviser to review and sign off once. The patient never reads Part B; the full terms they can click through to are the existing Privacy Policy.</w:t>
       </w:r>
     </w:p>
     <w:tbl>
@@ -193,7 +207,7 @@
               <w:rPr>
                 <w:sz w:val="20"/>
               </w:rPr>
-              <w:t>☐ Email    ☐ WhatsApp    ☐ SMS / phone   — how would you like us to contact you about your care?</w:t>
+              <w:t>☐ Email    ☐ WhatsApp    ☐ SMS / phone.   How would you like us to contact you about your care?</w:t>
             </w:r>
           </w:p>
           <w:p>
@@ -207,7 +221,7 @@
                 <w:color w:val="55605F"/>
                 <w:sz w:val="20"/>
               </w:rPr>
-              <w:t>WhatsApp is used for appointment reminders and service messages, not marketing. You can change your preferences or unsubscribe at any time.</w:t>
+              <w:t>WhatsApp is used for appointment reminders and service messages, not marketing. You can update your preferences or withdraw your consent at any time.</w:t>
             </w:r>
           </w:p>
         </w:tc>
@@ -291,7 +305,7 @@
               <w:rPr>
                 <w:sz w:val="20"/>
               </w:rPr>
-              <w:t>☐ Email    ☐ WhatsApp    ☐ SMS / phone   — how we contact you about your care</w:t>
+              <w:t>☐ Email    ☐ WhatsApp    ☐ SMS / phone.   How we contact you about your care.</w:t>
             </w:r>
           </w:p>
           <w:p>
@@ -388,7 +402,7 @@
           <w:i w:val="0"/>
           <w:sz w:val="21"/>
         </w:rPr>
-        <w:t>This part turns the clinic’s consent capture into something defensible under UK GDPR and PECR as communications move into GoHighLevel. It sets out the lawful basis for each activity, why the enquiry and registration wording reads as it does, the systems that touch patient data, and the specific edits the existing privacy policies need. It is written to be handed to your data-protection adviser for final sign-off before anything goes live.</w:t>
+        <w:t>This part turns the clinic’s consent capture into something defensible under UK GDPR and PECR as communications move into GoHighLevel. It sets out the lawful basis for each activity, how long information is kept, patients’ rights, the systems that touch patient data and how it moves internationally, and the specific edits the existing privacy policies need. It is written to be handed to your data-protection adviser for final sign-off before anything goes live.</w:t>
       </w:r>
     </w:p>
     <w:p>
@@ -446,6 +460,21 @@
         <w:rPr>
           <w:b/>
         </w:rPr>
+        <w:t xml:space="preserve">Patients: </w:t>
+      </w:r>
+      <w:r>
+        <w:t>adults only (18+). No children’s data is processed.</w:t>
+      </w:r>
+    </w:p>
+    <w:p>
+      <w:pPr>
+        <w:pStyle w:val="ListBullet"/>
+        <w:spacing w:after="40"/>
+      </w:pPr>
+      <w:r>
+        <w:rPr>
+          <w:b/>
+        </w:rPr>
         <w:t xml:space="preserve">Marketing: </w:t>
       </w:r>
       <w:r>
@@ -480,7 +509,7 @@
           <w:color w:val="142A28"/>
           <w:sz w:val="27"/>
         </w:rPr>
-        <w:t>1 · Enquiry-form consent block</w:t>
+        <w:t>1 · Why the enquiry wording reads as it does</w:t>
       </w:r>
     </w:p>
     <w:p>
@@ -494,20 +523,7 @@
           <w:color w:val="55605F"/>
           <w:sz w:val="21"/>
         </w:rPr>
-        <w:t>The enquiry form collects: name, surname, email, phone, sex at birth, reason for enquiry (drop-down), referral source. Because the reason can reveal health information, capture explicit consent to handle it, then keep marketing separate and optional.</w:t>
-      </w:r>
-    </w:p>
-    <w:p>
-      <w:pPr>
-        <w:spacing w:before="140" w:after="40"/>
-      </w:pPr>
-      <w:r>
-        <w:rPr>
-          <w:b/>
-          <w:color w:val="0B534E"/>
-          <w:sz w:val="22"/>
-        </w:rPr>
-        <w:t>a) Handling your enquiry (required to proceed)</w:t>
+        <w:t>The enquiry form collects: name, surname, email, phone, sex at birth, reason for enquiry (drop-down), referral source. Because the reason can reveal health information, we capture explicit consent to handle it, then keep marketing separate and optional.</w:t>
       </w:r>
     </w:p>
     <w:tbl>
@@ -535,7 +551,7 @@
                 <w:i w:val="0"/>
                 <w:sz w:val="20"/>
               </w:rPr>
-              <w:t>How we will use these details</w:t>
+              <w:t>The full version of the required consent</w:t>
             </w:r>
           </w:p>
           <w:p>
@@ -573,7 +589,7 @@
                 <w:color w:val="55605F"/>
                 <w:sz w:val="20"/>
               </w:rPr>
-              <w:t>(Unticked by default. See our Privacy Policy for how we look after your information.)</w:t>
+              <w:t>Unticked by default. On the form this is shortened to the single line in Part A; this longer version is the reasoning for the adviser.</w:t>
             </w:r>
           </w:p>
         </w:tc>
@@ -586,15 +602,32 @@
     </w:p>
     <w:p>
       <w:pPr>
-        <w:spacing w:before="140" w:after="40"/>
+        <w:spacing w:before="260" w:after="60"/>
+        <w:pBdr>
+          <w:bottom w:val="single" w:sz="6" w:space="2" w:color="C9D2DE"/>
+        </w:pBdr>
       </w:pPr>
       <w:r>
         <w:rPr>
           <w:b/>
-          <w:color w:val="0B534E"/>
-          <w:sz w:val="22"/>
+          <w:color w:val="142A28"/>
+          <w:sz w:val="27"/>
         </w:rPr>
-        <w:t>b) Staying in touch (optional, unticked)</w:t>
+        <w:t>2 · Why the registration wording changes</w:t>
+      </w:r>
+    </w:p>
+    <w:p>
+      <w:pPr>
+        <w:spacing w:after="60" w:before="0"/>
+      </w:pPr>
+      <w:r>
+        <w:rPr>
+          <w:b w:val="0"/>
+          <w:i/>
+          <w:color w:val="55605F"/>
+          <w:sz w:val="21"/>
+        </w:rPr>
+        <w:t>The registration form collects full medical history and identity. For a patient receiving care the basis shifts from consent to contract plus provision of health care, so the wording changes accordingly.</w:t>
       </w:r>
     </w:p>
     <w:tbl>
@@ -622,122 +655,7 @@
                 <w:i w:val="0"/>
                 <w:sz w:val="20"/>
               </w:rPr>
-              <w:t>How would you like us to contact you about your care?</w:t>
-            </w:r>
-          </w:p>
-          <w:p>
-            <w:pPr>
-              <w:spacing w:after="20"/>
-            </w:pPr>
-            <w:r>
-              <w:rPr>
-                <w:sz w:val="20"/>
-              </w:rPr>
-              <w:t>☐ Email     ☐ WhatsApp     ☐ SMS / phone</w:t>
-            </w:r>
-          </w:p>
-          <w:p>
-            <w:pPr>
-              <w:spacing w:after="20"/>
-            </w:pPr>
-            <w:r>
-              <w:rPr>
-                <w:b/>
-                <w:i w:val="0"/>
-                <w:sz w:val="20"/>
-              </w:rPr>
-              <w:t>Clinic updates (optional)</w:t>
-            </w:r>
-          </w:p>
-          <w:p>
-            <w:pPr>
-              <w:spacing w:after="20"/>
-            </w:pPr>
-            <w:r>
-              <w:rPr>
-                <w:sz w:val="20"/>
-              </w:rPr>
-              <w:t>☐  I would like to receive clinic news, health information and occasional updates by email.</w:t>
-            </w:r>
-          </w:p>
-          <w:p>
-            <w:pPr>
-              <w:spacing w:after="20"/>
-            </w:pPr>
-            <w:r>
-              <w:rPr>
-                <w:b w:val="0"/>
-                <w:i/>
-                <w:color w:val="55605F"/>
-                <w:sz w:val="20"/>
-              </w:rPr>
-              <w:t>You can change your preferences or unsubscribe at any time. WhatsApp is used for appointment reminders and service messages, not marketing.</w:t>
-            </w:r>
-          </w:p>
-        </w:tc>
-      </w:tr>
-    </w:tbl>
-    <w:p>
-      <w:pPr>
-        <w:spacing w:after="80" w:before="0"/>
-      </w:pPr>
-    </w:p>
-    <w:p>
-      <w:pPr>
-        <w:spacing w:before="260" w:after="60"/>
-        <w:pBdr>
-          <w:bottom w:val="single" w:sz="6" w:space="2" w:color="C9D2DE"/>
-        </w:pBdr>
-      </w:pPr>
-      <w:r>
-        <w:rPr>
-          <w:b/>
-          <w:color w:val="142A28"/>
-          <w:sz w:val="27"/>
-        </w:rPr>
-        <w:t>2 · Registration-form consent block</w:t>
-      </w:r>
-    </w:p>
-    <w:p>
-      <w:pPr>
-        <w:spacing w:after="60" w:before="0"/>
-      </w:pPr>
-      <w:r>
-        <w:rPr>
-          <w:b w:val="0"/>
-          <w:i/>
-          <w:color w:val="55605F"/>
-          <w:sz w:val="21"/>
-        </w:rPr>
-        <w:t>The registration form collects full medical history and identity. For a patient receiving care the basis shifts from consent to contract plus provision of health care, so the wording changes accordingly. Carry the marketing preference across from the enquiry rather than re-asking, unless it was not captured cleanly.</w:t>
-      </w:r>
-    </w:p>
-    <w:tbl>
-      <w:tblPr>
-        <w:tblStyle w:val="TableGrid"/>
-        <w:tblW w:type="auto" w:w="0"/>
-        <w:tblLook w:firstColumn="1" w:firstRow="1" w:lastColumn="0" w:lastRow="0" w:noHBand="0" w:noVBand="1" w:val="04A0"/>
-      </w:tblPr>
-      <w:tblGrid>
-        <w:gridCol w:w="9792"/>
-      </w:tblGrid>
-      <w:tr>
-        <w:tc>
-          <w:tcPr>
-            <w:tcW w:type="dxa" w:w="9792"/>
-            <w:shd w:val="clear" w:fill="F4F6F5"/>
-          </w:tcPr>
-          <w:p>
-            <w:pPr>
-              <w:spacing w:after="20"/>
-            </w:pPr>
-            <w:r>
-              <w:rPr>
-                <w:b/>
-                <w:i w:val="0"/>
-                <w:sz w:val="20"/>
-              </w:rPr>
-              <w:t>Your information and your care</w:t>
+              <w:t>The basis for a patient in care</w:t>
             </w:r>
           </w:p>
           <w:p>
@@ -749,54 +667,6 @@
                 <w:sz w:val="20"/>
               </w:rPr>
               <w:t>We use the information on this form to provide your healthcare, keep your medical records, arrange tests and prescriptions, and manage your appointments and billing. We handle your health information under UK GDPR Article 9(2)(h) (provision of health care) and the Data Protection Act 2018.</w:t>
-            </w:r>
-          </w:p>
-          <w:p>
-            <w:pPr>
-              <w:spacing w:after="20"/>
-            </w:pPr>
-            <w:r>
-              <w:rPr>
-                <w:b/>
-                <w:i w:val="0"/>
-                <w:sz w:val="20"/>
-              </w:rPr>
-              <w:t>☐  I confirm the information I have provided is accurate, and I understand how The Schoeman Clinic will use it, as described in the Patient Privacy Policy.</w:t>
-            </w:r>
-          </w:p>
-          <w:p>
-            <w:pPr>
-              <w:spacing w:after="20"/>
-            </w:pPr>
-            <w:r>
-              <w:rPr>
-                <w:b/>
-                <w:i w:val="0"/>
-                <w:sz w:val="20"/>
-              </w:rPr>
-              <w:t>Contact &amp; updates</w:t>
-            </w:r>
-          </w:p>
-          <w:p>
-            <w:pPr>
-              <w:spacing w:after="20"/>
-            </w:pPr>
-            <w:r>
-              <w:rPr>
-                <w:sz w:val="20"/>
-              </w:rPr>
-              <w:t>☐ Email     ☐ WhatsApp     ☐ SMS / phone   (how we contact you about your care)</w:t>
-            </w:r>
-          </w:p>
-          <w:p>
-            <w:pPr>
-              <w:spacing w:after="20"/>
-            </w:pPr>
-            <w:r>
-              <w:rPr>
-                <w:sz w:val="20"/>
-              </w:rPr>
-              <w:t>☐  I would like to receive clinic news and updates by email (optional).</w:t>
             </w:r>
           </w:p>
           <w:p>
@@ -880,7 +750,7 @@
         <w:t xml:space="preserve">Email: </w:t>
       </w:r>
       <w:r>
-        <w:t>email marketing needs consent or a valid PECR soft opt-in; every send needs a working unsubscribe and a genuine sender identity. Newsletters moving from MailChimp to GoHighLevel must carry only contacts with a valid basis — do not assume the whole patient list is opted in.</w:t>
+        <w:t>email marketing needs consent or a valid PECR soft opt-in; every send needs a working unsubscribe and a genuine sender identity. Newsletters moving from MailChimp to GoHighLevel must carry only contacts with a valid basis; do not assume the whole patient list is opted in.</w:t>
       </w:r>
     </w:p>
     <w:p>
@@ -911,7 +781,7 @@
         <w:t xml:space="preserve">Record + fix: </w:t>
       </w:r>
       <w:r>
-        <w:t>record what each person consented to, when, how, and which version of the notice they saw. Important: Semble currently auto-marks SMS/email consent on registration — that is not valid consent and should be replaced with a genuine opt-in captured as above.</w:t>
+        <w:t>record what each person consented to, when, how, and which version of the notice they saw. Important: Semble currently auto-marks SMS/email consent on registration; that is not valid consent and should be replaced with a genuine opt-in captured as above.</w:t>
       </w:r>
     </w:p>
     <w:p>
@@ -1020,7 +890,7 @@
               <w:rPr>
                 <w:sz w:val="18"/>
               </w:rPr>
-              <w:t>Consent, or legitimate interests</w:t>
+              <w:t>Consent — Art 6(1)(a)</w:t>
             </w:r>
           </w:p>
         </w:tc>
@@ -1310,7 +1180,442 @@
           <w:color w:val="142A28"/>
           <w:sz w:val="27"/>
         </w:rPr>
-        <w:t>5 · Sub-processor register (updated)</w:t>
+        <w:t>5 · Retention — how long information is kept</w:t>
+      </w:r>
+    </w:p>
+    <w:tbl>
+      <w:tblPr>
+        <w:tblStyle w:val="TableGrid"/>
+        <w:tblW w:type="auto" w:w="0"/>
+        <w:tblLook w:firstColumn="1" w:firstRow="1" w:lastColumn="0" w:lastRow="0" w:noHBand="0" w:noVBand="1" w:val="04A0"/>
+      </w:tblPr>
+      <w:tblGrid>
+        <w:gridCol w:w="3264"/>
+        <w:gridCol w:w="3264"/>
+        <w:gridCol w:w="3264"/>
+      </w:tblGrid>
+      <w:tr>
+        <w:tc>
+          <w:tcPr>
+            <w:tcW w:type="dxa" w:w="3312"/>
+            <w:shd w:val="clear" w:fill="142A28"/>
+          </w:tcPr>
+          <w:p>
+            <w:r>
+              <w:rPr>
+                <w:b/>
+                <w:color w:val="FFFFFF"/>
+                <w:sz w:val="18"/>
+              </w:rPr>
+              <w:t>Information type</w:t>
+            </w:r>
+          </w:p>
+        </w:tc>
+        <w:tc>
+          <w:tcPr>
+            <w:tcW w:type="dxa" w:w="3024"/>
+            <w:shd w:val="clear" w:fill="142A28"/>
+          </w:tcPr>
+          <w:p>
+            <w:r>
+              <w:rPr>
+                <w:b/>
+                <w:color w:val="FFFFFF"/>
+                <w:sz w:val="18"/>
+              </w:rPr>
+              <w:t>Suggested retention</w:t>
+            </w:r>
+          </w:p>
+        </w:tc>
+        <w:tc>
+          <w:tcPr>
+            <w:tcW w:type="dxa" w:w="3024"/>
+            <w:shd w:val="clear" w:fill="142A28"/>
+          </w:tcPr>
+          <w:p>
+            <w:r>
+              <w:rPr>
+                <w:b/>
+                <w:color w:val="FFFFFF"/>
+                <w:sz w:val="18"/>
+              </w:rPr>
+              <w:t>Note</w:t>
+            </w:r>
+          </w:p>
+        </w:tc>
+      </w:tr>
+      <w:tr>
+        <w:tc>
+          <w:tcPr>
+            <w:tcW w:type="dxa" w:w="3312"/>
+          </w:tcPr>
+          <w:p>
+            <w:pPr>
+              <w:spacing w:after="20"/>
+            </w:pPr>
+            <w:r>
+              <w:rPr>
+                <w:sz w:val="18"/>
+              </w:rPr>
+              <w:t>Patient clinical records (held in Semble)</w:t>
+            </w:r>
+          </w:p>
+        </w:tc>
+        <w:tc>
+          <w:tcPr>
+            <w:tcW w:type="dxa" w:w="3024"/>
+          </w:tcPr>
+          <w:p>
+            <w:pPr>
+              <w:spacing w:after="20"/>
+            </w:pPr>
+            <w:r>
+              <w:rPr>
+                <w:sz w:val="18"/>
+              </w:rPr>
+              <w:t>~8 years after last treatment (adults)</w:t>
+            </w:r>
+          </w:p>
+        </w:tc>
+        <w:tc>
+          <w:tcPr>
+            <w:tcW w:type="dxa" w:w="3024"/>
+          </w:tcPr>
+          <w:p>
+            <w:pPr>
+              <w:spacing w:after="20"/>
+            </w:pPr>
+            <w:r>
+              <w:rPr>
+                <w:sz w:val="18"/>
+              </w:rPr>
+              <w:t>Align to the clinic’s clinical records policy; confirm.</w:t>
+            </w:r>
+          </w:p>
+        </w:tc>
+      </w:tr>
+      <w:tr>
+        <w:tc>
+          <w:tcPr>
+            <w:tcW w:type="dxa" w:w="3312"/>
+          </w:tcPr>
+          <w:p>
+            <w:pPr>
+              <w:spacing w:after="20"/>
+            </w:pPr>
+            <w:r>
+              <w:rPr>
+                <w:sz w:val="18"/>
+              </w:rPr>
+              <w:t>Enquiries that do not become patients</w:t>
+            </w:r>
+          </w:p>
+        </w:tc>
+        <w:tc>
+          <w:tcPr>
+            <w:tcW w:type="dxa" w:w="3024"/>
+          </w:tcPr>
+          <w:p>
+            <w:pPr>
+              <w:spacing w:after="20"/>
+            </w:pPr>
+            <w:r>
+              <w:rPr>
+                <w:sz w:val="18"/>
+              </w:rPr>
+              <w:t>6–12 months, then delete or anonymise</w:t>
+            </w:r>
+          </w:p>
+        </w:tc>
+        <w:tc>
+          <w:tcPr>
+            <w:tcW w:type="dxa" w:w="3024"/>
+          </w:tcPr>
+          <w:p>
+            <w:pPr>
+              <w:spacing w:after="20"/>
+            </w:pPr>
+            <w:r>
+              <w:rPr>
+                <w:sz w:val="18"/>
+              </w:rPr>
+              <w:t>Unless they have opted into marketing.</w:t>
+            </w:r>
+          </w:p>
+        </w:tc>
+      </w:tr>
+      <w:tr>
+        <w:tc>
+          <w:tcPr>
+            <w:tcW w:type="dxa" w:w="3312"/>
+          </w:tcPr>
+          <w:p>
+            <w:pPr>
+              <w:spacing w:after="20"/>
+            </w:pPr>
+            <w:r>
+              <w:rPr>
+                <w:sz w:val="18"/>
+              </w:rPr>
+              <w:t>Operational / CRM records (GoHighLevel)</w:t>
+            </w:r>
+          </w:p>
+        </w:tc>
+        <w:tc>
+          <w:tcPr>
+            <w:tcW w:type="dxa" w:w="3024"/>
+          </w:tcPr>
+          <w:p>
+            <w:pPr>
+              <w:spacing w:after="20"/>
+            </w:pPr>
+            <w:r>
+              <w:rPr>
+                <w:sz w:val="18"/>
+              </w:rPr>
+              <w:t>Match the record they relate to</w:t>
+            </w:r>
+          </w:p>
+        </w:tc>
+        <w:tc>
+          <w:tcPr>
+            <w:tcW w:type="dxa" w:w="3024"/>
+          </w:tcPr>
+          <w:p>
+            <w:pPr>
+              <w:spacing w:after="20"/>
+            </w:pPr>
+            <w:r>
+              <w:rPr>
+                <w:sz w:val="18"/>
+              </w:rPr>
+              <w:t>Review annually; do not keep messages indefinitely.</w:t>
+            </w:r>
+          </w:p>
+        </w:tc>
+      </w:tr>
+      <w:tr>
+        <w:tc>
+          <w:tcPr>
+            <w:tcW w:type="dxa" w:w="3312"/>
+          </w:tcPr>
+          <w:p>
+            <w:pPr>
+              <w:spacing w:after="20"/>
+            </w:pPr>
+            <w:r>
+              <w:rPr>
+                <w:sz w:val="18"/>
+              </w:rPr>
+              <w:t>Marketing contacts &amp; consent records</w:t>
+            </w:r>
+          </w:p>
+        </w:tc>
+        <w:tc>
+          <w:tcPr>
+            <w:tcW w:type="dxa" w:w="3024"/>
+          </w:tcPr>
+          <w:p>
+            <w:pPr>
+              <w:spacing w:after="20"/>
+            </w:pPr>
+            <w:r>
+              <w:rPr>
+                <w:sz w:val="18"/>
+              </w:rPr>
+              <w:t>Until withdrawn; refresh if inactive ~24 months</w:t>
+            </w:r>
+          </w:p>
+        </w:tc>
+        <w:tc>
+          <w:tcPr>
+            <w:tcW w:type="dxa" w:w="3024"/>
+          </w:tcPr>
+          <w:p>
+            <w:pPr>
+              <w:spacing w:after="20"/>
+            </w:pPr>
+            <w:r>
+              <w:rPr>
+                <w:sz w:val="18"/>
+              </w:rPr>
+              <w:t>Keep the consent audit trail even after removal.</w:t>
+            </w:r>
+          </w:p>
+        </w:tc>
+      </w:tr>
+      <w:tr>
+        <w:tc>
+          <w:tcPr>
+            <w:tcW w:type="dxa" w:w="3312"/>
+          </w:tcPr>
+          <w:p>
+            <w:pPr>
+              <w:spacing w:after="20"/>
+            </w:pPr>
+            <w:r>
+              <w:rPr>
+                <w:sz w:val="18"/>
+              </w:rPr>
+              <w:t>Billing &amp; financial records</w:t>
+            </w:r>
+          </w:p>
+        </w:tc>
+        <w:tc>
+          <w:tcPr>
+            <w:tcW w:type="dxa" w:w="3024"/>
+          </w:tcPr>
+          <w:p>
+            <w:pPr>
+              <w:spacing w:after="20"/>
+            </w:pPr>
+            <w:r>
+              <w:rPr>
+                <w:sz w:val="18"/>
+              </w:rPr>
+              <w:t>~6 years</w:t>
+            </w:r>
+          </w:p>
+        </w:tc>
+        <w:tc>
+          <w:tcPr>
+            <w:tcW w:type="dxa" w:w="3024"/>
+          </w:tcPr>
+          <w:p>
+            <w:pPr>
+              <w:spacing w:after="20"/>
+            </w:pPr>
+            <w:r>
+              <w:rPr>
+                <w:sz w:val="18"/>
+              </w:rPr>
+              <w:t>HMRC / accounting requirement.</w:t>
+            </w:r>
+          </w:p>
+        </w:tc>
+      </w:tr>
+    </w:tbl>
+    <w:p>
+      <w:pPr>
+        <w:spacing w:after="60" w:before="0"/>
+      </w:pPr>
+    </w:p>
+    <w:p>
+      <w:pPr>
+        <w:spacing w:after="120" w:before="0"/>
+      </w:pPr>
+      <w:r>
+        <w:rPr>
+          <w:b w:val="0"/>
+          <w:i/>
+          <w:color w:val="55605F"/>
+          <w:sz w:val="17"/>
+        </w:rPr>
+        <w:t>Periods are the clinic’s decision; these are common private-healthcare benchmarks for the adviser to confirm and document.</w:t>
+      </w:r>
+    </w:p>
+    <w:p>
+      <w:pPr>
+        <w:spacing w:before="260" w:after="60"/>
+        <w:pBdr>
+          <w:bottom w:val="single" w:sz="6" w:space="2" w:color="C9D2DE"/>
+        </w:pBdr>
+      </w:pPr>
+      <w:r>
+        <w:rPr>
+          <w:b/>
+          <w:color w:val="142A28"/>
+          <w:sz w:val="27"/>
+        </w:rPr>
+        <w:t>6 · Patients’ rights over their information</w:t>
+      </w:r>
+    </w:p>
+    <w:p>
+      <w:pPr>
+        <w:spacing w:after="40" w:before="0"/>
+      </w:pPr>
+      <w:r>
+        <w:rPr>
+          <w:b w:val="0"/>
+          <w:i w:val="0"/>
+          <w:sz w:val="21"/>
+        </w:rPr>
+        <w:t>Patients can exercise the following rights, and the clinic responds within one calendar month (UK GDPR):</w:t>
+      </w:r>
+    </w:p>
+    <w:p>
+      <w:pPr>
+        <w:pStyle w:val="ListBullet"/>
+        <w:spacing w:after="40"/>
+      </w:pPr>
+      <w:r>
+        <w:rPr>
+          <w:b/>
+        </w:rPr>
+        <w:t xml:space="preserve">Access: </w:t>
+      </w:r>
+      <w:r>
+        <w:t>a copy of their information (subject access request), correct it, and ask for erasure.</w:t>
+      </w:r>
+    </w:p>
+    <w:p>
+      <w:pPr>
+        <w:pStyle w:val="ListBullet"/>
+        <w:spacing w:after="40"/>
+      </w:pPr>
+      <w:r>
+        <w:rPr>
+          <w:b/>
+        </w:rPr>
+        <w:t xml:space="preserve">Restrict: </w:t>
+      </w:r>
+      <w:r>
+        <w:t>or object to certain processing, and request portability of data they provided.</w:t>
+      </w:r>
+    </w:p>
+    <w:p>
+      <w:pPr>
+        <w:pStyle w:val="ListBullet"/>
+        <w:spacing w:after="40"/>
+      </w:pPr>
+      <w:r>
+        <w:rPr>
+          <w:b/>
+        </w:rPr>
+        <w:t xml:space="preserve">Withdraw consent: </w:t>
+      </w:r>
+      <w:r>
+        <w:t>at any time, as easily as it was given. Withdrawing marketing consent never affects a patient’s care.</w:t>
+      </w:r>
+    </w:p>
+    <w:p>
+      <w:pPr>
+        <w:spacing w:after="120" w:before="0"/>
+      </w:pPr>
+      <w:r>
+        <w:rPr>
+          <w:b w:val="0"/>
+          <w:i/>
+          <w:color w:val="55605F"/>
+          <w:sz w:val="17"/>
+        </w:rPr>
+        <w:t>Erasure is limited where records must be kept for clinical or legal retention. Name a clear route (a contact and email) for these requests in the privacy notice.</w:t>
+      </w:r>
+    </w:p>
+    <w:p>
+      <w:pPr>
+        <w:spacing w:before="260" w:after="60"/>
+        <w:pBdr>
+          <w:bottom w:val="single" w:sz="6" w:space="2" w:color="C9D2DE"/>
+        </w:pBdr>
+      </w:pPr>
+      <w:r>
+        <w:rPr>
+          <w:b/>
+          <w:color w:val="142A28"/>
+          <w:sz w:val="27"/>
+        </w:rPr>
+        <w:t>7 · Sub-processor register (updated)</w:t>
       </w:r>
     </w:p>
     <w:tbl>
@@ -1927,6 +2232,19 @@
     </w:p>
     <w:p>
       <w:pPr>
+        <w:spacing w:after="120"/>
+      </w:pPr>
+      <w:r>
+        <w:rPr>
+          <w:i/>
+          <w:color w:val="8A5A0C"/>
+          <w:sz w:val="18"/>
+        </w:rPr>
+        <w:t>Each processor needs an Article 28 data processing agreement in place, binding them to act only on the clinic’s instructions and to notify the clinic of any breach without undue delay. A reportable personal-data breach must reach the ICO within 72 hours.</w:t>
+      </w:r>
+    </w:p>
+    <w:p>
+      <w:pPr>
         <w:spacing w:before="260" w:after="60"/>
         <w:pBdr>
           <w:bottom w:val="single" w:sz="6" w:space="2" w:color="C9D2DE"/>
@@ -1938,7 +2256,36 @@
           <w:color w:val="142A28"/>
           <w:sz w:val="27"/>
         </w:rPr>
-        <w:t>6 · Privacy-notice updates needed</w:t>
+        <w:t>8 · International transfers</w:t>
+      </w:r>
+    </w:p>
+    <w:p>
+      <w:pPr>
+        <w:spacing w:after="80" w:before="0"/>
+      </w:pPr>
+      <w:r>
+        <w:rPr>
+          <w:b w:val="0"/>
+          <w:i w:val="0"/>
+          <w:sz w:val="21"/>
+        </w:rPr>
+        <w:t>Some processors (GoHighLevel, certain pharmacies, and analytics) are in the US. Those transfers rely on the UK International Data Transfer Agreement (IDTA), or the UK Addendum to the EU Standard Contractual Clauses, within each processor’s DPA, supported by a Transfer Risk Assessment. GoHighLevel is on its HIPAA tier. Confirm the signed IDTA and DPA with GoHighLevel are in place before go-live.</w:t>
+      </w:r>
+    </w:p>
+    <w:p>
+      <w:pPr>
+        <w:spacing w:before="260" w:after="60"/>
+        <w:pBdr>
+          <w:bottom w:val="single" w:sz="6" w:space="2" w:color="C9D2DE"/>
+        </w:pBdr>
+      </w:pPr>
+      <w:r>
+        <w:rPr>
+          <w:b/>
+          <w:color w:val="142A28"/>
+          <w:sz w:val="27"/>
+        </w:rPr>
+        <w:t>9 · Privacy-notice updates needed</w:t>
       </w:r>
     </w:p>
     <w:p>
@@ -2042,10 +2389,10 @@
         <w:rPr>
           <w:b/>
         </w:rPr>
-        <w:t xml:space="preserve">Contact: </w:t>
+        <w:t xml:space="preserve">Retention &amp; rights: </w:t>
       </w:r>
       <w:r>
-        <w:t>name a data-protection contact and the subject-access-request route.</w:t>
+        <w:t>state the retention periods and the patient rights above, with a named data-protection contact and the subject-access-request route.</w:t>
       </w:r>
     </w:p>
     <w:p>
@@ -2061,7 +2408,36 @@
           <w:color w:val="142A28"/>
           <w:sz w:val="27"/>
         </w:rPr>
-        <w:t>7 · Before this goes live — data-person checklist</w:t>
+        <w:t>10 · Data protection by design — DPIA &amp; accountability</w:t>
+      </w:r>
+    </w:p>
+    <w:p>
+      <w:pPr>
+        <w:spacing w:after="80" w:before="0"/>
+      </w:pPr>
+      <w:r>
+        <w:rPr>
+          <w:b w:val="0"/>
+          <w:i w:val="0"/>
+          <w:sz w:val="21"/>
+        </w:rPr>
+        <w:t>Because this involves special-category (health) data at scale, a new operational CRM (GoHighLevel), and international transfer, a Data Protection Impact Assessment (DPIA) is expected under UK GDPR Article 35. We recommend completing a short DPIA for the GoHighLevel rollout before launch; your data adviser should own and sign it. WILBA can provide a pre-filled DPIA outline to speed this up.</w:t>
+      </w:r>
+    </w:p>
+    <w:p>
+      <w:pPr>
+        <w:spacing w:before="260" w:after="60"/>
+        <w:pBdr>
+          <w:bottom w:val="single" w:sz="6" w:space="2" w:color="C9D2DE"/>
+        </w:pBdr>
+      </w:pPr>
+      <w:r>
+        <w:rPr>
+          <w:b/>
+          <w:color w:val="142A28"/>
+          <w:sz w:val="27"/>
+        </w:rPr>
+        <w:t>11 · Before this goes live — data-person checklist</w:t>
       </w:r>
     </w:p>
     <w:p>
@@ -2112,6 +2488,57 @@
         <w:rPr>
           <w:sz w:val="20"/>
         </w:rPr>
+        <w:t>Confirm the data controller’s legal entity name and ICO registration</w:t>
+      </w:r>
+    </w:p>
+    <w:p>
+      <w:pPr>
+        <w:spacing w:after="40"/>
+      </w:pPr>
+      <w:r>
+        <w:rPr>
+          <w:sz w:val="22"/>
+        </w:rPr>
+        <w:t xml:space="preserve">☐  </w:t>
+      </w:r>
+      <w:r>
+        <w:rPr>
+          <w:sz w:val="20"/>
+        </w:rPr>
+        <w:t>Name a data-protection contact (and DPO if applicable) and the subject-access-request route</w:t>
+      </w:r>
+    </w:p>
+    <w:p>
+      <w:pPr>
+        <w:spacing w:after="40"/>
+      </w:pPr>
+      <w:r>
+        <w:rPr>
+          <w:sz w:val="22"/>
+        </w:rPr>
+        <w:t xml:space="preserve">☐  </w:t>
+      </w:r>
+      <w:r>
+        <w:rPr>
+          <w:sz w:val="20"/>
+        </w:rPr>
+        <w:t>Set and document the retention periods; configure deletion of non-converting enquiry data</w:t>
+      </w:r>
+    </w:p>
+    <w:p>
+      <w:pPr>
+        <w:spacing w:after="40"/>
+      </w:pPr>
+      <w:r>
+        <w:rPr>
+          <w:sz w:val="22"/>
+        </w:rPr>
+        <w:t xml:space="preserve">☐  </w:t>
+      </w:r>
+      <w:r>
+        <w:rPr>
+          <w:sz w:val="20"/>
+        </w:rPr>
         <w:t>Confirm the newsletter list only contains contacts with a valid basis before the MailChimp → GHL migration</w:t>
       </w:r>
     </w:p>
@@ -2146,7 +2573,24 @@
         <w:rPr>
           <w:sz w:val="20"/>
         </w:rPr>
-        <w:t>Sign off the updated sub-processor register and the UK IDTA for GoHighLevel</w:t>
+        <w:t>Put a signed UK IDTA and Article 28 DPA in place with GoHighLevel and other US processors</w:t>
+      </w:r>
+    </w:p>
+    <w:p>
+      <w:pPr>
+        <w:spacing w:after="40"/>
+      </w:pPr>
+      <w:r>
+        <w:rPr>
+          <w:sz w:val="22"/>
+        </w:rPr>
+        <w:t xml:space="preserve">☐  </w:t>
+      </w:r>
+      <w:r>
+        <w:rPr>
+          <w:sz w:val="20"/>
+        </w:rPr>
+        <w:t>Complete a DPIA for the GoHighLevel rollout</w:t>
       </w:r>
     </w:p>
     <w:p>
@@ -2202,7 +2646,186 @@
     </w:p>
     <w:p>
       <w:pPr>
-        <w:spacing w:after="120" w:before="160"/>
+        <w:spacing w:before="260" w:after="60"/>
+        <w:pBdr>
+          <w:bottom w:val="single" w:sz="6" w:space="2" w:color="C9D2DE"/>
+        </w:pBdr>
+      </w:pPr>
+      <w:r>
+        <w:rPr>
+          <w:b/>
+          <w:color w:val="142A28"/>
+          <w:sz w:val="27"/>
+        </w:rPr>
+        <w:t>12 · Review &amp; sign-off</w:t>
+      </w:r>
+    </w:p>
+    <w:p>
+      <w:pPr>
+        <w:spacing w:after="60" w:before="0"/>
+      </w:pPr>
+      <w:r>
+        <w:rPr>
+          <w:b w:val="0"/>
+          <w:i w:val="0"/>
+          <w:sz w:val="21"/>
+        </w:rPr>
+        <w:t>For the reviewing data team: please confirm the items in section 11, note any changes, and complete the sign-off below. WILBA will action any wording or build changes you flag.</w:t>
+      </w:r>
+    </w:p>
+    <w:tbl>
+      <w:tblPr>
+        <w:tblStyle w:val="TableGrid"/>
+        <w:tblW w:type="auto" w:w="0"/>
+        <w:tblLook w:firstColumn="1" w:firstRow="1" w:lastColumn="0" w:lastRow="0" w:noHBand="0" w:noVBand="1" w:val="04A0"/>
+      </w:tblPr>
+      <w:tblGrid>
+        <w:gridCol w:w="2448"/>
+        <w:gridCol w:w="2448"/>
+        <w:gridCol w:w="2448"/>
+        <w:gridCol w:w="2448"/>
+      </w:tblGrid>
+      <w:tr>
+        <w:tc>
+          <w:tcPr>
+            <w:tcW w:type="dxa" w:w="2304"/>
+            <w:shd w:val="clear" w:fill="142A28"/>
+          </w:tcPr>
+          <w:p>
+            <w:r>
+              <w:rPr>
+                <w:b/>
+                <w:color w:val="FFFFFF"/>
+                <w:sz w:val="18"/>
+              </w:rPr>
+              <w:t>Reviewed by</w:t>
+            </w:r>
+          </w:p>
+        </w:tc>
+        <w:tc>
+          <w:tcPr>
+            <w:tcW w:type="dxa" w:w="2016"/>
+            <w:shd w:val="clear" w:fill="142A28"/>
+          </w:tcPr>
+          <w:p>
+            <w:r>
+              <w:rPr>
+                <w:b/>
+                <w:color w:val="FFFFFF"/>
+                <w:sz w:val="18"/>
+              </w:rPr>
+              <w:t>Role</w:t>
+            </w:r>
+          </w:p>
+        </w:tc>
+        <w:tc>
+          <w:tcPr>
+            <w:tcW w:type="dxa" w:w="3888"/>
+            <w:shd w:val="clear" w:fill="142A28"/>
+          </w:tcPr>
+          <w:p>
+            <w:r>
+              <w:rPr>
+                <w:b/>
+                <w:color w:val="FFFFFF"/>
+                <w:sz w:val="18"/>
+              </w:rPr>
+              <w:t>Confirmed / changes requested</w:t>
+            </w:r>
+          </w:p>
+        </w:tc>
+        <w:tc>
+          <w:tcPr>
+            <w:tcW w:type="dxa" w:w="1584"/>
+            <w:shd w:val="clear" w:fill="142A28"/>
+          </w:tcPr>
+          <w:p>
+            <w:r>
+              <w:rPr>
+                <w:b/>
+                <w:color w:val="FFFFFF"/>
+                <w:sz w:val="18"/>
+              </w:rPr>
+              <w:t>Date</w:t>
+            </w:r>
+          </w:p>
+        </w:tc>
+      </w:tr>
+      <w:tr>
+        <w:tc>
+          <w:tcPr>
+            <w:tcW w:type="dxa" w:w="2304"/>
+          </w:tcPr>
+          <w:p>
+            <w:pPr>
+              <w:spacing w:before="120" w:after="120"/>
+            </w:pPr>
+            <w:r>
+              <w:rPr>
+                <w:sz w:val="18"/>
+              </w:rPr>
+              <w:t xml:space="preserve"> </w:t>
+            </w:r>
+          </w:p>
+        </w:tc>
+        <w:tc>
+          <w:tcPr>
+            <w:tcW w:type="dxa" w:w="2016"/>
+          </w:tcPr>
+          <w:p>
+            <w:pPr>
+              <w:spacing w:before="120" w:after="120"/>
+            </w:pPr>
+            <w:r>
+              <w:rPr>
+                <w:sz w:val="18"/>
+              </w:rPr>
+              <w:t xml:space="preserve"> </w:t>
+            </w:r>
+          </w:p>
+        </w:tc>
+        <w:tc>
+          <w:tcPr>
+            <w:tcW w:type="dxa" w:w="3888"/>
+          </w:tcPr>
+          <w:p>
+            <w:pPr>
+              <w:spacing w:before="120" w:after="120"/>
+            </w:pPr>
+            <w:r>
+              <w:rPr>
+                <w:sz w:val="18"/>
+              </w:rPr>
+              <w:t xml:space="preserve"> </w:t>
+            </w:r>
+          </w:p>
+        </w:tc>
+        <w:tc>
+          <w:tcPr>
+            <w:tcW w:type="dxa" w:w="1584"/>
+          </w:tcPr>
+          <w:p>
+            <w:pPr>
+              <w:spacing w:before="120" w:after="120"/>
+            </w:pPr>
+            <w:r>
+              <w:rPr>
+                <w:sz w:val="18"/>
+              </w:rPr>
+              <w:t xml:space="preserve"> </w:t>
+            </w:r>
+          </w:p>
+        </w:tc>
+      </w:tr>
+    </w:tbl>
+    <w:p>
+      <w:pPr>
+        <w:spacing w:after="80" w:before="0"/>
+      </w:pPr>
+    </w:p>
+    <w:p>
+      <w:pPr>
+        <w:spacing w:after="120" w:before="120"/>
       </w:pPr>
     </w:p>
     <w:p>
@@ -2230,7 +2853,7 @@
           <w:color w:val="55605F"/>
           <w:sz w:val="17"/>
         </w:rPr>
-        <w:t>Prepared by WILBA for The Schoeman Clinic</w:t>
+        <w:t>Prepared by WILBA for The Schoeman Clinic · Version 1.0 · 30 July 2026</w:t>
       </w:r>
     </w:p>
     <w:sectPr>

</xml_diff>

<commit_message>
Fold DPIA outline into consent pack (Part C) and simplify ads position
Add Part C: pre-filled Article 35 DPIA outline (describe processing,
necessity/proportionality, risk register, outcome & approval). Simplify
retargeting-ads handling to remove-the-clause (ads not run) rather than an
open question. All-in-one pack. Regenerated docx, HTML, and PDF.

Co-Authored-By: Claude Opus 4.8 <noreply@anthropic.com>
Claude-Session: https://claude.ai/code/session_01Qk44oiJ6G4KGcJdussGzUo
</commit_message>
<xml_diff>
--- a/outputs/schoeman-clinic/Schoeman-Clinic-Consent-DataProtection-Pack.docx
+++ b/outputs/schoeman-clinic/Schoeman-Clinic-Consent-DataProtection-Pack.docx
@@ -402,7 +402,7 @@
           <w:i w:val="0"/>
           <w:sz w:val="21"/>
         </w:rPr>
-        <w:t>This part turns the clinic’s consent capture into something defensible under UK GDPR and PECR as communications move into GoHighLevel. It sets out the lawful basis for each activity, how long information is kept, patients’ rights, the systems that touch patient data and how it moves internationally, and the specific edits the existing privacy policies need. It is written to be handed to your data-protection adviser for final sign-off before anything goes live.</w:t>
+        <w:t>This part turns the clinic’s consent capture into something defensible under UK GDPR and PECR as communications move into GoHighLevel. It sets out the lawful basis for each activity, how long information is kept, patients’ rights, the systems that touch patient data and how it moves internationally, the specific edits the existing privacy policies need, and a ready-to-complete DPIA outline (Part C). It is written to be handed to your data-protection adviser for final sign-off before anything goes live.</w:t>
       </w:r>
     </w:p>
     <w:p>
@@ -1124,7 +1124,7 @@
               <w:rPr>
                 <w:sz w:val="18"/>
               </w:rPr>
-              <w:t>Website analytics, cookies, retargeting</w:t>
+              <w:t>Website analytics &amp; cookies</w:t>
             </w:r>
           </w:p>
         </w:tc>
@@ -2359,10 +2359,10 @@
           <w:b/>
           <w:color w:val="8A5A0C"/>
         </w:rPr>
-        <w:t xml:space="preserve">Confirm / fix: </w:t>
+        <w:t xml:space="preserve">Remove ads clause: </w:t>
       </w:r>
       <w:r>
-        <w:t>the website policy references retargeting ads via Google, Facebook and Instagram. Confirm whether these are actually in use; if not, remove the clause; if yes, ensure the cookie banner captures consent for them (PECR).</w:t>
+        <w:t>the website policy references retargeting ads via Google, Facebook and Instagram. The clinic does not run these, so remove the clause so the policy matches what the clinic actually does. If retargeting is ever introduced, add a cookie-consent opt-in for it first (PECR).</w:t>
       </w:r>
     </w:p>
     <w:p>
@@ -2408,36 +2408,7 @@
           <w:color w:val="142A28"/>
           <w:sz w:val="27"/>
         </w:rPr>
-        <w:t>10 · Data protection by design — DPIA &amp; accountability</w:t>
-      </w:r>
-    </w:p>
-    <w:p>
-      <w:pPr>
-        <w:spacing w:after="80" w:before="0"/>
-      </w:pPr>
-      <w:r>
-        <w:rPr>
-          <w:b w:val="0"/>
-          <w:i w:val="0"/>
-          <w:sz w:val="21"/>
-        </w:rPr>
-        <w:t>Because this involves special-category (health) data at scale, a new operational CRM (GoHighLevel), and international transfer, a Data Protection Impact Assessment (DPIA) is expected under UK GDPR Article 35. We recommend completing a short DPIA for the GoHighLevel rollout before launch; your data adviser should own and sign it. WILBA can provide a pre-filled DPIA outline to speed this up.</w:t>
-      </w:r>
-    </w:p>
-    <w:p>
-      <w:pPr>
-        <w:spacing w:before="260" w:after="60"/>
-        <w:pBdr>
-          <w:bottom w:val="single" w:sz="6" w:space="2" w:color="C9D2DE"/>
-        </w:pBdr>
-      </w:pPr>
-      <w:r>
-        <w:rPr>
-          <w:b/>
-          <w:color w:val="142A28"/>
-          <w:sz w:val="27"/>
-        </w:rPr>
-        <w:t>11 · Before this goes live — data-person checklist</w:t>
+        <w:t>10 · Before this goes live — data-person checklist</w:t>
       </w:r>
     </w:p>
     <w:p>
@@ -2590,7 +2561,7 @@
         <w:rPr>
           <w:sz w:val="20"/>
         </w:rPr>
-        <w:t>Complete a DPIA for the GoHighLevel rollout</w:t>
+        <w:t>Complete and sign the DPIA in Part C</w:t>
       </w:r>
     </w:p>
     <w:p>
@@ -2607,7 +2578,7 @@
         <w:rPr>
           <w:sz w:val="20"/>
         </w:rPr>
-        <w:t>Confirm whether retargeting ads are in use and fix the website policy accordingly</w:t>
+        <w:t>Remove the retargeting-ads clause from the website policy (ads not currently run)</w:t>
       </w:r>
     </w:p>
     <w:p>
@@ -2644,33 +2615,256 @@
         <w:t>Update EU → UK GDPR references everywhere</w:t>
       </w:r>
     </w:p>
+    <w:tbl>
+      <w:tblPr>
+        <w:tblStyle w:val="TableGrid"/>
+        <w:tblW w:type="auto" w:w="0"/>
+        <w:tblLook w:firstColumn="1" w:firstRow="1" w:lastColumn="0" w:lastRow="0" w:noHBand="0" w:noVBand="1" w:val="04A0"/>
+      </w:tblPr>
+      <w:tblGrid>
+        <w:gridCol w:w="9792"/>
+      </w:tblGrid>
+      <w:tr>
+        <w:tc>
+          <w:tcPr>
+            <w:tcW w:type="dxa" w:w="9792"/>
+            <w:shd w:val="clear" w:fill="142A28"/>
+          </w:tcPr>
+          <w:p>
+            <w:pPr>
+              <w:spacing w:after="0"/>
+            </w:pPr>
+            <w:r>
+              <w:rPr>
+                <w:b/>
+                <w:color w:val="9FC4BD"/>
+                <w:sz w:val="16"/>
+              </w:rPr>
+              <w:t>PART C — DATA PROTECTION IMPACT ASSESSMENT</w:t>
+            </w:r>
+          </w:p>
+          <w:p>
+            <w:pPr>
+              <w:spacing w:before="0"/>
+            </w:pPr>
+            <w:r>
+              <w:rPr>
+                <w:b/>
+                <w:color w:val="FFFFFF"/>
+                <w:sz w:val="28"/>
+              </w:rPr>
+              <w:t>DPIA outline, ready for the data adviser to complete</w:t>
+            </w:r>
+          </w:p>
+        </w:tc>
+      </w:tr>
+    </w:tbl>
     <w:p>
       <w:pPr>
-        <w:spacing w:before="260" w:after="60"/>
-        <w:pBdr>
-          <w:bottom w:val="single" w:sz="6" w:space="2" w:color="C9D2DE"/>
-        </w:pBdr>
+        <w:spacing w:after="80" w:before="0"/>
+      </w:pPr>
+    </w:p>
+    <w:p>
+      <w:pPr>
+        <w:spacing w:after="80" w:before="0"/>
+      </w:pPr>
+      <w:r>
+        <w:rPr>
+          <w:b w:val="0"/>
+          <w:i/>
+          <w:color w:val="55605F"/>
+          <w:sz w:val="21"/>
+        </w:rPr>
+        <w:t>A DPIA is expected under UK GDPR Article 35 here, because the build involves special-category (health) data at scale, a new operational CRM (GoHighLevel), and an international transfer. This outline is pre-filled from what we know; the data adviser confirms the detail, adds anything clinic-specific, and signs it off. Items marked [confirm] need the clinic’s input.</w:t>
+      </w:r>
+    </w:p>
+    <w:p>
+      <w:pPr>
+        <w:spacing w:before="140" w:after="40"/>
       </w:pPr>
       <w:r>
         <w:rPr>
           <w:b/>
-          <w:color w:val="142A28"/>
-          <w:sz w:val="27"/>
+          <w:color w:val="0B534E"/>
+          <w:sz w:val="22"/>
         </w:rPr>
-        <w:t>12 · Review &amp; sign-off</w:t>
+        <w:t>Step 1 — Describe the processing</w:t>
       </w:r>
     </w:p>
     <w:p>
       <w:pPr>
-        <w:spacing w:after="60" w:before="0"/>
+        <w:pStyle w:val="ListBullet"/>
+        <w:spacing w:after="40"/>
       </w:pPr>
       <w:r>
         <w:rPr>
-          <w:b w:val="0"/>
-          <w:i w:val="0"/>
-          <w:sz w:val="21"/>
+          <w:b/>
         </w:rPr>
-        <w:t>For the reviewing data team: please confirm the items in section 11, note any changes, and complete the sign-off below. WILBA will action any wording or build changes you flag.</w:t>
+        <w:t xml:space="preserve">What: </w:t>
+      </w:r>
+      <w:r>
+        <w:t>collecting enquiry and registration information, messaging patients (WhatsApp, email, SMS), running a shared inbox and CRM (GoHighLevel), sending appointment reminders, and (with consent) newsletters.</w:t>
+      </w:r>
+    </w:p>
+    <w:p>
+      <w:pPr>
+        <w:pStyle w:val="ListBullet"/>
+        <w:spacing w:after="40"/>
+      </w:pPr>
+      <w:r>
+        <w:rPr>
+          <w:b/>
+        </w:rPr>
+        <w:t xml:space="preserve">Whose data: </w:t>
+      </w:r>
+      <w:r>
+        <w:t>adult private patients (UK, and international patients with a UK address). Special-category health data is involved from the enquiry onward.</w:t>
+      </w:r>
+    </w:p>
+    <w:p>
+      <w:pPr>
+        <w:pStyle w:val="ListBullet"/>
+        <w:spacing w:after="40"/>
+      </w:pPr>
+      <w:r>
+        <w:rPr>
+          <w:b/>
+        </w:rPr>
+        <w:t xml:space="preserve">Scale: </w:t>
+      </w:r>
+      <w:r>
+        <w:t>approximately [confirm number] existing contacts migrated from Semble, plus new enquiries.</w:t>
+      </w:r>
+    </w:p>
+    <w:p>
+      <w:pPr>
+        <w:pStyle w:val="ListBullet"/>
+        <w:spacing w:after="40"/>
+      </w:pPr>
+      <w:r>
+        <w:rPr>
+          <w:b/>
+        </w:rPr>
+        <w:t xml:space="preserve">Context: </w:t>
+      </w:r>
+      <w:r>
+        <w:t>premium hormone / longevity clinic. The clinical record stays in Semble; GoHighLevel is operational only and does not hold the clinical record.</w:t>
+      </w:r>
+    </w:p>
+    <w:p>
+      <w:pPr>
+        <w:pStyle w:val="ListBullet"/>
+        <w:spacing w:after="40"/>
+      </w:pPr>
+      <w:r>
+        <w:rPr>
+          <w:b/>
+        </w:rPr>
+        <w:t xml:space="preserve">Purposes: </w:t>
+      </w:r>
+      <w:r>
+        <w:t>respond to enquiries, coordinate care and appointments, send service messages, and send marketing only to patients who have opted in.</w:t>
+      </w:r>
+    </w:p>
+    <w:p>
+      <w:pPr>
+        <w:spacing w:before="140" w:after="40"/>
+      </w:pPr>
+      <w:r>
+        <w:rPr>
+          <w:b/>
+          <w:color w:val="0B534E"/>
+          <w:sz w:val="22"/>
+        </w:rPr>
+        <w:t>Step 2 — Necessity &amp; proportionality</w:t>
+      </w:r>
+    </w:p>
+    <w:p>
+      <w:pPr>
+        <w:pStyle w:val="ListBullet"/>
+        <w:spacing w:after="40"/>
+      </w:pPr>
+      <w:r>
+        <w:rPr>
+          <w:b/>
+        </w:rPr>
+        <w:t xml:space="preserve">Lawful basis: </w:t>
+      </w:r>
+      <w:r>
+        <w:t>as set out in section 4 — consent for enquiries and marketing; contract plus Article 9(2)(h) for providing care.</w:t>
+      </w:r>
+    </w:p>
+    <w:p>
+      <w:pPr>
+        <w:pStyle w:val="ListBullet"/>
+        <w:spacing w:after="40"/>
+      </w:pPr>
+      <w:r>
+        <w:rPr>
+          <w:b/>
+        </w:rPr>
+        <w:t xml:space="preserve">Data minimisation: </w:t>
+      </w:r>
+      <w:r>
+        <w:t>only the fields needed are collected; clinical detail remains in Semble, not GoHighLevel.</w:t>
+      </w:r>
+    </w:p>
+    <w:p>
+      <w:pPr>
+        <w:pStyle w:val="ListBullet"/>
+        <w:spacing w:after="40"/>
+      </w:pPr>
+      <w:r>
+        <w:rPr>
+          <w:b/>
+        </w:rPr>
+        <w:t xml:space="preserve">Individual rights: </w:t>
+      </w:r>
+      <w:r>
+        <w:t>supported as in section 6; consent is recorded and as easy to withdraw as to give.</w:t>
+      </w:r>
+    </w:p>
+    <w:p>
+      <w:pPr>
+        <w:pStyle w:val="ListBullet"/>
+        <w:spacing w:after="40"/>
+      </w:pPr>
+      <w:r>
+        <w:rPr>
+          <w:b/>
+        </w:rPr>
+        <w:t xml:space="preserve">Retention: </w:t>
+      </w:r>
+      <w:r>
+        <w:t>set and documented as in section 5, including deletion of non-converting enquiries.</w:t>
+      </w:r>
+    </w:p>
+    <w:p>
+      <w:pPr>
+        <w:pStyle w:val="ListBullet"/>
+        <w:spacing w:after="40"/>
+      </w:pPr>
+      <w:r>
+        <w:rPr>
+          <w:b/>
+        </w:rPr>
+        <w:t xml:space="preserve">Transfers: </w:t>
+      </w:r>
+      <w:r>
+        <w:t>US processors covered by UK IDTA and a Transfer Risk Assessment (section 8).</w:t>
+      </w:r>
+    </w:p>
+    <w:p>
+      <w:pPr>
+        <w:spacing w:before="140" w:after="40"/>
+      </w:pPr>
+      <w:r>
+        <w:rPr>
+          <w:b/>
+          <w:color w:val="0B534E"/>
+          <w:sz w:val="22"/>
+        </w:rPr>
+        <w:t>Step 3 — Risk register</w:t>
       </w:r>
     </w:p>
     <w:tbl>
@@ -2688,7 +2882,7 @@
       <w:tr>
         <w:tc>
           <w:tcPr>
-            <w:tcW w:type="dxa" w:w="2304"/>
+            <w:tcW w:type="dxa" w:w="2880"/>
             <w:shd w:val="clear" w:fill="142A28"/>
           </w:tcPr>
           <w:p>
@@ -2698,13 +2892,467 @@
                 <w:color w:val="FFFFFF"/>
                 <w:sz w:val="18"/>
               </w:rPr>
-              <w:t>Reviewed by</w:t>
+              <w:t>Risk</w:t>
             </w:r>
           </w:p>
         </w:tc>
         <w:tc>
           <w:tcPr>
-            <w:tcW w:type="dxa" w:w="2016"/>
+            <w:tcW w:type="dxa" w:w="1296"/>
+            <w:shd w:val="clear" w:fill="142A28"/>
+          </w:tcPr>
+          <w:p>
+            <w:r>
+              <w:rPr>
+                <w:b/>
+                <w:color w:val="FFFFFF"/>
+                <w:sz w:val="18"/>
+              </w:rPr>
+              <w:t>Likelihood</w:t>
+            </w:r>
+          </w:p>
+        </w:tc>
+        <w:tc>
+          <w:tcPr>
+            <w:tcW w:type="dxa" w:w="1296"/>
+            <w:shd w:val="clear" w:fill="142A28"/>
+          </w:tcPr>
+          <w:p>
+            <w:r>
+              <w:rPr>
+                <w:b/>
+                <w:color w:val="FFFFFF"/>
+                <w:sz w:val="18"/>
+              </w:rPr>
+              <w:t>Severity</w:t>
+            </w:r>
+          </w:p>
+        </w:tc>
+        <w:tc>
+          <w:tcPr>
+            <w:tcW w:type="dxa" w:w="3888"/>
+            <w:shd w:val="clear" w:fill="142A28"/>
+          </w:tcPr>
+          <w:p>
+            <w:r>
+              <w:rPr>
+                <w:b/>
+                <w:color w:val="FFFFFF"/>
+                <w:sz w:val="18"/>
+              </w:rPr>
+              <w:t>Measures to reduce it</w:t>
+            </w:r>
+          </w:p>
+        </w:tc>
+      </w:tr>
+      <w:tr>
+        <w:tc>
+          <w:tcPr>
+            <w:tcW w:type="dxa" w:w="2880"/>
+          </w:tcPr>
+          <w:p>
+            <w:pPr>
+              <w:spacing w:after="20"/>
+            </w:pPr>
+            <w:r>
+              <w:rPr>
+                <w:sz w:val="18"/>
+              </w:rPr>
+              <w:t>Health data held in a US-based CRM (GoHighLevel)</w:t>
+            </w:r>
+          </w:p>
+        </w:tc>
+        <w:tc>
+          <w:tcPr>
+            <w:tcW w:type="dxa" w:w="1296"/>
+          </w:tcPr>
+          <w:p>
+            <w:pPr>
+              <w:spacing w:after="20"/>
+            </w:pPr>
+            <w:r>
+              <w:rPr>
+                <w:sz w:val="18"/>
+              </w:rPr>
+              <w:t>Low</w:t>
+            </w:r>
+          </w:p>
+        </w:tc>
+        <w:tc>
+          <w:tcPr>
+            <w:tcW w:type="dxa" w:w="1296"/>
+          </w:tcPr>
+          <w:p>
+            <w:pPr>
+              <w:spacing w:after="20"/>
+            </w:pPr>
+            <w:r>
+              <w:rPr>
+                <w:sz w:val="18"/>
+              </w:rPr>
+              <w:t>High</w:t>
+            </w:r>
+          </w:p>
+        </w:tc>
+        <w:tc>
+          <w:tcPr>
+            <w:tcW w:type="dxa" w:w="3888"/>
+          </w:tcPr>
+          <w:p>
+            <w:pPr>
+              <w:spacing w:after="20"/>
+            </w:pPr>
+            <w:r>
+              <w:rPr>
+                <w:sz w:val="18"/>
+              </w:rPr>
+              <w:t>HIPAA tier; UK IDTA + Transfer Risk Assessment; clinical record kept in Semble, not GHL; access controls.</w:t>
+            </w:r>
+          </w:p>
+        </w:tc>
+      </w:tr>
+      <w:tr>
+        <w:tc>
+          <w:tcPr>
+            <w:tcW w:type="dxa" w:w="2880"/>
+          </w:tcPr>
+          <w:p>
+            <w:pPr>
+              <w:spacing w:after="20"/>
+            </w:pPr>
+            <w:r>
+              <w:rPr>
+                <w:sz w:val="18"/>
+              </w:rPr>
+              <w:t>Shared-inbox messages seen by wider team than needed</w:t>
+            </w:r>
+          </w:p>
+        </w:tc>
+        <w:tc>
+          <w:tcPr>
+            <w:tcW w:type="dxa" w:w="1296"/>
+          </w:tcPr>
+          <w:p>
+            <w:pPr>
+              <w:spacing w:after="20"/>
+            </w:pPr>
+            <w:r>
+              <w:rPr>
+                <w:sz w:val="18"/>
+              </w:rPr>
+              <w:t>Medium</w:t>
+            </w:r>
+          </w:p>
+        </w:tc>
+        <w:tc>
+          <w:tcPr>
+            <w:tcW w:type="dxa" w:w="1296"/>
+          </w:tcPr>
+          <w:p>
+            <w:pPr>
+              <w:spacing w:after="20"/>
+            </w:pPr>
+            <w:r>
+              <w:rPr>
+                <w:sz w:val="18"/>
+              </w:rPr>
+              <w:t>Medium</w:t>
+            </w:r>
+          </w:p>
+        </w:tc>
+        <w:tc>
+          <w:tcPr>
+            <w:tcW w:type="dxa" w:w="3888"/>
+          </w:tcPr>
+          <w:p>
+            <w:pPr>
+              <w:spacing w:after="20"/>
+            </w:pPr>
+            <w:r>
+              <w:rPr>
+                <w:sz w:val="18"/>
+              </w:rPr>
+              <w:t>Role-based access; staff data-protection agreements and training; sensitive items recorded in Semble.</w:t>
+            </w:r>
+          </w:p>
+        </w:tc>
+      </w:tr>
+      <w:tr>
+        <w:tc>
+          <w:tcPr>
+            <w:tcW w:type="dxa" w:w="2880"/>
+          </w:tcPr>
+          <w:p>
+            <w:pPr>
+              <w:spacing w:after="20"/>
+            </w:pPr>
+            <w:r>
+              <w:rPr>
+                <w:sz w:val="18"/>
+              </w:rPr>
+              <w:t>Marketing sent without a valid basis after the MailChimp → GHL migration</w:t>
+            </w:r>
+          </w:p>
+        </w:tc>
+        <w:tc>
+          <w:tcPr>
+            <w:tcW w:type="dxa" w:w="1296"/>
+          </w:tcPr>
+          <w:p>
+            <w:pPr>
+              <w:spacing w:after="20"/>
+            </w:pPr>
+            <w:r>
+              <w:rPr>
+                <w:sz w:val="18"/>
+              </w:rPr>
+              <w:t>Medium</w:t>
+            </w:r>
+          </w:p>
+        </w:tc>
+        <w:tc>
+          <w:tcPr>
+            <w:tcW w:type="dxa" w:w="1296"/>
+          </w:tcPr>
+          <w:p>
+            <w:pPr>
+              <w:spacing w:after="20"/>
+            </w:pPr>
+            <w:r>
+              <w:rPr>
+                <w:sz w:val="18"/>
+              </w:rPr>
+              <w:t>Medium</w:t>
+            </w:r>
+          </w:p>
+        </w:tc>
+        <w:tc>
+          <w:tcPr>
+            <w:tcW w:type="dxa" w:w="3888"/>
+          </w:tcPr>
+          <w:p>
+            <w:pPr>
+              <w:spacing w:after="20"/>
+            </w:pPr>
+            <w:r>
+              <w:rPr>
+                <w:sz w:val="18"/>
+              </w:rPr>
+              <w:t>Migrate only validly-consented contacts; per-channel opt-in; working unsubscribe; consent audit trail.</w:t>
+            </w:r>
+          </w:p>
+        </w:tc>
+      </w:tr>
+      <w:tr>
+        <w:tc>
+          <w:tcPr>
+            <w:tcW w:type="dxa" w:w="2880"/>
+          </w:tcPr>
+          <w:p>
+            <w:pPr>
+              <w:spacing w:after="20"/>
+            </w:pPr>
+            <w:r>
+              <w:rPr>
+                <w:sz w:val="18"/>
+              </w:rPr>
+              <w:t>Invalid consent from Semble auto-marking opt-in</w:t>
+            </w:r>
+          </w:p>
+        </w:tc>
+        <w:tc>
+          <w:tcPr>
+            <w:tcW w:type="dxa" w:w="1296"/>
+          </w:tcPr>
+          <w:p>
+            <w:pPr>
+              <w:spacing w:after="20"/>
+            </w:pPr>
+            <w:r>
+              <w:rPr>
+                <w:sz w:val="18"/>
+              </w:rPr>
+              <w:t>High (current)</w:t>
+            </w:r>
+          </w:p>
+        </w:tc>
+        <w:tc>
+          <w:tcPr>
+            <w:tcW w:type="dxa" w:w="1296"/>
+          </w:tcPr>
+          <w:p>
+            <w:pPr>
+              <w:spacing w:after="20"/>
+            </w:pPr>
+            <w:r>
+              <w:rPr>
+                <w:sz w:val="18"/>
+              </w:rPr>
+              <w:t>Medium</w:t>
+            </w:r>
+          </w:p>
+        </w:tc>
+        <w:tc>
+          <w:tcPr>
+            <w:tcW w:type="dxa" w:w="3888"/>
+          </w:tcPr>
+          <w:p>
+            <w:pPr>
+              <w:spacing w:after="20"/>
+            </w:pPr>
+            <w:r>
+              <w:rPr>
+                <w:sz w:val="18"/>
+              </w:rPr>
+              <w:t>Replace with a genuine captured opt-in; re-permission the list where needed.</w:t>
+            </w:r>
+          </w:p>
+        </w:tc>
+      </w:tr>
+      <w:tr>
+        <w:tc>
+          <w:tcPr>
+            <w:tcW w:type="dxa" w:w="2880"/>
+          </w:tcPr>
+          <w:p>
+            <w:pPr>
+              <w:spacing w:after="20"/>
+            </w:pPr>
+            <w:r>
+              <w:rPr>
+                <w:sz w:val="18"/>
+              </w:rPr>
+              <w:t>Unauthorised access or data breach</w:t>
+            </w:r>
+          </w:p>
+        </w:tc>
+        <w:tc>
+          <w:tcPr>
+            <w:tcW w:type="dxa" w:w="1296"/>
+          </w:tcPr>
+          <w:p>
+            <w:pPr>
+              <w:spacing w:after="20"/>
+            </w:pPr>
+            <w:r>
+              <w:rPr>
+                <w:sz w:val="18"/>
+              </w:rPr>
+              <w:t>Low</w:t>
+            </w:r>
+          </w:p>
+        </w:tc>
+        <w:tc>
+          <w:tcPr>
+            <w:tcW w:type="dxa" w:w="1296"/>
+          </w:tcPr>
+          <w:p>
+            <w:pPr>
+              <w:spacing w:after="20"/>
+            </w:pPr>
+            <w:r>
+              <w:rPr>
+                <w:sz w:val="18"/>
+              </w:rPr>
+              <w:t>High</w:t>
+            </w:r>
+          </w:p>
+        </w:tc>
+        <w:tc>
+          <w:tcPr>
+            <w:tcW w:type="dxa" w:w="3888"/>
+          </w:tcPr>
+          <w:p>
+            <w:pPr>
+              <w:spacing w:after="20"/>
+            </w:pPr>
+            <w:r>
+              <w:rPr>
+                <w:sz w:val="18"/>
+              </w:rPr>
+              <w:t>Multi-factor authentication; least-privilege access; Article 28 DPAs; 72-hour ICO breach process; encryption in transit and at rest.</w:t>
+            </w:r>
+          </w:p>
+        </w:tc>
+      </w:tr>
+    </w:tbl>
+    <w:p>
+      <w:pPr>
+        <w:spacing w:after="60" w:before="0"/>
+      </w:pPr>
+    </w:p>
+    <w:p>
+      <w:pPr>
+        <w:spacing w:after="120" w:before="0"/>
+      </w:pPr>
+      <w:r>
+        <w:rPr>
+          <w:b w:val="0"/>
+          <w:i/>
+          <w:color w:val="55605F"/>
+          <w:sz w:val="17"/>
+        </w:rPr>
+        <w:t>Likelihood and severity are the adviser’s to confirm; add any clinic-specific risks.</w:t>
+      </w:r>
+    </w:p>
+    <w:p>
+      <w:pPr>
+        <w:spacing w:before="140" w:after="40"/>
+      </w:pPr>
+      <w:r>
+        <w:rPr>
+          <w:b/>
+          <w:color w:val="0B534E"/>
+          <w:sz w:val="22"/>
+        </w:rPr>
+        <w:t>Step 4 — Outcome &amp; approval</w:t>
+      </w:r>
+    </w:p>
+    <w:p>
+      <w:pPr>
+        <w:spacing w:after="60" w:before="0"/>
+      </w:pPr>
+      <w:r>
+        <w:rPr>
+          <w:b w:val="0"/>
+          <w:i w:val="0"/>
+          <w:sz w:val="21"/>
+        </w:rPr>
+        <w:t>Record the residual risk after the measures above, any actions still outstanding, and the approval below. WILBA will action any wording or build changes flagged during review.</w:t>
+      </w:r>
+    </w:p>
+    <w:tbl>
+      <w:tblPr>
+        <w:tblStyle w:val="TableGrid"/>
+        <w:tblW w:type="auto" w:w="0"/>
+        <w:tblLook w:firstColumn="1" w:firstRow="1" w:lastColumn="0" w:lastRow="0" w:noHBand="0" w:noVBand="1" w:val="04A0"/>
+      </w:tblPr>
+      <w:tblGrid>
+        <w:gridCol w:w="2448"/>
+        <w:gridCol w:w="2448"/>
+        <w:gridCol w:w="2448"/>
+        <w:gridCol w:w="2448"/>
+      </w:tblGrid>
+      <w:tr>
+        <w:tc>
+          <w:tcPr>
+            <w:tcW w:type="dxa" w:w="2448"/>
+            <w:shd w:val="clear" w:fill="142A28"/>
+          </w:tcPr>
+          <w:p>
+            <w:r>
+              <w:rPr>
+                <w:b/>
+                <w:color w:val="FFFFFF"/>
+                <w:sz w:val="18"/>
+              </w:rPr>
+              <w:t>Reviewed / approved by</w:t>
+            </w:r>
+          </w:p>
+        </w:tc>
+        <w:tc>
+          <w:tcPr>
+            <w:tcW w:type="dxa" w:w="1872"/>
             <w:shd w:val="clear" w:fill="142A28"/>
           </w:tcPr>
           <w:p>
@@ -2720,7 +3368,7 @@
         </w:tc>
         <w:tc>
           <w:tcPr>
-            <w:tcW w:type="dxa" w:w="3888"/>
+            <w:tcW w:type="dxa" w:w="3744"/>
             <w:shd w:val="clear" w:fill="142A28"/>
           </w:tcPr>
           <w:p>
@@ -2730,7 +3378,7 @@
                 <w:color w:val="FFFFFF"/>
                 <w:sz w:val="18"/>
               </w:rPr>
-              <w:t>Confirmed / changes requested</w:t>
+              <w:t>Residual risk &amp; any actions</w:t>
             </w:r>
           </w:p>
         </w:tc>
@@ -2754,11 +3402,11 @@
       <w:tr>
         <w:tc>
           <w:tcPr>
-            <w:tcW w:type="dxa" w:w="2304"/>
+            <w:tcW w:type="dxa" w:w="2448"/>
           </w:tcPr>
           <w:p>
             <w:pPr>
-              <w:spacing w:before="120" w:after="120"/>
+              <w:spacing w:before="160" w:after="160"/>
             </w:pPr>
             <w:r>
               <w:rPr>
@@ -2770,11 +3418,11 @@
         </w:tc>
         <w:tc>
           <w:tcPr>
-            <w:tcW w:type="dxa" w:w="2016"/>
+            <w:tcW w:type="dxa" w:w="1872"/>
           </w:tcPr>
           <w:p>
             <w:pPr>
-              <w:spacing w:before="120" w:after="120"/>
+              <w:spacing w:before="160" w:after="160"/>
             </w:pPr>
             <w:r>
               <w:rPr>
@@ -2786,11 +3434,11 @@
         </w:tc>
         <w:tc>
           <w:tcPr>
-            <w:tcW w:type="dxa" w:w="3888"/>
+            <w:tcW w:type="dxa" w:w="3744"/>
           </w:tcPr>
           <w:p>
             <w:pPr>
-              <w:spacing w:before="120" w:after="120"/>
+              <w:spacing w:before="160" w:after="160"/>
             </w:pPr>
             <w:r>
               <w:rPr>
@@ -2806,7 +3454,7 @@
           </w:tcPr>
           <w:p>
             <w:pPr>
-              <w:spacing w:before="120" w:after="120"/>
+              <w:spacing w:before="160" w:after="160"/>
             </w:pPr>
             <w:r>
               <w:rPr>

</xml_diff>

<commit_message>
Simplify consent doc to standard clinic pattern: checkbox + privacy detail
Rebuilt to match how UK private clinics do this: an explicit consent tick box
naming health data, a separate marketing opt-in, and a plain-English privacy
notice as the detail behind it. Removed the internal compliance scaffolding
(Parts A/B/C, DPIA, risk register). Regenerated docx, HTML, and PDF.

Co-Authored-By: Claude Opus 4.8 <noreply@anthropic.com>
Claude-Session: https://claude.ai/code/session_01Qk44oiJ6G4KGcJdussGzUo
</commit_message>
<xml_diff>
--- a/outputs/schoeman-clinic/Schoeman-Clinic-Consent-DataProtection-Pack.docx
+++ b/outputs/schoeman-clinic/Schoeman-Clinic-Consent-DataProtection-Pack.docx
@@ -18,107 +18,17 @@
     </w:p>
     <w:p>
       <w:pPr>
-        <w:spacing w:after="20" w:before="0"/>
+        <w:spacing w:after="40" w:before="0"/>
       </w:pPr>
       <w:r>
         <w:rPr>
           <w:b/>
           <w:i w:val="0"/>
           <w:color w:val="142A28"/>
-          <w:sz w:val="38"/>
+          <w:sz w:val="36"/>
         </w:rPr>
-        <w:t>Consent &amp; Data-Protection Pack</w:t>
+        <w:t>Patient Consent &amp; How We Use Your Information</w:t>
       </w:r>
-    </w:p>
-    <w:p>
-      <w:pPr>
-        <w:spacing w:after="40" w:before="0"/>
-      </w:pPr>
-      <w:r>
-        <w:rPr>
-          <w:b w:val="0"/>
-          <w:i/>
-          <w:color w:val="55605F"/>
-          <w:sz w:val="22"/>
-        </w:rPr>
-        <w:t>Working draft for the clinic’s data-protection adviser to review and sign off</w:t>
-      </w:r>
-    </w:p>
-    <w:p>
-      <w:pPr>
-        <w:spacing w:after="120" w:before="0"/>
-      </w:pPr>
-      <w:r>
-        <w:rPr>
-          <w:b w:val="0"/>
-          <w:i w:val="0"/>
-          <w:color w:val="55605F"/>
-          <w:sz w:val="18"/>
-        </w:rPr>
-        <w:t>Version 1.0   ·   Draft for review   ·   30 July 2026   ·   Prepared by WILBA for The Schoeman Clinic</w:t>
-      </w:r>
-    </w:p>
-    <w:p>
-      <w:pPr>
-        <w:spacing w:after="160" w:before="0"/>
-      </w:pPr>
-      <w:r>
-        <w:rPr>
-          <w:b w:val="0"/>
-          <w:i w:val="0"/>
-          <w:sz w:val="21"/>
-        </w:rPr>
-        <w:t>How to read this. There are two parts. Part A is the short wording that goes on the forms: just a tick box and one line, and that is all the patient ever sees. Part B is the detail behind it, for the data-protection adviser to review and sign off once. The patient never reads Part B; the full terms they can click through to are the existing Privacy Policy.</w:t>
-      </w:r>
-    </w:p>
-    <w:tbl>
-      <w:tblPr>
-        <w:tblStyle w:val="TableGrid"/>
-        <w:tblW w:type="auto" w:w="0"/>
-        <w:tblLook w:firstColumn="1" w:firstRow="1" w:lastColumn="0" w:lastRow="0" w:noHBand="0" w:noVBand="1" w:val="04A0"/>
-      </w:tblPr>
-      <w:tblGrid>
-        <w:gridCol w:w="9792"/>
-      </w:tblGrid>
-      <w:tr>
-        <w:tc>
-          <w:tcPr>
-            <w:tcW w:type="dxa" w:w="9792"/>
-            <w:shd w:val="clear" w:fill="142A28"/>
-          </w:tcPr>
-          <w:p>
-            <w:pPr>
-              <w:spacing w:after="0"/>
-            </w:pPr>
-            <w:r>
-              <w:rPr>
-                <w:b/>
-                <w:color w:val="9FC4BD"/>
-                <w:sz w:val="16"/>
-              </w:rPr>
-              <w:t>PART A — FOR THE FORM BUILDER</w:t>
-            </w:r>
-          </w:p>
-          <w:p>
-            <w:pPr>
-              <w:spacing w:before="0"/>
-            </w:pPr>
-            <w:r>
-              <w:rPr>
-                <w:b/>
-                <w:color w:val="FFFFFF"/>
-                <w:sz w:val="28"/>
-              </w:rPr>
-              <w:t>The form copy: what the patient actually sees</w:t>
-            </w:r>
-          </w:p>
-        </w:tc>
-      </w:tr>
-    </w:tbl>
-    <w:p>
-      <w:pPr>
-        <w:spacing w:after="80" w:before="0"/>
-      </w:pPr>
     </w:p>
     <w:p>
       <w:pPr>
@@ -131,20 +41,20 @@
           <w:color w:val="55605F"/>
           <w:sz w:val="21"/>
         </w:rPr>
-        <w:t>Short and simple. Each patient sees a tick box and one line, with a link to the Privacy Policy if they want the full detail. Required boxes are unticked by default; optional boxes are clearly optional.</w:t>
+        <w:t>The tick-box wording for the enquiry and registration forms, with the data-protection detail behind it.</w:t>
       </w:r>
     </w:p>
     <w:p>
       <w:pPr>
-        <w:spacing w:before="140" w:after="40"/>
+        <w:spacing w:before="240" w:after="80"/>
       </w:pPr>
       <w:r>
         <w:rPr>
           <w:b/>
-          <w:color w:val="0B534E"/>
-          <w:sz w:val="22"/>
+          <w:color w:val="142A28"/>
+          <w:sz w:val="28"/>
         </w:rPr>
-        <w:t>On the enquiry form</w:t>
+        <w:t>Enquiry form</w:t>
       </w:r>
     </w:p>
     <w:tbl>
@@ -154,43 +64,29 @@
         <w:tblLook w:firstColumn="1" w:firstRow="1" w:lastColumn="0" w:lastRow="0" w:noHBand="0" w:noVBand="1" w:val="04A0"/>
       </w:tblPr>
       <w:tblGrid>
-        <w:gridCol w:w="9792"/>
+        <w:gridCol w:w="9648"/>
       </w:tblGrid>
       <w:tr>
         <w:tc>
           <w:tcPr>
-            <w:tcW w:type="dxa" w:w="9792"/>
+            <w:tcW w:type="dxa" w:w="9648"/>
             <w:shd w:val="clear" w:fill="F4F6F5"/>
           </w:tcPr>
           <w:p>
             <w:pPr>
-              <w:spacing w:after="20"/>
+              <w:spacing w:after="60"/>
             </w:pPr>
             <w:r>
               <w:rPr>
                 <w:b/>
-                <w:i w:val="0"/>
-                <w:sz w:val="20"/>
+                <w:sz w:val="21"/>
               </w:rPr>
-              <w:t>Enquiry consent</w:t>
+              <w:t>☐  I consent to The Schoeman Clinic using my details, including any health information I share, to respond to my enquiry and help me take the next steps.   [REQUIRED]</w:t>
             </w:r>
           </w:p>
           <w:p>
             <w:pPr>
-              <w:spacing w:after="20"/>
-            </w:pPr>
-            <w:r>
-              <w:rPr>
-                <w:b/>
-                <w:i w:val="0"/>
-                <w:sz w:val="20"/>
-              </w:rPr>
-              <w:t>☐  I consent to The Schoeman Clinic using my details, including any health information I share, to respond to my enquiry and guide me through the next steps. (See our Privacy Policy.)   [REQUIRED]</w:t>
-            </w:r>
-          </w:p>
-          <w:p>
-            <w:pPr>
-              <w:spacing w:after="20"/>
+              <w:spacing w:after="60"/>
             </w:pPr>
             <w:r>
               <w:rPr>
@@ -201,27 +97,26 @@
           </w:p>
           <w:p>
             <w:pPr>
-              <w:spacing w:after="20"/>
+              <w:spacing w:after="60"/>
             </w:pPr>
             <w:r>
               <w:rPr>
                 <w:sz w:val="20"/>
               </w:rPr>
-              <w:t>☐ Email    ☐ WhatsApp    ☐ SMS / phone.   How would you like us to contact you about your care?</w:t>
+              <w:t>☐ Email     ☐ WhatsApp     ☐ SMS / phone.   How would you like us to contact you about your care?</w:t>
             </w:r>
           </w:p>
           <w:p>
             <w:pPr>
-              <w:spacing w:after="20"/>
+              <w:spacing w:after="60"/>
             </w:pPr>
             <w:r>
               <w:rPr>
-                <w:b w:val="0"/>
                 <w:i/>
                 <w:color w:val="55605F"/>
-                <w:sz w:val="20"/>
+                <w:sz w:val="19"/>
               </w:rPr>
-              <w:t>WhatsApp is used for appointment reminders and service messages, not marketing. You can update your preferences or withdraw your consent at any time.</w:t>
+              <w:t>You can update your preferences or withdraw your consent at any time. See how we use your information below.</w:t>
             </w:r>
           </w:p>
         </w:tc>
@@ -229,20 +124,20 @@
     </w:tbl>
     <w:p>
       <w:pPr>
-        <w:spacing w:after="80" w:before="0"/>
+        <w:spacing w:after="120" w:before="0"/>
       </w:pPr>
     </w:p>
     <w:p>
       <w:pPr>
-        <w:spacing w:before="140" w:after="40"/>
+        <w:spacing w:before="240" w:after="80"/>
       </w:pPr>
       <w:r>
         <w:rPr>
           <w:b/>
-          <w:color w:val="0B534E"/>
-          <w:sz w:val="22"/>
+          <w:color w:val="142A28"/>
+          <w:sz w:val="28"/>
         </w:rPr>
-        <w:t>On the registration form</w:t>
+        <w:t>Registration form</w:t>
       </w:r>
     </w:p>
     <w:tbl>
@@ -252,43 +147,29 @@
         <w:tblLook w:firstColumn="1" w:firstRow="1" w:lastColumn="0" w:lastRow="0" w:noHBand="0" w:noVBand="1" w:val="04A0"/>
       </w:tblPr>
       <w:tblGrid>
-        <w:gridCol w:w="9792"/>
+        <w:gridCol w:w="9648"/>
       </w:tblGrid>
       <w:tr>
         <w:tc>
           <w:tcPr>
-            <w:tcW w:type="dxa" w:w="9792"/>
+            <w:tcW w:type="dxa" w:w="9648"/>
             <w:shd w:val="clear" w:fill="F4F6F5"/>
           </w:tcPr>
           <w:p>
             <w:pPr>
-              <w:spacing w:after="20"/>
+              <w:spacing w:after="60"/>
             </w:pPr>
             <w:r>
               <w:rPr>
                 <w:b/>
-                <w:i w:val="0"/>
-                <w:sz w:val="20"/>
+                <w:sz w:val="21"/>
               </w:rPr>
-              <w:t>Registration consent</w:t>
+              <w:t>☐  I confirm my details are accurate and I understand how The Schoeman Clinic will use my information to provide my care, as set out below and in the Privacy Policy.   [REQUIRED]</w:t>
             </w:r>
           </w:p>
           <w:p>
             <w:pPr>
-              <w:spacing w:after="20"/>
-            </w:pPr>
-            <w:r>
-              <w:rPr>
-                <w:b/>
-                <w:i w:val="0"/>
-                <w:sz w:val="20"/>
-              </w:rPr>
-              <w:t>☐  I confirm my details are accurate and I understand how The Schoeman Clinic will use my information to provide my care, as set out in the Patient Privacy Policy.   [REQUIRED]</w:t>
-            </w:r>
-          </w:p>
-          <w:p>
-            <w:pPr>
-              <w:spacing w:after="20"/>
+              <w:spacing w:after="60"/>
             </w:pPr>
             <w:r>
               <w:rPr>
@@ -299,27 +180,13 @@
           </w:p>
           <w:p>
             <w:pPr>
-              <w:spacing w:after="20"/>
+              <w:spacing w:after="60"/>
             </w:pPr>
             <w:r>
               <w:rPr>
                 <w:sz w:val="20"/>
               </w:rPr>
-              <w:t>☐ Email    ☐ WhatsApp    ☐ SMS / phone.   How we contact you about your care.</w:t>
-            </w:r>
-          </w:p>
-          <w:p>
-            <w:pPr>
-              <w:spacing w:after="20"/>
-            </w:pPr>
-            <w:r>
-              <w:rPr>
-                <w:b w:val="0"/>
-                <w:i/>
-                <w:color w:val="55605F"/>
-                <w:sz w:val="20"/>
-              </w:rPr>
-              <w:t>Carry the contact and email preference across from the enquiry rather than asking again, unless it was not captured cleanly.</w:t>
+              <w:t>☐ Email     ☐ WhatsApp     ☐ SMS / phone.   How we contact you about your care.</w:t>
             </w:r>
           </w:p>
         </w:tc>
@@ -327,2088 +194,33 @@
     </w:tbl>
     <w:p>
       <w:pPr>
-        <w:spacing w:after="80" w:before="0"/>
-      </w:pPr>
-    </w:p>
-    <w:tbl>
-      <w:tblPr>
-        <w:tblStyle w:val="TableGrid"/>
-        <w:tblW w:type="auto" w:w="0"/>
-        <w:tblLook w:firstColumn="1" w:firstRow="1" w:lastColumn="0" w:lastRow="0" w:noHBand="0" w:noVBand="1" w:val="04A0"/>
-      </w:tblPr>
-      <w:tblGrid>
-        <w:gridCol w:w="9792"/>
-      </w:tblGrid>
-      <w:tr>
-        <w:tc>
-          <w:tcPr>
-            <w:tcW w:type="dxa" w:w="9792"/>
-            <w:shd w:val="clear" w:fill="142A28"/>
-          </w:tcPr>
-          <w:p>
-            <w:pPr>
-              <w:spacing w:after="0"/>
-            </w:pPr>
-            <w:r>
-              <w:rPr>
-                <w:b/>
-                <w:color w:val="9FC4BD"/>
-                <w:sz w:val="16"/>
-              </w:rPr>
-              <w:t>PART B — FOR THE DATA-PROTECTION ADVISER</w:t>
-            </w:r>
-          </w:p>
-          <w:p>
-            <w:pPr>
-              <w:spacing w:before="0"/>
-            </w:pPr>
-            <w:r>
-              <w:rPr>
-                <w:b/>
-                <w:color w:val="FFFFFF"/>
-                <w:sz w:val="28"/>
-              </w:rPr>
-              <w:t>The reference pack behind the wording</w:t>
-            </w:r>
-          </w:p>
-        </w:tc>
-      </w:tr>
-    </w:tbl>
-    <w:p>
-      <w:pPr>
-        <w:spacing w:after="80" w:before="0"/>
+        <w:spacing w:after="120" w:before="0"/>
       </w:pPr>
     </w:p>
     <w:p>
       <w:pPr>
-        <w:spacing w:after="20" w:before="0"/>
-      </w:pPr>
-      <w:r>
-        <w:rPr>
-          <w:b/>
-          <w:i w:val="0"/>
-          <w:sz w:val="21"/>
-        </w:rPr>
-        <w:t>Plain-English summary</w:t>
-      </w:r>
-    </w:p>
-    <w:p>
-      <w:pPr>
-        <w:spacing w:after="120" w:before="0"/>
-      </w:pPr>
-      <w:r>
-        <w:rPr>
-          <w:b w:val="0"/>
-          <w:i w:val="0"/>
-          <w:sz w:val="21"/>
-        </w:rPr>
-        <w:t>This part turns the clinic’s consent capture into something defensible under UK GDPR and PECR as communications move into GoHighLevel. It sets out the lawful basis for each activity, how long information is kept, patients’ rights, the systems that touch patient data and how it moves internationally, the specific edits the existing privacy policies need, and a ready-to-complete DPIA outline (Part C). It is written to be handed to your data-protection adviser for final sign-off before anything goes live.</w:t>
-      </w:r>
-    </w:p>
-    <w:p>
-      <w:pPr>
-        <w:spacing w:before="260" w:after="60"/>
-        <w:pBdr>
-          <w:bottom w:val="single" w:sz="6" w:space="2" w:color="C9D2DE"/>
-        </w:pBdr>
+        <w:spacing w:before="240" w:after="80"/>
       </w:pPr>
       <w:r>
         <w:rPr>
           <w:b/>
           <w:color w:val="142A28"/>
-          <w:sz w:val="27"/>
+          <w:sz w:val="28"/>
         </w:rPr>
-        <w:t>Context we have worked from</w:t>
+        <w:t>The details — how we use and protect your information</w:t>
       </w:r>
     </w:p>
     <w:p>
       <w:pPr>
-        <w:pStyle w:val="ListBullet"/>
-        <w:spacing w:after="40"/>
+        <w:spacing w:after="20" w:before="120"/>
       </w:pPr>
       <w:r>
         <w:rPr>
           <w:b/>
-        </w:rPr>
-        <w:t xml:space="preserve">Jurisdiction: </w:t>
-      </w:r>
-      <w:r>
-        <w:t>UK. Clinic established in the UK, CQC registered; patients may be international but require a UK address. Governing regime: UK GDPR + Data Protection Act 2018 + PECR.</w:t>
-      </w:r>
-    </w:p>
-    <w:p>
-      <w:pPr>
-        <w:pStyle w:val="ListBullet"/>
-        <w:spacing w:after="40"/>
-      </w:pPr>
-      <w:r>
-        <w:rPr>
-          <w:b/>
-        </w:rPr>
-        <w:t xml:space="preserve">Data type: </w:t>
-      </w:r>
-      <w:r>
-        <w:t>special-category (health) data. Even at enquiry, the "reason for enquiry" can reveal health information, so Article 9 applies from the first touchpoint.</w:t>
-      </w:r>
-    </w:p>
-    <w:p>
-      <w:pPr>
-        <w:pStyle w:val="ListBullet"/>
-        <w:spacing w:after="40"/>
-      </w:pPr>
-      <w:r>
-        <w:rPr>
-          <w:b/>
-        </w:rPr>
-        <w:t xml:space="preserve">Patients: </w:t>
-      </w:r>
-      <w:r>
-        <w:t>adults only (18+). No children’s data is processed.</w:t>
-      </w:r>
-    </w:p>
-    <w:p>
-      <w:pPr>
-        <w:pStyle w:val="ListBullet"/>
-        <w:spacing w:after="40"/>
-      </w:pPr>
-      <w:r>
-        <w:rPr>
-          <w:b/>
-        </w:rPr>
-        <w:t xml:space="preserve">Marketing: </w:t>
-      </w:r>
-      <w:r>
-        <w:t>email + newsletter (moving from MailChimp to GoHighLevel). WhatsApp is used for the shared inbox and appointment reminders (service), not marketing. Retargeting ads (Google/Facebook/Instagram) are referenced in the current website policy but not confirmed as in use.</w:t>
-      </w:r>
-    </w:p>
-    <w:p>
-      <w:pPr>
-        <w:pStyle w:val="ListBullet"/>
-        <w:spacing w:after="40"/>
-      </w:pPr>
-      <w:r>
-        <w:rPr>
-          <w:b/>
-        </w:rPr>
-        <w:t xml:space="preserve">Controller / processor: </w:t>
-      </w:r>
-      <w:r>
-        <w:t>the clinic is the data controller. Semble and GoHighLevel and others are processors acting on the clinic’s instructions.</w:t>
-      </w:r>
-    </w:p>
-    <w:p>
-      <w:pPr>
-        <w:spacing w:before="260" w:after="60"/>
-        <w:pBdr>
-          <w:bottom w:val="single" w:sz="6" w:space="2" w:color="C9D2DE"/>
-        </w:pBdr>
-      </w:pPr>
-      <w:r>
-        <w:rPr>
-          <w:b/>
-          <w:color w:val="142A28"/>
-          <w:sz w:val="27"/>
-        </w:rPr>
-        <w:t>1 · Why the enquiry wording reads as it does</w:t>
-      </w:r>
-    </w:p>
-    <w:p>
-      <w:pPr>
-        <w:spacing w:after="60" w:before="0"/>
-      </w:pPr>
-      <w:r>
-        <w:rPr>
-          <w:b w:val="0"/>
-          <w:i/>
-          <w:color w:val="55605F"/>
+          <w:color w:val="0B534E"/>
           <w:sz w:val="21"/>
         </w:rPr>
-        <w:t>The enquiry form collects: name, surname, email, phone, sex at birth, reason for enquiry (drop-down), referral source. Because the reason can reveal health information, we capture explicit consent to handle it, then keep marketing separate and optional.</w:t>
-      </w:r>
-    </w:p>
-    <w:tbl>
-      <w:tblPr>
-        <w:tblStyle w:val="TableGrid"/>
-        <w:tblW w:type="auto" w:w="0"/>
-        <w:tblLook w:firstColumn="1" w:firstRow="1" w:lastColumn="0" w:lastRow="0" w:noHBand="0" w:noVBand="1" w:val="04A0"/>
-      </w:tblPr>
-      <w:tblGrid>
-        <w:gridCol w:w="9792"/>
-      </w:tblGrid>
-      <w:tr>
-        <w:tc>
-          <w:tcPr>
-            <w:tcW w:type="dxa" w:w="9792"/>
-            <w:shd w:val="clear" w:fill="F4F6F5"/>
-          </w:tcPr>
-          <w:p>
-            <w:pPr>
-              <w:spacing w:after="20"/>
-            </w:pPr>
-            <w:r>
-              <w:rPr>
-                <w:b/>
-                <w:i w:val="0"/>
-                <w:sz w:val="20"/>
-              </w:rPr>
-              <w:t>The full version of the required consent</w:t>
-            </w:r>
-          </w:p>
-          <w:p>
-            <w:pPr>
-              <w:spacing w:after="20"/>
-            </w:pPr>
-            <w:r>
-              <w:rPr>
-                <w:sz w:val="20"/>
-              </w:rPr>
-              <w:t>We use the information you provide to respond to your enquiry and guide you through the next steps. Because your enquiry may include information about your health, we ask for your explicit consent to handle it for this purpose.</w:t>
-            </w:r>
-          </w:p>
-          <w:p>
-            <w:pPr>
-              <w:spacing w:after="20"/>
-            </w:pPr>
-            <w:r>
-              <w:rPr>
-                <w:b/>
-                <w:i w:val="0"/>
-                <w:sz w:val="20"/>
-              </w:rPr>
-              <w:t>☐  I consent to The Schoeman Clinic using the information in this enquiry, including any health-related details, to respond and help me take the next steps.</w:t>
-            </w:r>
-          </w:p>
-          <w:p>
-            <w:pPr>
-              <w:spacing w:after="20"/>
-            </w:pPr>
-            <w:r>
-              <w:rPr>
-                <w:b w:val="0"/>
-                <w:i/>
-                <w:color w:val="55605F"/>
-                <w:sz w:val="20"/>
-              </w:rPr>
-              <w:t>Unticked by default. On the form this is shortened to the single line in Part A; this longer version is the reasoning for the adviser.</w:t>
-            </w:r>
-          </w:p>
-        </w:tc>
-      </w:tr>
-    </w:tbl>
-    <w:p>
-      <w:pPr>
-        <w:spacing w:after="80" w:before="0"/>
-      </w:pPr>
-    </w:p>
-    <w:p>
-      <w:pPr>
-        <w:spacing w:before="260" w:after="60"/>
-        <w:pBdr>
-          <w:bottom w:val="single" w:sz="6" w:space="2" w:color="C9D2DE"/>
-        </w:pBdr>
-      </w:pPr>
-      <w:r>
-        <w:rPr>
-          <w:b/>
-          <w:color w:val="142A28"/>
-          <w:sz w:val="27"/>
-        </w:rPr>
-        <w:t>2 · Why the registration wording changes</w:t>
-      </w:r>
-    </w:p>
-    <w:p>
-      <w:pPr>
-        <w:spacing w:after="60" w:before="0"/>
-      </w:pPr>
-      <w:r>
-        <w:rPr>
-          <w:b w:val="0"/>
-          <w:i/>
-          <w:color w:val="55605F"/>
-          <w:sz w:val="21"/>
-        </w:rPr>
-        <w:t>The registration form collects full medical history and identity. For a patient receiving care the basis shifts from consent to contract plus provision of health care, so the wording changes accordingly.</w:t>
-      </w:r>
-    </w:p>
-    <w:tbl>
-      <w:tblPr>
-        <w:tblStyle w:val="TableGrid"/>
-        <w:tblW w:type="auto" w:w="0"/>
-        <w:tblLook w:firstColumn="1" w:firstRow="1" w:lastColumn="0" w:lastRow="0" w:noHBand="0" w:noVBand="1" w:val="04A0"/>
-      </w:tblPr>
-      <w:tblGrid>
-        <w:gridCol w:w="9792"/>
-      </w:tblGrid>
-      <w:tr>
-        <w:tc>
-          <w:tcPr>
-            <w:tcW w:type="dxa" w:w="9792"/>
-            <w:shd w:val="clear" w:fill="F4F6F5"/>
-          </w:tcPr>
-          <w:p>
-            <w:pPr>
-              <w:spacing w:after="20"/>
-            </w:pPr>
-            <w:r>
-              <w:rPr>
-                <w:b/>
-                <w:i w:val="0"/>
-                <w:sz w:val="20"/>
-              </w:rPr>
-              <w:t>The basis for a patient in care</w:t>
-            </w:r>
-          </w:p>
-          <w:p>
-            <w:pPr>
-              <w:spacing w:after="20"/>
-            </w:pPr>
-            <w:r>
-              <w:rPr>
-                <w:sz w:val="20"/>
-              </w:rPr>
-              <w:t>We use the information on this form to provide your healthcare, keep your medical records, arrange tests and prescriptions, and manage your appointments and billing. We handle your health information under UK GDPR Article 9(2)(h) (provision of health care) and the Data Protection Act 2018.</w:t>
-            </w:r>
-          </w:p>
-          <w:p>
-            <w:pPr>
-              <w:spacing w:after="20"/>
-            </w:pPr>
-            <w:r>
-              <w:rPr>
-                <w:b w:val="0"/>
-                <w:i/>
-                <w:color w:val="55605F"/>
-                <w:sz w:val="20"/>
-              </w:rPr>
-              <w:t>Note for build: replace every "EU GDPR" reference on the Semble registration and consent forms with "UK GDPR".</w:t>
-            </w:r>
-          </w:p>
-        </w:tc>
-      </w:tr>
-    </w:tbl>
-    <w:p>
-      <w:pPr>
-        <w:spacing w:after="80" w:before="0"/>
-      </w:pPr>
-    </w:p>
-    <w:p>
-      <w:pPr>
-        <w:spacing w:before="260" w:after="60"/>
-        <w:pBdr>
-          <w:bottom w:val="single" w:sz="6" w:space="2" w:color="C9D2DE"/>
-        </w:pBdr>
-      </w:pPr>
-      <w:r>
-        <w:rPr>
-          <w:b/>
-          <w:color w:val="142A28"/>
-          <w:sz w:val="27"/>
-        </w:rPr>
-        <w:t>3 · Marketing consent — how to capture it</w:t>
-      </w:r>
-    </w:p>
-    <w:p>
-      <w:pPr>
-        <w:pStyle w:val="ListBullet"/>
-        <w:spacing w:after="40"/>
-      </w:pPr>
-      <w:r>
-        <w:rPr>
-          <w:b/>
-          <w:color w:val="0E6E68"/>
-        </w:rPr>
-        <w:t xml:space="preserve">Design: </w:t>
-      </w:r>
-      <w:r>
-        <w:t>capture explicit, per-channel opt-in ONCE, cleanly, at the enquiry stage, using separate unticked boxes. Do not bundle "email and WhatsApp" into one tick, and do not pre-tick.</w:t>
-      </w:r>
-    </w:p>
-    <w:p>
-      <w:pPr>
-        <w:pStyle w:val="ListBullet"/>
-        <w:spacing w:after="40"/>
-      </w:pPr>
-      <w:r>
-        <w:rPr>
-          <w:b/>
-        </w:rPr>
-        <w:t xml:space="preserve">Separation: </w:t>
-      </w:r>
-      <w:r>
-        <w:t>keep marketing (newsletters, clinic updates) clearly separate from service messages (appointment reminders, results logistics). This keeps consent "specific".</w:t>
-      </w:r>
-    </w:p>
-    <w:p>
-      <w:pPr>
-        <w:pStyle w:val="ListBullet"/>
-        <w:spacing w:after="40"/>
-      </w:pPr>
-      <w:r>
-        <w:rPr>
-          <w:b/>
-        </w:rPr>
-        <w:t xml:space="preserve">Email: </w:t>
-      </w:r>
-      <w:r>
-        <w:t>email marketing needs consent or a valid PECR soft opt-in; every send needs a working unsubscribe and a genuine sender identity. Newsletters moving from MailChimp to GoHighLevel must carry only contacts with a valid basis; do not assume the whole patient list is opted in.</w:t>
-      </w:r>
-    </w:p>
-    <w:p>
-      <w:pPr>
-        <w:pStyle w:val="ListBullet"/>
-        <w:spacing w:after="40"/>
-      </w:pPr>
-      <w:r>
-        <w:rPr>
-          <w:b/>
-        </w:rPr>
-        <w:t xml:space="preserve">WhatsApp: </w:t>
-      </w:r>
-      <w:r>
-        <w:t>treat any future WhatsApp marketing as needing its own explicit opt-in plus Meta-approved templates. For now WhatsApp stays service-only, which matches Dr Gina’s wish not to "bombard" patients.</w:t>
-      </w:r>
-    </w:p>
-    <w:p>
-      <w:pPr>
-        <w:pStyle w:val="ListBullet"/>
-        <w:spacing w:after="40"/>
-      </w:pPr>
-      <w:r>
-        <w:rPr>
-          <w:b/>
-          <w:color w:val="A33A2C"/>
-        </w:rPr>
-        <w:t xml:space="preserve">Record + fix: </w:t>
-      </w:r>
-      <w:r>
-        <w:t>record what each person consented to, when, how, and which version of the notice they saw. Important: Semble currently auto-marks SMS/email consent on registration; that is not valid consent and should be replaced with a genuine opt-in captured as above.</w:t>
-      </w:r>
-    </w:p>
-    <w:p>
-      <w:pPr>
-        <w:spacing w:before="260" w:after="60"/>
-        <w:pBdr>
-          <w:bottom w:val="single" w:sz="6" w:space="2" w:color="C9D2DE"/>
-        </w:pBdr>
-      </w:pPr>
-      <w:r>
-        <w:rPr>
-          <w:b/>
-          <w:color w:val="142A28"/>
-          <w:sz w:val="27"/>
-        </w:rPr>
-        <w:t>4 · Lawful-basis table</w:t>
-      </w:r>
-    </w:p>
-    <w:tbl>
-      <w:tblPr>
-        <w:tblStyle w:val="TableGrid"/>
-        <w:tblW w:type="auto" w:w="0"/>
-        <w:tblLook w:firstColumn="1" w:firstRow="1" w:lastColumn="0" w:lastRow="0" w:noHBand="0" w:noVBand="1" w:val="04A0"/>
-      </w:tblPr>
-      <w:tblGrid>
-        <w:gridCol w:w="3264"/>
-        <w:gridCol w:w="3264"/>
-        <w:gridCol w:w="3264"/>
-      </w:tblGrid>
-      <w:tr>
-        <w:tc>
-          <w:tcPr>
-            <w:tcW w:type="dxa" w:w="3600"/>
-            <w:shd w:val="clear" w:fill="142A28"/>
-          </w:tcPr>
-          <w:p>
-            <w:r>
-              <w:rPr>
-                <w:b/>
-                <w:color w:val="FFFFFF"/>
-                <w:sz w:val="18"/>
-              </w:rPr>
-              <w:t>Activity</w:t>
-            </w:r>
-          </w:p>
-        </w:tc>
-        <w:tc>
-          <w:tcPr>
-            <w:tcW w:type="dxa" w:w="3168"/>
-            <w:shd w:val="clear" w:fill="142A28"/>
-          </w:tcPr>
-          <w:p>
-            <w:r>
-              <w:rPr>
-                <w:b/>
-                <w:color w:val="FFFFFF"/>
-                <w:sz w:val="18"/>
-              </w:rPr>
-              <w:t>Lawful basis (Art 6)</w:t>
-            </w:r>
-          </w:p>
-        </w:tc>
-        <w:tc>
-          <w:tcPr>
-            <w:tcW w:type="dxa" w:w="2592"/>
-            <w:shd w:val="clear" w:fill="142A28"/>
-          </w:tcPr>
-          <w:p>
-            <w:r>
-              <w:rPr>
-                <w:b/>
-                <w:color w:val="FFFFFF"/>
-                <w:sz w:val="18"/>
-              </w:rPr>
-              <w:t>Health-data basis (Art 9)</w:t>
-            </w:r>
-          </w:p>
-        </w:tc>
-      </w:tr>
-      <w:tr>
-        <w:tc>
-          <w:tcPr>
-            <w:tcW w:type="dxa" w:w="3600"/>
-          </w:tcPr>
-          <w:p>
-            <w:pPr>
-              <w:spacing w:after="20"/>
-            </w:pPr>
-            <w:r>
-              <w:rPr>
-                <w:sz w:val="18"/>
-              </w:rPr>
-              <w:t>Responding to an enquiry (incl. health reason)</w:t>
-            </w:r>
-          </w:p>
-        </w:tc>
-        <w:tc>
-          <w:tcPr>
-            <w:tcW w:type="dxa" w:w="3168"/>
-          </w:tcPr>
-          <w:p>
-            <w:pPr>
-              <w:spacing w:after="20"/>
-            </w:pPr>
-            <w:r>
-              <w:rPr>
-                <w:sz w:val="18"/>
-              </w:rPr>
-              <w:t>Consent — Art 6(1)(a)</w:t>
-            </w:r>
-          </w:p>
-        </w:tc>
-        <w:tc>
-          <w:tcPr>
-            <w:tcW w:type="dxa" w:w="2592"/>
-          </w:tcPr>
-          <w:p>
-            <w:pPr>
-              <w:spacing w:after="20"/>
-            </w:pPr>
-            <w:r>
-              <w:rPr>
-                <w:sz w:val="18"/>
-              </w:rPr>
-              <w:t>Explicit consent — Art 9(2)(a)</w:t>
-            </w:r>
-          </w:p>
-        </w:tc>
-      </w:tr>
-      <w:tr>
-        <w:tc>
-          <w:tcPr>
-            <w:tcW w:type="dxa" w:w="3600"/>
-          </w:tcPr>
-          <w:p>
-            <w:pPr>
-              <w:spacing w:after="20"/>
-            </w:pPr>
-            <w:r>
-              <w:rPr>
-                <w:sz w:val="18"/>
-              </w:rPr>
-              <w:t>Providing healthcare (records, tests, prescriptions)</w:t>
-            </w:r>
-          </w:p>
-        </w:tc>
-        <w:tc>
-          <w:tcPr>
-            <w:tcW w:type="dxa" w:w="3168"/>
-          </w:tcPr>
-          <w:p>
-            <w:pPr>
-              <w:spacing w:after="20"/>
-            </w:pPr>
-            <w:r>
-              <w:rPr>
-                <w:sz w:val="18"/>
-              </w:rPr>
-              <w:t>Contract — Art 6(1)(b)</w:t>
-            </w:r>
-          </w:p>
-        </w:tc>
-        <w:tc>
-          <w:tcPr>
-            <w:tcW w:type="dxa" w:w="2592"/>
-          </w:tcPr>
-          <w:p>
-            <w:pPr>
-              <w:spacing w:after="20"/>
-            </w:pPr>
-            <w:r>
-              <w:rPr>
-                <w:sz w:val="18"/>
-              </w:rPr>
-              <w:t>Provision of health care — Art 9(2)(h)</w:t>
-            </w:r>
-          </w:p>
-        </w:tc>
-      </w:tr>
-      <w:tr>
-        <w:tc>
-          <w:tcPr>
-            <w:tcW w:type="dxa" w:w="3600"/>
-          </w:tcPr>
-          <w:p>
-            <w:pPr>
-              <w:spacing w:after="20"/>
-            </w:pPr>
-            <w:r>
-              <w:rPr>
-                <w:sz w:val="18"/>
-              </w:rPr>
-              <w:t>Appointment reminders / service messages</w:t>
-            </w:r>
-          </w:p>
-        </w:tc>
-        <w:tc>
-          <w:tcPr>
-            <w:tcW w:type="dxa" w:w="3168"/>
-          </w:tcPr>
-          <w:p>
-            <w:pPr>
-              <w:spacing w:after="20"/>
-            </w:pPr>
-            <w:r>
-              <w:rPr>
-                <w:sz w:val="18"/>
-              </w:rPr>
-              <w:t>Contract / legitimate interests</w:t>
-            </w:r>
-          </w:p>
-        </w:tc>
-        <w:tc>
-          <w:tcPr>
-            <w:tcW w:type="dxa" w:w="2592"/>
-          </w:tcPr>
-          <w:p>
-            <w:pPr>
-              <w:spacing w:after="20"/>
-            </w:pPr>
-            <w:r>
-              <w:rPr>
-                <w:sz w:val="18"/>
-              </w:rPr>
-              <w:t>n/a</w:t>
-            </w:r>
-          </w:p>
-        </w:tc>
-      </w:tr>
-      <w:tr>
-        <w:tc>
-          <w:tcPr>
-            <w:tcW w:type="dxa" w:w="3600"/>
-          </w:tcPr>
-          <w:p>
-            <w:pPr>
-              <w:spacing w:after="20"/>
-            </w:pPr>
-            <w:r>
-              <w:rPr>
-                <w:sz w:val="18"/>
-              </w:rPr>
-              <w:t>Email newsletter / clinic marketing</w:t>
-            </w:r>
-          </w:p>
-        </w:tc>
-        <w:tc>
-          <w:tcPr>
-            <w:tcW w:type="dxa" w:w="3168"/>
-          </w:tcPr>
-          <w:p>
-            <w:pPr>
-              <w:spacing w:after="20"/>
-            </w:pPr>
-            <w:r>
-              <w:rPr>
-                <w:sz w:val="18"/>
-              </w:rPr>
-              <w:t>Consent — Art 6(1)(a) + PECR</w:t>
-            </w:r>
-          </w:p>
-        </w:tc>
-        <w:tc>
-          <w:tcPr>
-            <w:tcW w:type="dxa" w:w="2592"/>
-          </w:tcPr>
-          <w:p>
-            <w:pPr>
-              <w:spacing w:after="20"/>
-            </w:pPr>
-            <w:r>
-              <w:rPr>
-                <w:sz w:val="18"/>
-              </w:rPr>
-              <w:t>n/a</w:t>
-            </w:r>
-          </w:p>
-        </w:tc>
-      </w:tr>
-      <w:tr>
-        <w:tc>
-          <w:tcPr>
-            <w:tcW w:type="dxa" w:w="3600"/>
-          </w:tcPr>
-          <w:p>
-            <w:pPr>
-              <w:spacing w:after="20"/>
-            </w:pPr>
-            <w:r>
-              <w:rPr>
-                <w:sz w:val="18"/>
-              </w:rPr>
-              <w:t>Payment processing</w:t>
-            </w:r>
-          </w:p>
-        </w:tc>
-        <w:tc>
-          <w:tcPr>
-            <w:tcW w:type="dxa" w:w="3168"/>
-          </w:tcPr>
-          <w:p>
-            <w:pPr>
-              <w:spacing w:after="20"/>
-            </w:pPr>
-            <w:r>
-              <w:rPr>
-                <w:sz w:val="18"/>
-              </w:rPr>
-              <w:t>Contract — Art 6(1)(b)</w:t>
-            </w:r>
-          </w:p>
-        </w:tc>
-        <w:tc>
-          <w:tcPr>
-            <w:tcW w:type="dxa" w:w="2592"/>
-          </w:tcPr>
-          <w:p>
-            <w:pPr>
-              <w:spacing w:after="20"/>
-            </w:pPr>
-            <w:r>
-              <w:rPr>
-                <w:sz w:val="18"/>
-              </w:rPr>
-              <w:t>n/a</w:t>
-            </w:r>
-          </w:p>
-        </w:tc>
-      </w:tr>
-      <w:tr>
-        <w:tc>
-          <w:tcPr>
-            <w:tcW w:type="dxa" w:w="3600"/>
-          </w:tcPr>
-          <w:p>
-            <w:pPr>
-              <w:spacing w:after="20"/>
-            </w:pPr>
-            <w:r>
-              <w:rPr>
-                <w:sz w:val="18"/>
-              </w:rPr>
-              <w:t>Website analytics &amp; cookies</w:t>
-            </w:r>
-          </w:p>
-        </w:tc>
-        <w:tc>
-          <w:tcPr>
-            <w:tcW w:type="dxa" w:w="3168"/>
-          </w:tcPr>
-          <w:p>
-            <w:pPr>
-              <w:spacing w:after="20"/>
-            </w:pPr>
-            <w:r>
-              <w:rPr>
-                <w:sz w:val="18"/>
-              </w:rPr>
-              <w:t>Consent — PECR (cookie banner)</w:t>
-            </w:r>
-          </w:p>
-        </w:tc>
-        <w:tc>
-          <w:tcPr>
-            <w:tcW w:type="dxa" w:w="2592"/>
-          </w:tcPr>
-          <w:p>
-            <w:pPr>
-              <w:spacing w:after="20"/>
-            </w:pPr>
-            <w:r>
-              <w:rPr>
-                <w:sz w:val="18"/>
-              </w:rPr>
-              <w:t>n/a</w:t>
-            </w:r>
-          </w:p>
-        </w:tc>
-      </w:tr>
-    </w:tbl>
-    <w:p>
-      <w:pPr>
-        <w:spacing w:after="60" w:before="0"/>
-      </w:pPr>
-    </w:p>
-    <w:p>
-      <w:pPr>
-        <w:spacing w:before="260" w:after="60"/>
-        <w:pBdr>
-          <w:bottom w:val="single" w:sz="6" w:space="2" w:color="C9D2DE"/>
-        </w:pBdr>
-      </w:pPr>
-      <w:r>
-        <w:rPr>
-          <w:b/>
-          <w:color w:val="142A28"/>
-          <w:sz w:val="27"/>
-        </w:rPr>
-        <w:t>5 · Retention — how long information is kept</w:t>
-      </w:r>
-    </w:p>
-    <w:tbl>
-      <w:tblPr>
-        <w:tblStyle w:val="TableGrid"/>
-        <w:tblW w:type="auto" w:w="0"/>
-        <w:tblLook w:firstColumn="1" w:firstRow="1" w:lastColumn="0" w:lastRow="0" w:noHBand="0" w:noVBand="1" w:val="04A0"/>
-      </w:tblPr>
-      <w:tblGrid>
-        <w:gridCol w:w="3264"/>
-        <w:gridCol w:w="3264"/>
-        <w:gridCol w:w="3264"/>
-      </w:tblGrid>
-      <w:tr>
-        <w:tc>
-          <w:tcPr>
-            <w:tcW w:type="dxa" w:w="3312"/>
-            <w:shd w:val="clear" w:fill="142A28"/>
-          </w:tcPr>
-          <w:p>
-            <w:r>
-              <w:rPr>
-                <w:b/>
-                <w:color w:val="FFFFFF"/>
-                <w:sz w:val="18"/>
-              </w:rPr>
-              <w:t>Information type</w:t>
-            </w:r>
-          </w:p>
-        </w:tc>
-        <w:tc>
-          <w:tcPr>
-            <w:tcW w:type="dxa" w:w="3024"/>
-            <w:shd w:val="clear" w:fill="142A28"/>
-          </w:tcPr>
-          <w:p>
-            <w:r>
-              <w:rPr>
-                <w:b/>
-                <w:color w:val="FFFFFF"/>
-                <w:sz w:val="18"/>
-              </w:rPr>
-              <w:t>Suggested retention</w:t>
-            </w:r>
-          </w:p>
-        </w:tc>
-        <w:tc>
-          <w:tcPr>
-            <w:tcW w:type="dxa" w:w="3024"/>
-            <w:shd w:val="clear" w:fill="142A28"/>
-          </w:tcPr>
-          <w:p>
-            <w:r>
-              <w:rPr>
-                <w:b/>
-                <w:color w:val="FFFFFF"/>
-                <w:sz w:val="18"/>
-              </w:rPr>
-              <w:t>Note</w:t>
-            </w:r>
-          </w:p>
-        </w:tc>
-      </w:tr>
-      <w:tr>
-        <w:tc>
-          <w:tcPr>
-            <w:tcW w:type="dxa" w:w="3312"/>
-          </w:tcPr>
-          <w:p>
-            <w:pPr>
-              <w:spacing w:after="20"/>
-            </w:pPr>
-            <w:r>
-              <w:rPr>
-                <w:sz w:val="18"/>
-              </w:rPr>
-              <w:t>Patient clinical records (held in Semble)</w:t>
-            </w:r>
-          </w:p>
-        </w:tc>
-        <w:tc>
-          <w:tcPr>
-            <w:tcW w:type="dxa" w:w="3024"/>
-          </w:tcPr>
-          <w:p>
-            <w:pPr>
-              <w:spacing w:after="20"/>
-            </w:pPr>
-            <w:r>
-              <w:rPr>
-                <w:sz w:val="18"/>
-              </w:rPr>
-              <w:t>~8 years after last treatment (adults)</w:t>
-            </w:r>
-          </w:p>
-        </w:tc>
-        <w:tc>
-          <w:tcPr>
-            <w:tcW w:type="dxa" w:w="3024"/>
-          </w:tcPr>
-          <w:p>
-            <w:pPr>
-              <w:spacing w:after="20"/>
-            </w:pPr>
-            <w:r>
-              <w:rPr>
-                <w:sz w:val="18"/>
-              </w:rPr>
-              <w:t>Align to the clinic’s clinical records policy; confirm.</w:t>
-            </w:r>
-          </w:p>
-        </w:tc>
-      </w:tr>
-      <w:tr>
-        <w:tc>
-          <w:tcPr>
-            <w:tcW w:type="dxa" w:w="3312"/>
-          </w:tcPr>
-          <w:p>
-            <w:pPr>
-              <w:spacing w:after="20"/>
-            </w:pPr>
-            <w:r>
-              <w:rPr>
-                <w:sz w:val="18"/>
-              </w:rPr>
-              <w:t>Enquiries that do not become patients</w:t>
-            </w:r>
-          </w:p>
-        </w:tc>
-        <w:tc>
-          <w:tcPr>
-            <w:tcW w:type="dxa" w:w="3024"/>
-          </w:tcPr>
-          <w:p>
-            <w:pPr>
-              <w:spacing w:after="20"/>
-            </w:pPr>
-            <w:r>
-              <w:rPr>
-                <w:sz w:val="18"/>
-              </w:rPr>
-              <w:t>6–12 months, then delete or anonymise</w:t>
-            </w:r>
-          </w:p>
-        </w:tc>
-        <w:tc>
-          <w:tcPr>
-            <w:tcW w:type="dxa" w:w="3024"/>
-          </w:tcPr>
-          <w:p>
-            <w:pPr>
-              <w:spacing w:after="20"/>
-            </w:pPr>
-            <w:r>
-              <w:rPr>
-                <w:sz w:val="18"/>
-              </w:rPr>
-              <w:t>Unless they have opted into marketing.</w:t>
-            </w:r>
-          </w:p>
-        </w:tc>
-      </w:tr>
-      <w:tr>
-        <w:tc>
-          <w:tcPr>
-            <w:tcW w:type="dxa" w:w="3312"/>
-          </w:tcPr>
-          <w:p>
-            <w:pPr>
-              <w:spacing w:after="20"/>
-            </w:pPr>
-            <w:r>
-              <w:rPr>
-                <w:sz w:val="18"/>
-              </w:rPr>
-              <w:t>Operational / CRM records (GoHighLevel)</w:t>
-            </w:r>
-          </w:p>
-        </w:tc>
-        <w:tc>
-          <w:tcPr>
-            <w:tcW w:type="dxa" w:w="3024"/>
-          </w:tcPr>
-          <w:p>
-            <w:pPr>
-              <w:spacing w:after="20"/>
-            </w:pPr>
-            <w:r>
-              <w:rPr>
-                <w:sz w:val="18"/>
-              </w:rPr>
-              <w:t>Match the record they relate to</w:t>
-            </w:r>
-          </w:p>
-        </w:tc>
-        <w:tc>
-          <w:tcPr>
-            <w:tcW w:type="dxa" w:w="3024"/>
-          </w:tcPr>
-          <w:p>
-            <w:pPr>
-              <w:spacing w:after="20"/>
-            </w:pPr>
-            <w:r>
-              <w:rPr>
-                <w:sz w:val="18"/>
-              </w:rPr>
-              <w:t>Review annually; do not keep messages indefinitely.</w:t>
-            </w:r>
-          </w:p>
-        </w:tc>
-      </w:tr>
-      <w:tr>
-        <w:tc>
-          <w:tcPr>
-            <w:tcW w:type="dxa" w:w="3312"/>
-          </w:tcPr>
-          <w:p>
-            <w:pPr>
-              <w:spacing w:after="20"/>
-            </w:pPr>
-            <w:r>
-              <w:rPr>
-                <w:sz w:val="18"/>
-              </w:rPr>
-              <w:t>Marketing contacts &amp; consent records</w:t>
-            </w:r>
-          </w:p>
-        </w:tc>
-        <w:tc>
-          <w:tcPr>
-            <w:tcW w:type="dxa" w:w="3024"/>
-          </w:tcPr>
-          <w:p>
-            <w:pPr>
-              <w:spacing w:after="20"/>
-            </w:pPr>
-            <w:r>
-              <w:rPr>
-                <w:sz w:val="18"/>
-              </w:rPr>
-              <w:t>Until withdrawn; refresh if inactive ~24 months</w:t>
-            </w:r>
-          </w:p>
-        </w:tc>
-        <w:tc>
-          <w:tcPr>
-            <w:tcW w:type="dxa" w:w="3024"/>
-          </w:tcPr>
-          <w:p>
-            <w:pPr>
-              <w:spacing w:after="20"/>
-            </w:pPr>
-            <w:r>
-              <w:rPr>
-                <w:sz w:val="18"/>
-              </w:rPr>
-              <w:t>Keep the consent audit trail even after removal.</w:t>
-            </w:r>
-          </w:p>
-        </w:tc>
-      </w:tr>
-      <w:tr>
-        <w:tc>
-          <w:tcPr>
-            <w:tcW w:type="dxa" w:w="3312"/>
-          </w:tcPr>
-          <w:p>
-            <w:pPr>
-              <w:spacing w:after="20"/>
-            </w:pPr>
-            <w:r>
-              <w:rPr>
-                <w:sz w:val="18"/>
-              </w:rPr>
-              <w:t>Billing &amp; financial records</w:t>
-            </w:r>
-          </w:p>
-        </w:tc>
-        <w:tc>
-          <w:tcPr>
-            <w:tcW w:type="dxa" w:w="3024"/>
-          </w:tcPr>
-          <w:p>
-            <w:pPr>
-              <w:spacing w:after="20"/>
-            </w:pPr>
-            <w:r>
-              <w:rPr>
-                <w:sz w:val="18"/>
-              </w:rPr>
-              <w:t>~6 years</w:t>
-            </w:r>
-          </w:p>
-        </w:tc>
-        <w:tc>
-          <w:tcPr>
-            <w:tcW w:type="dxa" w:w="3024"/>
-          </w:tcPr>
-          <w:p>
-            <w:pPr>
-              <w:spacing w:after="20"/>
-            </w:pPr>
-            <w:r>
-              <w:rPr>
-                <w:sz w:val="18"/>
-              </w:rPr>
-              <w:t>HMRC / accounting requirement.</w:t>
-            </w:r>
-          </w:p>
-        </w:tc>
-      </w:tr>
-    </w:tbl>
-    <w:p>
-      <w:pPr>
-        <w:spacing w:after="60" w:before="0"/>
-      </w:pPr>
-    </w:p>
-    <w:p>
-      <w:pPr>
-        <w:spacing w:after="120" w:before="0"/>
-      </w:pPr>
-      <w:r>
-        <w:rPr>
-          <w:b w:val="0"/>
-          <w:i/>
-          <w:color w:val="55605F"/>
-          <w:sz w:val="17"/>
-        </w:rPr>
-        <w:t>Periods are the clinic’s decision; these are common private-healthcare benchmarks for the adviser to confirm and document.</w:t>
-      </w:r>
-    </w:p>
-    <w:p>
-      <w:pPr>
-        <w:spacing w:before="260" w:after="60"/>
-        <w:pBdr>
-          <w:bottom w:val="single" w:sz="6" w:space="2" w:color="C9D2DE"/>
-        </w:pBdr>
-      </w:pPr>
-      <w:r>
-        <w:rPr>
-          <w:b/>
-          <w:color w:val="142A28"/>
-          <w:sz w:val="27"/>
-        </w:rPr>
-        <w:t>6 · Patients’ rights over their information</w:t>
-      </w:r>
-    </w:p>
-    <w:p>
-      <w:pPr>
-        <w:spacing w:after="40" w:before="0"/>
-      </w:pPr>
-      <w:r>
-        <w:rPr>
-          <w:b w:val="0"/>
-          <w:i w:val="0"/>
-          <w:sz w:val="21"/>
-        </w:rPr>
-        <w:t>Patients can exercise the following rights, and the clinic responds within one calendar month (UK GDPR):</w:t>
-      </w:r>
-    </w:p>
-    <w:p>
-      <w:pPr>
-        <w:pStyle w:val="ListBullet"/>
-        <w:spacing w:after="40"/>
-      </w:pPr>
-      <w:r>
-        <w:rPr>
-          <w:b/>
-        </w:rPr>
-        <w:t xml:space="preserve">Access: </w:t>
-      </w:r>
-      <w:r>
-        <w:t>a copy of their information (subject access request), correct it, and ask for erasure.</w:t>
-      </w:r>
-    </w:p>
-    <w:p>
-      <w:pPr>
-        <w:pStyle w:val="ListBullet"/>
-        <w:spacing w:after="40"/>
-      </w:pPr>
-      <w:r>
-        <w:rPr>
-          <w:b/>
-        </w:rPr>
-        <w:t xml:space="preserve">Restrict: </w:t>
-      </w:r>
-      <w:r>
-        <w:t>or object to certain processing, and request portability of data they provided.</w:t>
-      </w:r>
-    </w:p>
-    <w:p>
-      <w:pPr>
-        <w:pStyle w:val="ListBullet"/>
-        <w:spacing w:after="40"/>
-      </w:pPr>
-      <w:r>
-        <w:rPr>
-          <w:b/>
-        </w:rPr>
-        <w:t xml:space="preserve">Withdraw consent: </w:t>
-      </w:r>
-      <w:r>
-        <w:t>at any time, as easily as it was given. Withdrawing marketing consent never affects a patient’s care.</w:t>
-      </w:r>
-    </w:p>
-    <w:p>
-      <w:pPr>
-        <w:spacing w:after="120" w:before="0"/>
-      </w:pPr>
-      <w:r>
-        <w:rPr>
-          <w:b w:val="0"/>
-          <w:i/>
-          <w:color w:val="55605F"/>
-          <w:sz w:val="17"/>
-        </w:rPr>
-        <w:t>Erasure is limited where records must be kept for clinical or legal retention. Name a clear route (a contact and email) for these requests in the privacy notice.</w:t>
-      </w:r>
-    </w:p>
-    <w:p>
-      <w:pPr>
-        <w:spacing w:before="260" w:after="60"/>
-        <w:pBdr>
-          <w:bottom w:val="single" w:sz="6" w:space="2" w:color="C9D2DE"/>
-        </w:pBdr>
-      </w:pPr>
-      <w:r>
-        <w:rPr>
-          <w:b/>
-          <w:color w:val="142A28"/>
-          <w:sz w:val="27"/>
-        </w:rPr>
-        <w:t>7 · Sub-processor register (updated)</w:t>
-      </w:r>
-    </w:p>
-    <w:tbl>
-      <w:tblPr>
-        <w:tblStyle w:val="TableGrid"/>
-        <w:tblW w:type="auto" w:w="0"/>
-        <w:tblLook w:firstColumn="1" w:firstRow="1" w:lastColumn="0" w:lastRow="0" w:noHBand="0" w:noVBand="1" w:val="04A0"/>
-      </w:tblPr>
-      <w:tblGrid>
-        <w:gridCol w:w="2448"/>
-        <w:gridCol w:w="2448"/>
-        <w:gridCol w:w="2448"/>
-        <w:gridCol w:w="2448"/>
-      </w:tblGrid>
-      <w:tr>
-        <w:tc>
-          <w:tcPr>
-            <w:tcW w:type="dxa" w:w="3024"/>
-            <w:shd w:val="clear" w:fill="142A28"/>
-          </w:tcPr>
-          <w:p>
-            <w:r>
-              <w:rPr>
-                <w:b/>
-                <w:color w:val="FFFFFF"/>
-                <w:sz w:val="18"/>
-              </w:rPr>
-              <w:t>Provider</w:t>
-            </w:r>
-          </w:p>
-        </w:tc>
-        <w:tc>
-          <w:tcPr>
-            <w:tcW w:type="dxa" w:w="2880"/>
-            <w:shd w:val="clear" w:fill="142A28"/>
-          </w:tcPr>
-          <w:p>
-            <w:r>
-              <w:rPr>
-                <w:b/>
-                <w:color w:val="FFFFFF"/>
-                <w:sz w:val="18"/>
-              </w:rPr>
-              <w:t>What data</w:t>
-            </w:r>
-          </w:p>
-        </w:tc>
-        <w:tc>
-          <w:tcPr>
-            <w:tcW w:type="dxa" w:w="1728"/>
-            <w:shd w:val="clear" w:fill="142A28"/>
-          </w:tcPr>
-          <w:p>
-            <w:r>
-              <w:rPr>
-                <w:b/>
-                <w:color w:val="FFFFFF"/>
-                <w:sz w:val="18"/>
-              </w:rPr>
-              <w:t>Location</w:t>
-            </w:r>
-          </w:p>
-        </w:tc>
-        <w:tc>
-          <w:tcPr>
-            <w:tcW w:type="dxa" w:w="2160"/>
-            <w:shd w:val="clear" w:fill="142A28"/>
-          </w:tcPr>
-          <w:p>
-            <w:r>
-              <w:rPr>
-                <w:b/>
-                <w:color w:val="FFFFFF"/>
-                <w:sz w:val="18"/>
-              </w:rPr>
-              <w:t>Transfer mechanism</w:t>
-            </w:r>
-          </w:p>
-        </w:tc>
-      </w:tr>
-      <w:tr>
-        <w:tc>
-          <w:tcPr>
-            <w:tcW w:type="dxa" w:w="3024"/>
-          </w:tcPr>
-          <w:p>
-            <w:pPr>
-              <w:spacing w:after="20"/>
-            </w:pPr>
-            <w:r>
-              <w:rPr>
-                <w:sz w:val="18"/>
-              </w:rPr>
-              <w:t>Semble</w:t>
-            </w:r>
-          </w:p>
-        </w:tc>
-        <w:tc>
-          <w:tcPr>
-            <w:tcW w:type="dxa" w:w="2880"/>
-          </w:tcPr>
-          <w:p>
-            <w:pPr>
-              <w:spacing w:after="20"/>
-            </w:pPr>
-            <w:r>
-              <w:rPr>
-                <w:sz w:val="18"/>
-              </w:rPr>
-              <w:t>Clinical records, admin</w:t>
-            </w:r>
-          </w:p>
-        </w:tc>
-        <w:tc>
-          <w:tcPr>
-            <w:tcW w:type="dxa" w:w="1728"/>
-          </w:tcPr>
-          <w:p>
-            <w:pPr>
-              <w:spacing w:after="20"/>
-            </w:pPr>
-            <w:r>
-              <w:rPr>
-                <w:sz w:val="18"/>
-              </w:rPr>
-              <w:t>UK</w:t>
-            </w:r>
-          </w:p>
-        </w:tc>
-        <w:tc>
-          <w:tcPr>
-            <w:tcW w:type="dxa" w:w="2160"/>
-          </w:tcPr>
-          <w:p>
-            <w:pPr>
-              <w:spacing w:after="20"/>
-            </w:pPr>
-            <w:r>
-              <w:rPr>
-                <w:sz w:val="18"/>
-              </w:rPr>
-              <w:t>n/a</w:t>
-            </w:r>
-          </w:p>
-        </w:tc>
-      </w:tr>
-      <w:tr>
-        <w:tc>
-          <w:tcPr>
-            <w:tcW w:type="dxa" w:w="3024"/>
-          </w:tcPr>
-          <w:p>
-            <w:pPr>
-              <w:spacing w:after="20"/>
-            </w:pPr>
-            <w:r>
-              <w:rPr>
-                <w:sz w:val="18"/>
-              </w:rPr>
-              <w:t>GoHighLevel (HIPAA tier)</w:t>
-            </w:r>
-          </w:p>
-        </w:tc>
-        <w:tc>
-          <w:tcPr>
-            <w:tcW w:type="dxa" w:w="2880"/>
-          </w:tcPr>
-          <w:p>
-            <w:pPr>
-              <w:spacing w:after="20"/>
-            </w:pPr>
-            <w:r>
-              <w:rPr>
-                <w:sz w:val="18"/>
-              </w:rPr>
-              <w:t>Operational CRM, inbox, forms, comms</w:t>
-            </w:r>
-          </w:p>
-        </w:tc>
-        <w:tc>
-          <w:tcPr>
-            <w:tcW w:type="dxa" w:w="1728"/>
-          </w:tcPr>
-          <w:p>
-            <w:pPr>
-              <w:spacing w:after="20"/>
-            </w:pPr>
-            <w:r>
-              <w:rPr>
-                <w:sz w:val="18"/>
-              </w:rPr>
-              <w:t>US</w:t>
-            </w:r>
-          </w:p>
-        </w:tc>
-        <w:tc>
-          <w:tcPr>
-            <w:tcW w:type="dxa" w:w="2160"/>
-          </w:tcPr>
-          <w:p>
-            <w:pPr>
-              <w:spacing w:after="20"/>
-            </w:pPr>
-            <w:r>
-              <w:rPr>
-                <w:sz w:val="18"/>
-              </w:rPr>
-              <w:t>UK IDTA in DPA</w:t>
-            </w:r>
-          </w:p>
-        </w:tc>
-      </w:tr>
-      <w:tr>
-        <w:tc>
-          <w:tcPr>
-            <w:tcW w:type="dxa" w:w="3024"/>
-          </w:tcPr>
-          <w:p>
-            <w:pPr>
-              <w:spacing w:after="20"/>
-            </w:pPr>
-            <w:r>
-              <w:rPr>
-                <w:sz w:val="18"/>
-              </w:rPr>
-              <w:t>WhatsApp / Meta Cloud API</w:t>
-            </w:r>
-          </w:p>
-        </w:tc>
-        <w:tc>
-          <w:tcPr>
-            <w:tcW w:type="dxa" w:w="2880"/>
-          </w:tcPr>
-          <w:p>
-            <w:pPr>
-              <w:spacing w:after="20"/>
-            </w:pPr>
-            <w:r>
-              <w:rPr>
-                <w:sz w:val="18"/>
-              </w:rPr>
-              <w:t>Patient messages</w:t>
-            </w:r>
-          </w:p>
-        </w:tc>
-        <w:tc>
-          <w:tcPr>
-            <w:tcW w:type="dxa" w:w="1728"/>
-          </w:tcPr>
-          <w:p>
-            <w:pPr>
-              <w:spacing w:after="20"/>
-            </w:pPr>
-            <w:r>
-              <w:rPr>
-                <w:sz w:val="18"/>
-              </w:rPr>
-              <w:t>GB storage</w:t>
-            </w:r>
-          </w:p>
-        </w:tc>
-        <w:tc>
-          <w:tcPr>
-            <w:tcW w:type="dxa" w:w="2160"/>
-          </w:tcPr>
-          <w:p>
-            <w:pPr>
-              <w:spacing w:after="20"/>
-            </w:pPr>
-            <w:r>
-              <w:rPr>
-                <w:sz w:val="18"/>
-              </w:rPr>
-              <w:t>Meta DPA / adequacy</w:t>
-            </w:r>
-          </w:p>
-        </w:tc>
-      </w:tr>
-      <w:tr>
-        <w:tc>
-          <w:tcPr>
-            <w:tcW w:type="dxa" w:w="3024"/>
-          </w:tcPr>
-          <w:p>
-            <w:pPr>
-              <w:spacing w:after="20"/>
-            </w:pPr>
-            <w:r>
-              <w:rPr>
-                <w:sz w:val="18"/>
-              </w:rPr>
-              <w:t>Stripe</w:t>
-            </w:r>
-          </w:p>
-        </w:tc>
-        <w:tc>
-          <w:tcPr>
-            <w:tcW w:type="dxa" w:w="2880"/>
-          </w:tcPr>
-          <w:p>
-            <w:pPr>
-              <w:spacing w:after="20"/>
-            </w:pPr>
-            <w:r>
-              <w:rPr>
-                <w:sz w:val="18"/>
-              </w:rPr>
-              <w:t>Payment data</w:t>
-            </w:r>
-          </w:p>
-        </w:tc>
-        <w:tc>
-          <w:tcPr>
-            <w:tcW w:type="dxa" w:w="1728"/>
-          </w:tcPr>
-          <w:p>
-            <w:pPr>
-              <w:spacing w:after="20"/>
-            </w:pPr>
-            <w:r>
-              <w:rPr>
-                <w:sz w:val="18"/>
-              </w:rPr>
-              <w:t>UK / EU</w:t>
-            </w:r>
-          </w:p>
-        </w:tc>
-        <w:tc>
-          <w:tcPr>
-            <w:tcW w:type="dxa" w:w="2160"/>
-          </w:tcPr>
-          <w:p>
-            <w:pPr>
-              <w:spacing w:after="20"/>
-            </w:pPr>
-            <w:r>
-              <w:rPr>
-                <w:sz w:val="18"/>
-              </w:rPr>
-              <w:t>n/a / SCCs</w:t>
-            </w:r>
-          </w:p>
-        </w:tc>
-      </w:tr>
-      <w:tr>
-        <w:tc>
-          <w:tcPr>
-            <w:tcW w:type="dxa" w:w="3024"/>
-          </w:tcPr>
-          <w:p>
-            <w:pPr>
-              <w:spacing w:after="20"/>
-            </w:pPr>
-            <w:r>
-              <w:rPr>
-                <w:sz w:val="18"/>
-              </w:rPr>
-              <w:t>The Doctors Laboratory (TDL)</w:t>
-            </w:r>
-          </w:p>
-        </w:tc>
-        <w:tc>
-          <w:tcPr>
-            <w:tcW w:type="dxa" w:w="2880"/>
-          </w:tcPr>
-          <w:p>
-            <w:pPr>
-              <w:spacing w:after="20"/>
-            </w:pPr>
-            <w:r>
-              <w:rPr>
-                <w:sz w:val="18"/>
-              </w:rPr>
-              <w:t>Blood-test data</w:t>
-            </w:r>
-          </w:p>
-        </w:tc>
-        <w:tc>
-          <w:tcPr>
-            <w:tcW w:type="dxa" w:w="1728"/>
-          </w:tcPr>
-          <w:p>
-            <w:pPr>
-              <w:spacing w:after="20"/>
-            </w:pPr>
-            <w:r>
-              <w:rPr>
-                <w:sz w:val="18"/>
-              </w:rPr>
-              <w:t>UK</w:t>
-            </w:r>
-          </w:p>
-        </w:tc>
-        <w:tc>
-          <w:tcPr>
-            <w:tcW w:type="dxa" w:w="2160"/>
-          </w:tcPr>
-          <w:p>
-            <w:pPr>
-              <w:spacing w:after="20"/>
-            </w:pPr>
-            <w:r>
-              <w:rPr>
-                <w:sz w:val="18"/>
-              </w:rPr>
-              <w:t>n/a</w:t>
-            </w:r>
-          </w:p>
-        </w:tc>
-      </w:tr>
-      <w:tr>
-        <w:tc>
-          <w:tcPr>
-            <w:tcW w:type="dxa" w:w="3024"/>
-          </w:tcPr>
-          <w:p>
-            <w:pPr>
-              <w:spacing w:after="20"/>
-            </w:pPr>
-            <w:r>
-              <w:rPr>
-                <w:sz w:val="18"/>
-              </w:rPr>
-              <w:t>Pharmacies (PCCA, Fagron, Zen, Natural Dispensary, Nordic, Vibrant)</w:t>
-            </w:r>
-          </w:p>
-        </w:tc>
-        <w:tc>
-          <w:tcPr>
-            <w:tcW w:type="dxa" w:w="2880"/>
-          </w:tcPr>
-          <w:p>
-            <w:pPr>
-              <w:spacing w:after="20"/>
-            </w:pPr>
-            <w:r>
-              <w:rPr>
-                <w:sz w:val="18"/>
-              </w:rPr>
-              <w:t>Prescription / order data</w:t>
-            </w:r>
-          </w:p>
-        </w:tc>
-        <w:tc>
-          <w:tcPr>
-            <w:tcW w:type="dxa" w:w="1728"/>
-          </w:tcPr>
-          <w:p>
-            <w:pPr>
-              <w:spacing w:after="20"/>
-            </w:pPr>
-            <w:r>
-              <w:rPr>
-                <w:sz w:val="18"/>
-              </w:rPr>
-              <w:t>UK / US</w:t>
-            </w:r>
-          </w:p>
-        </w:tc>
-        <w:tc>
-          <w:tcPr>
-            <w:tcW w:type="dxa" w:w="2160"/>
-          </w:tcPr>
-          <w:p>
-            <w:pPr>
-              <w:spacing w:after="20"/>
-            </w:pPr>
-            <w:r>
-              <w:rPr>
-                <w:sz w:val="18"/>
-              </w:rPr>
-              <w:t>confirm per vendor</w:t>
-            </w:r>
-          </w:p>
-        </w:tc>
-      </w:tr>
-      <w:tr>
-        <w:tc>
-          <w:tcPr>
-            <w:tcW w:type="dxa" w:w="3024"/>
-          </w:tcPr>
-          <w:p>
-            <w:pPr>
-              <w:spacing w:after="20"/>
-            </w:pPr>
-            <w:r>
-              <w:rPr>
-                <w:sz w:val="18"/>
-              </w:rPr>
-              <w:t>Google Analytics / Maps</w:t>
-            </w:r>
-          </w:p>
-        </w:tc>
-        <w:tc>
-          <w:tcPr>
-            <w:tcW w:type="dxa" w:w="2880"/>
-          </w:tcPr>
-          <w:p>
-            <w:pPr>
-              <w:spacing w:after="20"/>
-            </w:pPr>
-            <w:r>
-              <w:rPr>
-                <w:sz w:val="18"/>
-              </w:rPr>
-              <w:t>Website usage</w:t>
-            </w:r>
-          </w:p>
-        </w:tc>
-        <w:tc>
-          <w:tcPr>
-            <w:tcW w:type="dxa" w:w="1728"/>
-          </w:tcPr>
-          <w:p>
-            <w:pPr>
-              <w:spacing w:after="20"/>
-            </w:pPr>
-            <w:r>
-              <w:rPr>
-                <w:sz w:val="18"/>
-              </w:rPr>
-              <w:t>US</w:t>
-            </w:r>
-          </w:p>
-        </w:tc>
-        <w:tc>
-          <w:tcPr>
-            <w:tcW w:type="dxa" w:w="2160"/>
-          </w:tcPr>
-          <w:p>
-            <w:pPr>
-              <w:spacing w:after="20"/>
-            </w:pPr>
-            <w:r>
-              <w:rPr>
-                <w:sz w:val="18"/>
-              </w:rPr>
-              <w:t>confirm (consent-gated)</w:t>
-            </w:r>
-          </w:p>
-        </w:tc>
-      </w:tr>
-      <w:tr>
-        <w:tc>
-          <w:tcPr>
-            <w:tcW w:type="dxa" w:w="3024"/>
-          </w:tcPr>
-          <w:p>
-            <w:pPr>
-              <w:spacing w:after="20"/>
-            </w:pPr>
-            <w:r>
-              <w:rPr>
-                <w:sz w:val="18"/>
-              </w:rPr>
-              <w:t>MailChimp (being retired → GHL)</w:t>
-            </w:r>
-          </w:p>
-        </w:tc>
-        <w:tc>
-          <w:tcPr>
-            <w:tcW w:type="dxa" w:w="2880"/>
-          </w:tcPr>
-          <w:p>
-            <w:pPr>
-              <w:spacing w:after="20"/>
-            </w:pPr>
-            <w:r>
-              <w:rPr>
-                <w:sz w:val="18"/>
-              </w:rPr>
-              <w:t>Newsletter emails</w:t>
-            </w:r>
-          </w:p>
-        </w:tc>
-        <w:tc>
-          <w:tcPr>
-            <w:tcW w:type="dxa" w:w="1728"/>
-          </w:tcPr>
-          <w:p>
-            <w:pPr>
-              <w:spacing w:after="20"/>
-            </w:pPr>
-            <w:r>
-              <w:rPr>
-                <w:sz w:val="18"/>
-              </w:rPr>
-              <w:t>US</w:t>
-            </w:r>
-          </w:p>
-        </w:tc>
-        <w:tc>
-          <w:tcPr>
-            <w:tcW w:type="dxa" w:w="2160"/>
-          </w:tcPr>
-          <w:p>
-            <w:pPr>
-              <w:spacing w:after="20"/>
-            </w:pPr>
-            <w:r>
-              <w:rPr>
-                <w:sz w:val="18"/>
-              </w:rPr>
-              <w:t>confirm / remove on migration</w:t>
-            </w:r>
-          </w:p>
-        </w:tc>
-      </w:tr>
-    </w:tbl>
-    <w:p>
-      <w:pPr>
-        <w:spacing w:after="60" w:before="0"/>
-      </w:pPr>
-    </w:p>
-    <w:p>
-      <w:pPr>
-        <w:spacing w:after="120"/>
-      </w:pPr>
-      <w:r>
-        <w:rPr>
-          <w:i/>
-          <w:color w:val="8A5A0C"/>
-          <w:sz w:val="18"/>
-        </w:rPr>
-        <w:t>Each processor needs an Article 28 data processing agreement in place, binding them to act only on the clinic’s instructions and to notify the clinic of any breach without undue delay. A reportable personal-data breach must reach the ICO within 72 hours.</w:t>
-      </w:r>
-    </w:p>
-    <w:p>
-      <w:pPr>
-        <w:spacing w:before="260" w:after="60"/>
-        <w:pBdr>
-          <w:bottom w:val="single" w:sz="6" w:space="2" w:color="C9D2DE"/>
-        </w:pBdr>
-      </w:pPr>
-      <w:r>
-        <w:rPr>
-          <w:b/>
-          <w:color w:val="142A28"/>
-          <w:sz w:val="27"/>
-        </w:rPr>
-        <w:t>8 · International transfers</w:t>
-      </w:r>
-    </w:p>
-    <w:p>
-      <w:pPr>
-        <w:spacing w:after="80" w:before="0"/>
-      </w:pPr>
-      <w:r>
-        <w:rPr>
-          <w:b w:val="0"/>
-          <w:i w:val="0"/>
-          <w:sz w:val="21"/>
-        </w:rPr>
-        <w:t>Some processors (GoHighLevel, certain pharmacies, and analytics) are in the US. Those transfers rely on the UK International Data Transfer Agreement (IDTA), or the UK Addendum to the EU Standard Contractual Clauses, within each processor’s DPA, supported by a Transfer Risk Assessment. GoHighLevel is on its HIPAA tier. Confirm the signed IDTA and DPA with GoHighLevel are in place before go-live.</w:t>
-      </w:r>
-    </w:p>
-    <w:p>
-      <w:pPr>
-        <w:spacing w:before="260" w:after="60"/>
-        <w:pBdr>
-          <w:bottom w:val="single" w:sz="6" w:space="2" w:color="C9D2DE"/>
-        </w:pBdr>
-      </w:pPr>
-      <w:r>
-        <w:rPr>
-          <w:b/>
-          <w:color w:val="142A28"/>
-          <w:sz w:val="27"/>
-        </w:rPr>
-        <w:t>9 · Privacy-notice updates needed</w:t>
-      </w:r>
-    </w:p>
-    <w:p>
-      <w:pPr>
-        <w:pStyle w:val="ListBullet"/>
-        <w:spacing w:after="40"/>
-      </w:pPr>
-      <w:r>
-        <w:rPr>
-          <w:b/>
-          <w:color w:val="A33A2C"/>
-        </w:rPr>
-        <w:t xml:space="preserve">Terminology: </w:t>
-      </w:r>
-      <w:r>
-        <w:t>replace every "EU GDPR" reference with "UK GDPR" across the Semble registration form, consent form, and both privacy policies.</w:t>
-      </w:r>
-    </w:p>
-    <w:p>
-      <w:pPr>
-        <w:pStyle w:val="ListBullet"/>
-        <w:spacing w:after="40"/>
-      </w:pPr>
-      <w:r>
-        <w:rPr>
-          <w:b/>
-        </w:rPr>
-        <w:t xml:space="preserve">Add processor: </w:t>
-      </w:r>
-      <w:r>
-        <w:t>add GoHighLevel as a processor (operational CRM, inbox, forms, communications; US, HIPAA tier, UK IDTA).</w:t>
-      </w:r>
-    </w:p>
-    <w:p>
-      <w:pPr>
-        <w:pStyle w:val="ListBullet"/>
-        <w:spacing w:after="40"/>
-      </w:pPr>
-      <w:r>
-        <w:rPr>
-          <w:b/>
-        </w:rPr>
-        <w:t xml:space="preserve">Add processor: </w:t>
-      </w:r>
-      <w:r>
-        <w:t>add WhatsApp / Meta Cloud API as a processor for patient messaging (GB storage).</w:t>
-      </w:r>
-    </w:p>
-    <w:p>
-      <w:pPr>
-        <w:pStyle w:val="ListBullet"/>
-        <w:spacing w:after="40"/>
-      </w:pPr>
-      <w:r>
-        <w:rPr>
-          <w:b/>
-        </w:rPr>
-        <w:t xml:space="preserve">Update: </w:t>
-      </w:r>
-      <w:r>
-        <w:t>the website policy names MailChimp for newsletters; update to reflect the move to GoHighLevel (retain MailChimp only if still used).</w:t>
-      </w:r>
-    </w:p>
-    <w:p>
-      <w:pPr>
-        <w:pStyle w:val="ListBullet"/>
-        <w:spacing w:after="40"/>
-      </w:pPr>
-      <w:r>
-        <w:rPr>
-          <w:b/>
-          <w:color w:val="8A5A0C"/>
-        </w:rPr>
-        <w:t xml:space="preserve">Remove ads clause: </w:t>
-      </w:r>
-      <w:r>
-        <w:t>the website policy references retargeting ads via Google, Facebook and Instagram. The clinic does not run these, so remove the clause so the policy matches what the clinic actually does. If retargeting is ever introduced, add a cookie-consent opt-in for it first (PECR).</w:t>
-      </w:r>
-    </w:p>
-    <w:p>
-      <w:pPr>
-        <w:pStyle w:val="ListBullet"/>
-        <w:spacing w:after="40"/>
-      </w:pPr>
-      <w:r>
-        <w:rPr>
-          <w:b/>
-        </w:rPr>
-        <w:t xml:space="preserve">Cookies: </w:t>
-      </w:r>
-      <w:r>
-        <w:t>ensure a compliant cookie consent banner is in place for non-essential cookies (analytics, maps, any retargeting).</w:t>
-      </w:r>
-    </w:p>
-    <w:p>
-      <w:pPr>
-        <w:pStyle w:val="ListBullet"/>
-        <w:spacing w:after="40"/>
-      </w:pPr>
-      <w:r>
-        <w:rPr>
-          <w:b/>
-        </w:rPr>
-        <w:t xml:space="preserve">Retention &amp; rights: </w:t>
-      </w:r>
-      <w:r>
-        <w:t>state the retention periods and the patient rights above, with a named data-protection contact and the subject-access-request route.</w:t>
-      </w:r>
-    </w:p>
-    <w:p>
-      <w:pPr>
-        <w:spacing w:before="260" w:after="60"/>
-        <w:pBdr>
-          <w:bottom w:val="single" w:sz="6" w:space="2" w:color="C9D2DE"/>
-        </w:pBdr>
-      </w:pPr>
-      <w:r>
-        <w:rPr>
-          <w:b/>
-          <w:color w:val="142A28"/>
-          <w:sz w:val="27"/>
-        </w:rPr>
-        <w:t>10 · Before this goes live — data-person checklist</w:t>
+        <w:t>What we collect</w:t>
       </w:r>
     </w:p>
     <w:p>
@@ -2417,15 +229,22 @@
       </w:pPr>
       <w:r>
         <w:rPr>
-          <w:sz w:val="22"/>
+          <w:sz w:val="21"/>
         </w:rPr>
-        <w:t xml:space="preserve">☐  </w:t>
+        <w:t>Your contact details and the health information you choose to share, so we can respond to you and provide your care.</w:t>
       </w:r>
+    </w:p>
+    <w:p>
+      <w:pPr>
+        <w:spacing w:after="20" w:before="120"/>
+      </w:pPr>
       <w:r>
         <w:rPr>
-          <w:sz w:val="20"/>
+          <w:b/>
+          <w:color w:val="0B534E"/>
+          <w:sz w:val="21"/>
         </w:rPr>
-        <w:t>Confirm the lawful bases above for special-category data at enquiry and in care</w:t>
+        <w:t>Why we can use it (our lawful basis)</w:t>
       </w:r>
     </w:p>
     <w:p>
@@ -2434,15 +253,22 @@
       </w:pPr>
       <w:r>
         <w:rPr>
-          <w:sz w:val="22"/>
+          <w:sz w:val="21"/>
         </w:rPr>
-        <w:t xml:space="preserve">☐  </w:t>
+        <w:t>Because health information is sensitive, we ask for your explicit consent to use it when you enquire (UK GDPR Article 9(2)(a)). Once you are a patient, we use it to provide your healthcare under UK GDPR Article 9(2)(h) and the Data Protection Act 2018.</w:t>
       </w:r>
+    </w:p>
+    <w:p>
+      <w:pPr>
+        <w:spacing w:after="20" w:before="120"/>
+      </w:pPr>
       <w:r>
         <w:rPr>
-          <w:sz w:val="20"/>
+          <w:b/>
+          <w:color w:val="0B534E"/>
+          <w:sz w:val="21"/>
         </w:rPr>
-        <w:t>Approve the final enquiry and registration consent wording</w:t>
+        <w:t>How we contact you</w:t>
       </w:r>
     </w:p>
     <w:p>
@@ -2451,15 +277,22 @@
       </w:pPr>
       <w:r>
         <w:rPr>
-          <w:sz w:val="22"/>
+          <w:sz w:val="21"/>
         </w:rPr>
-        <w:t xml:space="preserve">☐  </w:t>
+        <w:t>Only in the ways you choose above. We use WhatsApp, SMS and email for appointment reminders and service messages. We send marketing or newsletters only if you opt in, and you can unsubscribe at any time.</w:t>
       </w:r>
+    </w:p>
+    <w:p>
+      <w:pPr>
+        <w:spacing w:after="20" w:before="120"/>
+      </w:pPr>
       <w:r>
         <w:rPr>
-          <w:sz w:val="20"/>
+          <w:b/>
+          <w:color w:val="0B534E"/>
+          <w:sz w:val="21"/>
         </w:rPr>
-        <w:t>Confirm the data controller’s legal entity name and ICO registration</w:t>
+        <w:t>Where your information is kept</w:t>
       </w:r>
     </w:p>
     <w:p>
@@ -2468,15 +301,22 @@
       </w:pPr>
       <w:r>
         <w:rPr>
-          <w:sz w:val="22"/>
+          <w:sz w:val="21"/>
         </w:rPr>
-        <w:t xml:space="preserve">☐  </w:t>
+        <w:t>Your clinical record is held securely in our clinical system; our day-to-day messaging and admin are handled in our secure practice system. Both are protected with access controls and appropriate safeguards, including for any storage outside the UK.</w:t>
       </w:r>
+    </w:p>
+    <w:p>
+      <w:pPr>
+        <w:spacing w:after="20" w:before="120"/>
+      </w:pPr>
       <w:r>
         <w:rPr>
-          <w:sz w:val="20"/>
+          <w:b/>
+          <w:color w:val="0B534E"/>
+          <w:sz w:val="21"/>
         </w:rPr>
-        <w:t>Name a data-protection contact (and DPO if applicable) and the subject-access-request route</w:t>
+        <w:t>Who we share it with</w:t>
       </w:r>
     </w:p>
     <w:p>
@@ -2485,15 +325,22 @@
       </w:pPr>
       <w:r>
         <w:rPr>
-          <w:sz w:val="22"/>
+          <w:sz w:val="21"/>
         </w:rPr>
-        <w:t xml:space="preserve">☐  </w:t>
+        <w:t>Only trusted providers who help deliver your care — such as laboratories and pharmacies — under contract. We never sell your information.</w:t>
       </w:r>
+    </w:p>
+    <w:p>
+      <w:pPr>
+        <w:spacing w:after="20" w:before="120"/>
+      </w:pPr>
       <w:r>
         <w:rPr>
-          <w:sz w:val="20"/>
+          <w:b/>
+          <w:color w:val="0B534E"/>
+          <w:sz w:val="21"/>
         </w:rPr>
-        <w:t>Set and document the retention periods; configure deletion of non-converting enquiry data</w:t>
+        <w:t>How long we keep it</w:t>
       </w:r>
     </w:p>
     <w:p>
@@ -2502,15 +349,22 @@
       </w:pPr>
       <w:r>
         <w:rPr>
-          <w:sz w:val="22"/>
+          <w:sz w:val="21"/>
         </w:rPr>
-        <w:t xml:space="preserve">☐  </w:t>
+        <w:t>Only as long as needed. Clinical records are kept in line with healthcare guidance; enquiries that do not proceed are kept for a limited period and then deleted.</w:t>
       </w:r>
+    </w:p>
+    <w:p>
+      <w:pPr>
+        <w:spacing w:after="20" w:before="120"/>
+      </w:pPr>
       <w:r>
         <w:rPr>
-          <w:sz w:val="20"/>
+          <w:b/>
+          <w:color w:val="0B534E"/>
+          <w:sz w:val="21"/>
         </w:rPr>
-        <w:t>Confirm the newsletter list only contains contacts with a valid basis before the MailChimp → GHL migration</w:t>
+        <w:t>Your rights</w:t>
       </w:r>
     </w:p>
     <w:p>
@@ -2519,15 +373,22 @@
       </w:pPr>
       <w:r>
         <w:rPr>
-          <w:sz w:val="22"/>
+          <w:sz w:val="21"/>
         </w:rPr>
-        <w:t xml:space="preserve">☐  </w:t>
+        <w:t>You can ask to see, correct or delete your information, and withdraw consent at any time — as easily as you gave it. Withdrawing marketing consent never affects your care. We respond within one month.</w:t>
       </w:r>
+    </w:p>
+    <w:p>
+      <w:pPr>
+        <w:spacing w:after="20" w:before="120"/>
+      </w:pPr>
       <w:r>
         <w:rPr>
-          <w:sz w:val="20"/>
+          <w:b/>
+          <w:color w:val="0B534E"/>
+          <w:sz w:val="21"/>
         </w:rPr>
-        <w:t>Replace Semble’s auto-marked consent with genuine captured opt-in</w:t>
+        <w:t>Contact</w:t>
       </w:r>
     </w:p>
     <w:p>
@@ -2536,944 +397,14 @@
       </w:pPr>
       <w:r>
         <w:rPr>
-          <w:sz w:val="22"/>
+          <w:sz w:val="21"/>
         </w:rPr>
-        <w:t xml:space="preserve">☐  </w:t>
-      </w:r>
-      <w:r>
-        <w:rPr>
-          <w:sz w:val="20"/>
-        </w:rPr>
-        <w:t>Put a signed UK IDTA and Article 28 DPA in place with GoHighLevel and other US processors</w:t>
+        <w:t>To exercise any of these, or to ask a question about your information, contact [data-protection contact and email].</w:t>
       </w:r>
     </w:p>
     <w:p>
       <w:pPr>
-        <w:spacing w:after="40"/>
-      </w:pPr>
-      <w:r>
-        <w:rPr>
-          <w:sz w:val="22"/>
-        </w:rPr>
-        <w:t xml:space="preserve">☐  </w:t>
-      </w:r>
-      <w:r>
-        <w:rPr>
-          <w:sz w:val="20"/>
-        </w:rPr>
-        <w:t>Complete and sign the DPIA in Part C</w:t>
-      </w:r>
-    </w:p>
-    <w:p>
-      <w:pPr>
-        <w:spacing w:after="40"/>
-      </w:pPr>
-      <w:r>
-        <w:rPr>
-          <w:sz w:val="22"/>
-        </w:rPr>
-        <w:t xml:space="preserve">☐  </w:t>
-      </w:r>
-      <w:r>
-        <w:rPr>
-          <w:sz w:val="20"/>
-        </w:rPr>
-        <w:t>Remove the retargeting-ads clause from the website policy (ads not currently run)</w:t>
-      </w:r>
-    </w:p>
-    <w:p>
-      <w:pPr>
-        <w:spacing w:after="40"/>
-      </w:pPr>
-      <w:r>
-        <w:rPr>
-          <w:sz w:val="22"/>
-        </w:rPr>
-        <w:t xml:space="preserve">☐  </w:t>
-      </w:r>
-      <w:r>
-        <w:rPr>
-          <w:sz w:val="20"/>
-        </w:rPr>
-        <w:t>Confirm patient "active / inactive / archived" status governs who can be marketed to</w:t>
-      </w:r>
-    </w:p>
-    <w:p>
-      <w:pPr>
-        <w:spacing w:after="40"/>
-      </w:pPr>
-      <w:r>
-        <w:rPr>
-          <w:sz w:val="22"/>
-        </w:rPr>
-        <w:t xml:space="preserve">☐  </w:t>
-      </w:r>
-      <w:r>
-        <w:rPr>
-          <w:sz w:val="20"/>
-        </w:rPr>
-        <w:t>Update EU → UK GDPR references everywhere</w:t>
-      </w:r>
-    </w:p>
-    <w:tbl>
-      <w:tblPr>
-        <w:tblStyle w:val="TableGrid"/>
-        <w:tblW w:type="auto" w:w="0"/>
-        <w:tblLook w:firstColumn="1" w:firstRow="1" w:lastColumn="0" w:lastRow="0" w:noHBand="0" w:noVBand="1" w:val="04A0"/>
-      </w:tblPr>
-      <w:tblGrid>
-        <w:gridCol w:w="9792"/>
-      </w:tblGrid>
-      <w:tr>
-        <w:tc>
-          <w:tcPr>
-            <w:tcW w:type="dxa" w:w="9792"/>
-            <w:shd w:val="clear" w:fill="142A28"/>
-          </w:tcPr>
-          <w:p>
-            <w:pPr>
-              <w:spacing w:after="0"/>
-            </w:pPr>
-            <w:r>
-              <w:rPr>
-                <w:b/>
-                <w:color w:val="9FC4BD"/>
-                <w:sz w:val="16"/>
-              </w:rPr>
-              <w:t>PART C — DATA PROTECTION IMPACT ASSESSMENT</w:t>
-            </w:r>
-          </w:p>
-          <w:p>
-            <w:pPr>
-              <w:spacing w:before="0"/>
-            </w:pPr>
-            <w:r>
-              <w:rPr>
-                <w:b/>
-                <w:color w:val="FFFFFF"/>
-                <w:sz w:val="28"/>
-              </w:rPr>
-              <w:t>DPIA outline, ready for the data adviser to complete</w:t>
-            </w:r>
-          </w:p>
-        </w:tc>
-      </w:tr>
-    </w:tbl>
-    <w:p>
-      <w:pPr>
-        <w:spacing w:after="80" w:before="0"/>
-      </w:pPr>
-    </w:p>
-    <w:p>
-      <w:pPr>
-        <w:spacing w:after="80" w:before="0"/>
-      </w:pPr>
-      <w:r>
-        <w:rPr>
-          <w:b w:val="0"/>
-          <w:i/>
-          <w:color w:val="55605F"/>
-          <w:sz w:val="21"/>
-        </w:rPr>
-        <w:t>A DPIA is expected under UK GDPR Article 35 here, because the build involves special-category (health) data at scale, a new operational CRM (GoHighLevel), and an international transfer. This outline is pre-filled from what we know; the data adviser confirms the detail, adds anything clinic-specific, and signs it off. Items marked [confirm] need the clinic’s input.</w:t>
-      </w:r>
-    </w:p>
-    <w:p>
-      <w:pPr>
-        <w:spacing w:before="140" w:after="40"/>
-      </w:pPr>
-      <w:r>
-        <w:rPr>
-          <w:b/>
-          <w:color w:val="0B534E"/>
-          <w:sz w:val="22"/>
-        </w:rPr>
-        <w:t>Step 1 — Describe the processing</w:t>
-      </w:r>
-    </w:p>
-    <w:p>
-      <w:pPr>
-        <w:pStyle w:val="ListBullet"/>
-        <w:spacing w:after="40"/>
-      </w:pPr>
-      <w:r>
-        <w:rPr>
-          <w:b/>
-        </w:rPr>
-        <w:t xml:space="preserve">What: </w:t>
-      </w:r>
-      <w:r>
-        <w:t>collecting enquiry and registration information, messaging patients (WhatsApp, email, SMS), running a shared inbox and CRM (GoHighLevel), sending appointment reminders, and (with consent) newsletters.</w:t>
-      </w:r>
-    </w:p>
-    <w:p>
-      <w:pPr>
-        <w:pStyle w:val="ListBullet"/>
-        <w:spacing w:after="40"/>
-      </w:pPr>
-      <w:r>
-        <w:rPr>
-          <w:b/>
-        </w:rPr>
-        <w:t xml:space="preserve">Whose data: </w:t>
-      </w:r>
-      <w:r>
-        <w:t>adult private patients (UK, and international patients with a UK address). Special-category health data is involved from the enquiry onward.</w:t>
-      </w:r>
-    </w:p>
-    <w:p>
-      <w:pPr>
-        <w:pStyle w:val="ListBullet"/>
-        <w:spacing w:after="40"/>
-      </w:pPr>
-      <w:r>
-        <w:rPr>
-          <w:b/>
-        </w:rPr>
-        <w:t xml:space="preserve">Scale: </w:t>
-      </w:r>
-      <w:r>
-        <w:t>approximately [confirm number] existing contacts migrated from Semble, plus new enquiries.</w:t>
-      </w:r>
-    </w:p>
-    <w:p>
-      <w:pPr>
-        <w:pStyle w:val="ListBullet"/>
-        <w:spacing w:after="40"/>
-      </w:pPr>
-      <w:r>
-        <w:rPr>
-          <w:b/>
-        </w:rPr>
-        <w:t xml:space="preserve">Context: </w:t>
-      </w:r>
-      <w:r>
-        <w:t>premium hormone / longevity clinic. The clinical record stays in Semble; GoHighLevel is operational only and does not hold the clinical record.</w:t>
-      </w:r>
-    </w:p>
-    <w:p>
-      <w:pPr>
-        <w:pStyle w:val="ListBullet"/>
-        <w:spacing w:after="40"/>
-      </w:pPr>
-      <w:r>
-        <w:rPr>
-          <w:b/>
-        </w:rPr>
-        <w:t xml:space="preserve">Purposes: </w:t>
-      </w:r>
-      <w:r>
-        <w:t>respond to enquiries, coordinate care and appointments, send service messages, and send marketing only to patients who have opted in.</w:t>
-      </w:r>
-    </w:p>
-    <w:p>
-      <w:pPr>
-        <w:spacing w:before="140" w:after="40"/>
-      </w:pPr>
-      <w:r>
-        <w:rPr>
-          <w:b/>
-          <w:color w:val="0B534E"/>
-          <w:sz w:val="22"/>
-        </w:rPr>
-        <w:t>Step 2 — Necessity &amp; proportionality</w:t>
-      </w:r>
-    </w:p>
-    <w:p>
-      <w:pPr>
-        <w:pStyle w:val="ListBullet"/>
-        <w:spacing w:after="40"/>
-      </w:pPr>
-      <w:r>
-        <w:rPr>
-          <w:b/>
-        </w:rPr>
-        <w:t xml:space="preserve">Lawful basis: </w:t>
-      </w:r>
-      <w:r>
-        <w:t>as set out in section 4 — consent for enquiries and marketing; contract plus Article 9(2)(h) for providing care.</w:t>
-      </w:r>
-    </w:p>
-    <w:p>
-      <w:pPr>
-        <w:pStyle w:val="ListBullet"/>
-        <w:spacing w:after="40"/>
-      </w:pPr>
-      <w:r>
-        <w:rPr>
-          <w:b/>
-        </w:rPr>
-        <w:t xml:space="preserve">Data minimisation: </w:t>
-      </w:r>
-      <w:r>
-        <w:t>only the fields needed are collected; clinical detail remains in Semble, not GoHighLevel.</w:t>
-      </w:r>
-    </w:p>
-    <w:p>
-      <w:pPr>
-        <w:pStyle w:val="ListBullet"/>
-        <w:spacing w:after="40"/>
-      </w:pPr>
-      <w:r>
-        <w:rPr>
-          <w:b/>
-        </w:rPr>
-        <w:t xml:space="preserve">Individual rights: </w:t>
-      </w:r>
-      <w:r>
-        <w:t>supported as in section 6; consent is recorded and as easy to withdraw as to give.</w:t>
-      </w:r>
-    </w:p>
-    <w:p>
-      <w:pPr>
-        <w:pStyle w:val="ListBullet"/>
-        <w:spacing w:after="40"/>
-      </w:pPr>
-      <w:r>
-        <w:rPr>
-          <w:b/>
-        </w:rPr>
-        <w:t xml:space="preserve">Retention: </w:t>
-      </w:r>
-      <w:r>
-        <w:t>set and documented as in section 5, including deletion of non-converting enquiries.</w:t>
-      </w:r>
-    </w:p>
-    <w:p>
-      <w:pPr>
-        <w:pStyle w:val="ListBullet"/>
-        <w:spacing w:after="40"/>
-      </w:pPr>
-      <w:r>
-        <w:rPr>
-          <w:b/>
-        </w:rPr>
-        <w:t xml:space="preserve">Transfers: </w:t>
-      </w:r>
-      <w:r>
-        <w:t>US processors covered by UK IDTA and a Transfer Risk Assessment (section 8).</w:t>
-      </w:r>
-    </w:p>
-    <w:p>
-      <w:pPr>
-        <w:spacing w:before="140" w:after="40"/>
-      </w:pPr>
-      <w:r>
-        <w:rPr>
-          <w:b/>
-          <w:color w:val="0B534E"/>
-          <w:sz w:val="22"/>
-        </w:rPr>
-        <w:t>Step 3 — Risk register</w:t>
-      </w:r>
-    </w:p>
-    <w:tbl>
-      <w:tblPr>
-        <w:tblStyle w:val="TableGrid"/>
-        <w:tblW w:type="auto" w:w="0"/>
-        <w:tblLook w:firstColumn="1" w:firstRow="1" w:lastColumn="0" w:lastRow="0" w:noHBand="0" w:noVBand="1" w:val="04A0"/>
-      </w:tblPr>
-      <w:tblGrid>
-        <w:gridCol w:w="2448"/>
-        <w:gridCol w:w="2448"/>
-        <w:gridCol w:w="2448"/>
-        <w:gridCol w:w="2448"/>
-      </w:tblGrid>
-      <w:tr>
-        <w:tc>
-          <w:tcPr>
-            <w:tcW w:type="dxa" w:w="2880"/>
-            <w:shd w:val="clear" w:fill="142A28"/>
-          </w:tcPr>
-          <w:p>
-            <w:r>
-              <w:rPr>
-                <w:b/>
-                <w:color w:val="FFFFFF"/>
-                <w:sz w:val="18"/>
-              </w:rPr>
-              <w:t>Risk</w:t>
-            </w:r>
-          </w:p>
-        </w:tc>
-        <w:tc>
-          <w:tcPr>
-            <w:tcW w:type="dxa" w:w="1296"/>
-            <w:shd w:val="clear" w:fill="142A28"/>
-          </w:tcPr>
-          <w:p>
-            <w:r>
-              <w:rPr>
-                <w:b/>
-                <w:color w:val="FFFFFF"/>
-                <w:sz w:val="18"/>
-              </w:rPr>
-              <w:t>Likelihood</w:t>
-            </w:r>
-          </w:p>
-        </w:tc>
-        <w:tc>
-          <w:tcPr>
-            <w:tcW w:type="dxa" w:w="1296"/>
-            <w:shd w:val="clear" w:fill="142A28"/>
-          </w:tcPr>
-          <w:p>
-            <w:r>
-              <w:rPr>
-                <w:b/>
-                <w:color w:val="FFFFFF"/>
-                <w:sz w:val="18"/>
-              </w:rPr>
-              <w:t>Severity</w:t>
-            </w:r>
-          </w:p>
-        </w:tc>
-        <w:tc>
-          <w:tcPr>
-            <w:tcW w:type="dxa" w:w="3888"/>
-            <w:shd w:val="clear" w:fill="142A28"/>
-          </w:tcPr>
-          <w:p>
-            <w:r>
-              <w:rPr>
-                <w:b/>
-                <w:color w:val="FFFFFF"/>
-                <w:sz w:val="18"/>
-              </w:rPr>
-              <w:t>Measures to reduce it</w:t>
-            </w:r>
-          </w:p>
-        </w:tc>
-      </w:tr>
-      <w:tr>
-        <w:tc>
-          <w:tcPr>
-            <w:tcW w:type="dxa" w:w="2880"/>
-          </w:tcPr>
-          <w:p>
-            <w:pPr>
-              <w:spacing w:after="20"/>
-            </w:pPr>
-            <w:r>
-              <w:rPr>
-                <w:sz w:val="18"/>
-              </w:rPr>
-              <w:t>Health data held in a US-based CRM (GoHighLevel)</w:t>
-            </w:r>
-          </w:p>
-        </w:tc>
-        <w:tc>
-          <w:tcPr>
-            <w:tcW w:type="dxa" w:w="1296"/>
-          </w:tcPr>
-          <w:p>
-            <w:pPr>
-              <w:spacing w:after="20"/>
-            </w:pPr>
-            <w:r>
-              <w:rPr>
-                <w:sz w:val="18"/>
-              </w:rPr>
-              <w:t>Low</w:t>
-            </w:r>
-          </w:p>
-        </w:tc>
-        <w:tc>
-          <w:tcPr>
-            <w:tcW w:type="dxa" w:w="1296"/>
-          </w:tcPr>
-          <w:p>
-            <w:pPr>
-              <w:spacing w:after="20"/>
-            </w:pPr>
-            <w:r>
-              <w:rPr>
-                <w:sz w:val="18"/>
-              </w:rPr>
-              <w:t>High</w:t>
-            </w:r>
-          </w:p>
-        </w:tc>
-        <w:tc>
-          <w:tcPr>
-            <w:tcW w:type="dxa" w:w="3888"/>
-          </w:tcPr>
-          <w:p>
-            <w:pPr>
-              <w:spacing w:after="20"/>
-            </w:pPr>
-            <w:r>
-              <w:rPr>
-                <w:sz w:val="18"/>
-              </w:rPr>
-              <w:t>HIPAA tier; UK IDTA + Transfer Risk Assessment; clinical record kept in Semble, not GHL; access controls.</w:t>
-            </w:r>
-          </w:p>
-        </w:tc>
-      </w:tr>
-      <w:tr>
-        <w:tc>
-          <w:tcPr>
-            <w:tcW w:type="dxa" w:w="2880"/>
-          </w:tcPr>
-          <w:p>
-            <w:pPr>
-              <w:spacing w:after="20"/>
-            </w:pPr>
-            <w:r>
-              <w:rPr>
-                <w:sz w:val="18"/>
-              </w:rPr>
-              <w:t>Shared-inbox messages seen by wider team than needed</w:t>
-            </w:r>
-          </w:p>
-        </w:tc>
-        <w:tc>
-          <w:tcPr>
-            <w:tcW w:type="dxa" w:w="1296"/>
-          </w:tcPr>
-          <w:p>
-            <w:pPr>
-              <w:spacing w:after="20"/>
-            </w:pPr>
-            <w:r>
-              <w:rPr>
-                <w:sz w:val="18"/>
-              </w:rPr>
-              <w:t>Medium</w:t>
-            </w:r>
-          </w:p>
-        </w:tc>
-        <w:tc>
-          <w:tcPr>
-            <w:tcW w:type="dxa" w:w="1296"/>
-          </w:tcPr>
-          <w:p>
-            <w:pPr>
-              <w:spacing w:after="20"/>
-            </w:pPr>
-            <w:r>
-              <w:rPr>
-                <w:sz w:val="18"/>
-              </w:rPr>
-              <w:t>Medium</w:t>
-            </w:r>
-          </w:p>
-        </w:tc>
-        <w:tc>
-          <w:tcPr>
-            <w:tcW w:type="dxa" w:w="3888"/>
-          </w:tcPr>
-          <w:p>
-            <w:pPr>
-              <w:spacing w:after="20"/>
-            </w:pPr>
-            <w:r>
-              <w:rPr>
-                <w:sz w:val="18"/>
-              </w:rPr>
-              <w:t>Role-based access; staff data-protection agreements and training; sensitive items recorded in Semble.</w:t>
-            </w:r>
-          </w:p>
-        </w:tc>
-      </w:tr>
-      <w:tr>
-        <w:tc>
-          <w:tcPr>
-            <w:tcW w:type="dxa" w:w="2880"/>
-          </w:tcPr>
-          <w:p>
-            <w:pPr>
-              <w:spacing w:after="20"/>
-            </w:pPr>
-            <w:r>
-              <w:rPr>
-                <w:sz w:val="18"/>
-              </w:rPr>
-              <w:t>Marketing sent without a valid basis after the MailChimp → GHL migration</w:t>
-            </w:r>
-          </w:p>
-        </w:tc>
-        <w:tc>
-          <w:tcPr>
-            <w:tcW w:type="dxa" w:w="1296"/>
-          </w:tcPr>
-          <w:p>
-            <w:pPr>
-              <w:spacing w:after="20"/>
-            </w:pPr>
-            <w:r>
-              <w:rPr>
-                <w:sz w:val="18"/>
-              </w:rPr>
-              <w:t>Medium</w:t>
-            </w:r>
-          </w:p>
-        </w:tc>
-        <w:tc>
-          <w:tcPr>
-            <w:tcW w:type="dxa" w:w="1296"/>
-          </w:tcPr>
-          <w:p>
-            <w:pPr>
-              <w:spacing w:after="20"/>
-            </w:pPr>
-            <w:r>
-              <w:rPr>
-                <w:sz w:val="18"/>
-              </w:rPr>
-              <w:t>Medium</w:t>
-            </w:r>
-          </w:p>
-        </w:tc>
-        <w:tc>
-          <w:tcPr>
-            <w:tcW w:type="dxa" w:w="3888"/>
-          </w:tcPr>
-          <w:p>
-            <w:pPr>
-              <w:spacing w:after="20"/>
-            </w:pPr>
-            <w:r>
-              <w:rPr>
-                <w:sz w:val="18"/>
-              </w:rPr>
-              <w:t>Migrate only validly-consented contacts; per-channel opt-in; working unsubscribe; consent audit trail.</w:t>
-            </w:r>
-          </w:p>
-        </w:tc>
-      </w:tr>
-      <w:tr>
-        <w:tc>
-          <w:tcPr>
-            <w:tcW w:type="dxa" w:w="2880"/>
-          </w:tcPr>
-          <w:p>
-            <w:pPr>
-              <w:spacing w:after="20"/>
-            </w:pPr>
-            <w:r>
-              <w:rPr>
-                <w:sz w:val="18"/>
-              </w:rPr>
-              <w:t>Invalid consent from Semble auto-marking opt-in</w:t>
-            </w:r>
-          </w:p>
-        </w:tc>
-        <w:tc>
-          <w:tcPr>
-            <w:tcW w:type="dxa" w:w="1296"/>
-          </w:tcPr>
-          <w:p>
-            <w:pPr>
-              <w:spacing w:after="20"/>
-            </w:pPr>
-            <w:r>
-              <w:rPr>
-                <w:sz w:val="18"/>
-              </w:rPr>
-              <w:t>High (current)</w:t>
-            </w:r>
-          </w:p>
-        </w:tc>
-        <w:tc>
-          <w:tcPr>
-            <w:tcW w:type="dxa" w:w="1296"/>
-          </w:tcPr>
-          <w:p>
-            <w:pPr>
-              <w:spacing w:after="20"/>
-            </w:pPr>
-            <w:r>
-              <w:rPr>
-                <w:sz w:val="18"/>
-              </w:rPr>
-              <w:t>Medium</w:t>
-            </w:r>
-          </w:p>
-        </w:tc>
-        <w:tc>
-          <w:tcPr>
-            <w:tcW w:type="dxa" w:w="3888"/>
-          </w:tcPr>
-          <w:p>
-            <w:pPr>
-              <w:spacing w:after="20"/>
-            </w:pPr>
-            <w:r>
-              <w:rPr>
-                <w:sz w:val="18"/>
-              </w:rPr>
-              <w:t>Replace with a genuine captured opt-in; re-permission the list where needed.</w:t>
-            </w:r>
-          </w:p>
-        </w:tc>
-      </w:tr>
-      <w:tr>
-        <w:tc>
-          <w:tcPr>
-            <w:tcW w:type="dxa" w:w="2880"/>
-          </w:tcPr>
-          <w:p>
-            <w:pPr>
-              <w:spacing w:after="20"/>
-            </w:pPr>
-            <w:r>
-              <w:rPr>
-                <w:sz w:val="18"/>
-              </w:rPr>
-              <w:t>Unauthorised access or data breach</w:t>
-            </w:r>
-          </w:p>
-        </w:tc>
-        <w:tc>
-          <w:tcPr>
-            <w:tcW w:type="dxa" w:w="1296"/>
-          </w:tcPr>
-          <w:p>
-            <w:pPr>
-              <w:spacing w:after="20"/>
-            </w:pPr>
-            <w:r>
-              <w:rPr>
-                <w:sz w:val="18"/>
-              </w:rPr>
-              <w:t>Low</w:t>
-            </w:r>
-          </w:p>
-        </w:tc>
-        <w:tc>
-          <w:tcPr>
-            <w:tcW w:type="dxa" w:w="1296"/>
-          </w:tcPr>
-          <w:p>
-            <w:pPr>
-              <w:spacing w:after="20"/>
-            </w:pPr>
-            <w:r>
-              <w:rPr>
-                <w:sz w:val="18"/>
-              </w:rPr>
-              <w:t>High</w:t>
-            </w:r>
-          </w:p>
-        </w:tc>
-        <w:tc>
-          <w:tcPr>
-            <w:tcW w:type="dxa" w:w="3888"/>
-          </w:tcPr>
-          <w:p>
-            <w:pPr>
-              <w:spacing w:after="20"/>
-            </w:pPr>
-            <w:r>
-              <w:rPr>
-                <w:sz w:val="18"/>
-              </w:rPr>
-              <w:t>Multi-factor authentication; least-privilege access; Article 28 DPAs; 72-hour ICO breach process; encryption in transit and at rest.</w:t>
-            </w:r>
-          </w:p>
-        </w:tc>
-      </w:tr>
-    </w:tbl>
-    <w:p>
-      <w:pPr>
-        <w:spacing w:after="60" w:before="0"/>
-      </w:pPr>
-    </w:p>
-    <w:p>
-      <w:pPr>
-        <w:spacing w:after="120" w:before="0"/>
-      </w:pPr>
-      <w:r>
-        <w:rPr>
-          <w:b w:val="0"/>
-          <w:i/>
-          <w:color w:val="55605F"/>
-          <w:sz w:val="17"/>
-        </w:rPr>
-        <w:t>Likelihood and severity are the adviser’s to confirm; add any clinic-specific risks.</w:t>
-      </w:r>
-    </w:p>
-    <w:p>
-      <w:pPr>
-        <w:spacing w:before="140" w:after="40"/>
-      </w:pPr>
-      <w:r>
-        <w:rPr>
-          <w:b/>
-          <w:color w:val="0B534E"/>
-          <w:sz w:val="22"/>
-        </w:rPr>
-        <w:t>Step 4 — Outcome &amp; approval</w:t>
-      </w:r>
-    </w:p>
-    <w:p>
-      <w:pPr>
-        <w:spacing w:after="60" w:before="0"/>
-      </w:pPr>
-      <w:r>
-        <w:rPr>
-          <w:b w:val="0"/>
-          <w:i w:val="0"/>
-          <w:sz w:val="21"/>
-        </w:rPr>
-        <w:t>Record the residual risk after the measures above, any actions still outstanding, and the approval below. WILBA will action any wording or build changes flagged during review.</w:t>
-      </w:r>
-    </w:p>
-    <w:tbl>
-      <w:tblPr>
-        <w:tblStyle w:val="TableGrid"/>
-        <w:tblW w:type="auto" w:w="0"/>
-        <w:tblLook w:firstColumn="1" w:firstRow="1" w:lastColumn="0" w:lastRow="0" w:noHBand="0" w:noVBand="1" w:val="04A0"/>
-      </w:tblPr>
-      <w:tblGrid>
-        <w:gridCol w:w="2448"/>
-        <w:gridCol w:w="2448"/>
-        <w:gridCol w:w="2448"/>
-        <w:gridCol w:w="2448"/>
-      </w:tblGrid>
-      <w:tr>
-        <w:tc>
-          <w:tcPr>
-            <w:tcW w:type="dxa" w:w="2448"/>
-            <w:shd w:val="clear" w:fill="142A28"/>
-          </w:tcPr>
-          <w:p>
-            <w:r>
-              <w:rPr>
-                <w:b/>
-                <w:color w:val="FFFFFF"/>
-                <w:sz w:val="18"/>
-              </w:rPr>
-              <w:t>Reviewed / approved by</w:t>
-            </w:r>
-          </w:p>
-        </w:tc>
-        <w:tc>
-          <w:tcPr>
-            <w:tcW w:type="dxa" w:w="1872"/>
-            <w:shd w:val="clear" w:fill="142A28"/>
-          </w:tcPr>
-          <w:p>
-            <w:r>
-              <w:rPr>
-                <w:b/>
-                <w:color w:val="FFFFFF"/>
-                <w:sz w:val="18"/>
-              </w:rPr>
-              <w:t>Role</w:t>
-            </w:r>
-          </w:p>
-        </w:tc>
-        <w:tc>
-          <w:tcPr>
-            <w:tcW w:type="dxa" w:w="3744"/>
-            <w:shd w:val="clear" w:fill="142A28"/>
-          </w:tcPr>
-          <w:p>
-            <w:r>
-              <w:rPr>
-                <w:b/>
-                <w:color w:val="FFFFFF"/>
-                <w:sz w:val="18"/>
-              </w:rPr>
-              <w:t>Residual risk &amp; any actions</w:t>
-            </w:r>
-          </w:p>
-        </w:tc>
-        <w:tc>
-          <w:tcPr>
-            <w:tcW w:type="dxa" w:w="1584"/>
-            <w:shd w:val="clear" w:fill="142A28"/>
-          </w:tcPr>
-          <w:p>
-            <w:r>
-              <w:rPr>
-                <w:b/>
-                <w:color w:val="FFFFFF"/>
-                <w:sz w:val="18"/>
-              </w:rPr>
-              <w:t>Date</w:t>
-            </w:r>
-          </w:p>
-        </w:tc>
-      </w:tr>
-      <w:tr>
-        <w:tc>
-          <w:tcPr>
-            <w:tcW w:type="dxa" w:w="2448"/>
-          </w:tcPr>
-          <w:p>
-            <w:pPr>
-              <w:spacing w:before="160" w:after="160"/>
-            </w:pPr>
-            <w:r>
-              <w:rPr>
-                <w:sz w:val="18"/>
-              </w:rPr>
-              <w:t xml:space="preserve"> </w:t>
-            </w:r>
-          </w:p>
-        </w:tc>
-        <w:tc>
-          <w:tcPr>
-            <w:tcW w:type="dxa" w:w="1872"/>
-          </w:tcPr>
-          <w:p>
-            <w:pPr>
-              <w:spacing w:before="160" w:after="160"/>
-            </w:pPr>
-            <w:r>
-              <w:rPr>
-                <w:sz w:val="18"/>
-              </w:rPr>
-              <w:t xml:space="preserve"> </w:t>
-            </w:r>
-          </w:p>
-        </w:tc>
-        <w:tc>
-          <w:tcPr>
-            <w:tcW w:type="dxa" w:w="3744"/>
-          </w:tcPr>
-          <w:p>
-            <w:pPr>
-              <w:spacing w:before="160" w:after="160"/>
-            </w:pPr>
-            <w:r>
-              <w:rPr>
-                <w:sz w:val="18"/>
-              </w:rPr>
-              <w:t xml:space="preserve"> </w:t>
-            </w:r>
-          </w:p>
-        </w:tc>
-        <w:tc>
-          <w:tcPr>
-            <w:tcW w:type="dxa" w:w="1584"/>
-          </w:tcPr>
-          <w:p>
-            <w:pPr>
-              <w:spacing w:before="160" w:after="160"/>
-            </w:pPr>
-            <w:r>
-              <w:rPr>
-                <w:sz w:val="18"/>
-              </w:rPr>
-              <w:t xml:space="preserve"> </w:t>
-            </w:r>
-          </w:p>
-        </w:tc>
-      </w:tr>
-    </w:tbl>
-    <w:p>
-      <w:pPr>
-        <w:spacing w:after="80" w:before="0"/>
-      </w:pPr>
-    </w:p>
-    <w:p>
-      <w:pPr>
-        <w:spacing w:after="120" w:before="120"/>
+        <w:spacing w:after="120" w:before="200"/>
       </w:pPr>
     </w:p>
     <w:p>
@@ -3487,26 +418,12 @@
           <w:color w:val="A33A2C"/>
           <w:sz w:val="18"/>
         </w:rPr>
-        <w:t>This is a working draft to speed up your compliance process. Have a qualified lawyer or your data-protection adviser in the relevant jurisdiction review and sign it off before it goes live.</w:t>
-      </w:r>
-    </w:p>
-    <w:p>
-      <w:pPr>
-        <w:spacing w:after="120" w:before="0"/>
-      </w:pPr>
-      <w:r>
-        <w:rPr>
-          <w:b w:val="0"/>
-          <w:i/>
-          <w:color w:val="55605F"/>
-          <w:sz w:val="17"/>
-        </w:rPr>
-        <w:t>Prepared by WILBA for The Schoeman Clinic · Version 1.0 · 30 July 2026</w:t>
+        <w:t>This is a working draft to speed up your compliance process. Have a qualified lawyer or your data-protection adviser review and sign it off before it goes live. Governing regime: UK GDPR, Data Protection Act 2018 and PECR.</w:t>
       </w:r>
     </w:p>
     <w:sectPr>
       <w:pgSz w:w="12240" w:h="15840"/>
-      <w:pgMar w:top="1008" w:right="1224" w:bottom="1008" w:left="1224" w:header="720" w:footer="720" w:gutter="0"/>
+      <w:pgMar w:top="1080" w:right="1296" w:bottom="1008" w:left="1296" w:header="720" w:footer="720" w:gutter="0"/>
       <w:cols w:space="720"/>
       <w:docGrid w:linePitch="360"/>
     </w:sectPr>

</xml_diff>

<commit_message>
Expand privacy notice to comprehensive 12-section version behind the consent
Keep the clean checkbox layout; make the detail a full clinic-standard privacy
notice: controller, data collected, purposes, all lawful bases (Art 6 + Art 9),
sharing, international transfers, retention, security, rights, marketing choices,
ICO complaint, changes. Regenerated docx, HTML, and PDF.

Co-Authored-By: Claude Opus 4.8 <noreply@anthropic.com>
Claude-Session: https://claude.ai/code/session_01Qk44oiJ6G4KGcJdussGzUo
</commit_message>
<xml_diff>
--- a/outputs/schoeman-clinic/Schoeman-Clinic-Consent-DataProtection-Pack.docx
+++ b/outputs/schoeman-clinic/Schoeman-Clinic-Consent-DataProtection-Pack.docx
@@ -27,12 +27,12 @@
           <w:color w:val="142A28"/>
           <w:sz w:val="36"/>
         </w:rPr>
-        <w:t>Patient Consent &amp; How We Use Your Information</w:t>
+        <w:t>Patient Consent &amp; Privacy Notice</w:t>
       </w:r>
     </w:p>
     <w:p>
       <w:pPr>
-        <w:spacing w:after="80" w:before="0"/>
+        <w:spacing w:after="120" w:before="0"/>
       </w:pPr>
       <w:r>
         <w:rPr>
@@ -41,18 +41,51 @@
           <w:color w:val="55605F"/>
           <w:sz w:val="21"/>
         </w:rPr>
-        <w:t>The tick-box wording for the enquiry and registration forms, with the data-protection detail behind it.</w:t>
+        <w:t>The tick-box consent for the enquiry and registration forms, followed by the full privacy notice that sits behind it.</w:t>
       </w:r>
+    </w:p>
+    <w:tbl>
+      <w:tblPr>
+        <w:tblStyle w:val="TableGrid"/>
+        <w:tblW w:type="auto" w:w="0"/>
+        <w:tblLook w:firstColumn="1" w:firstRow="1" w:lastColumn="0" w:lastRow="0" w:noHBand="0" w:noVBand="1" w:val="04A0"/>
+      </w:tblPr>
+      <w:tblGrid>
+        <w:gridCol w:w="9648"/>
+      </w:tblGrid>
+      <w:tr>
+        <w:tc>
+          <w:tcPr>
+            <w:tcW w:type="dxa" w:w="9648"/>
+            <w:shd w:val="clear" w:fill="142A28"/>
+          </w:tcPr>
+          <w:p>
+            <w:r>
+              <w:rPr>
+                <w:b/>
+                <w:color w:val="FFFFFF"/>
+                <w:sz w:val="26"/>
+              </w:rPr>
+              <w:t>Consent</w:t>
+            </w:r>
+          </w:p>
+        </w:tc>
+      </w:tr>
+    </w:tbl>
+    <w:p>
+      <w:pPr>
+        <w:spacing w:after="80" w:before="0"/>
+      </w:pPr>
     </w:p>
     <w:p>
       <w:pPr>
-        <w:spacing w:before="240" w:after="80"/>
+        <w:spacing w:before="200" w:after="80"/>
       </w:pPr>
       <w:r>
         <w:rPr>
           <w:b/>
           <w:color w:val="142A28"/>
-          <w:sz w:val="28"/>
+          <w:sz w:val="26"/>
         </w:rPr>
         <w:t>Enquiry form</w:t>
       </w:r>
@@ -90,7 +123,7 @@
             </w:pPr>
             <w:r>
               <w:rPr>
-                <w:sz w:val="20"/>
+                <w:sz w:val="21"/>
               </w:rPr>
               <w:t>☐  Keep me updated with clinic news and health information by email.   [OPTIONAL]</w:t>
             </w:r>
@@ -101,7 +134,7 @@
             </w:pPr>
             <w:r>
               <w:rPr>
-                <w:sz w:val="20"/>
+                <w:sz w:val="21"/>
               </w:rPr>
               <w:t>☐ Email     ☐ WhatsApp     ☐ SMS / phone.   How would you like us to contact you about your care?</w:t>
             </w:r>
@@ -116,7 +149,7 @@
                 <w:color w:val="55605F"/>
                 <w:sz w:val="19"/>
               </w:rPr>
-              <w:t>You can update your preferences or withdraw your consent at any time. See how we use your information below.</w:t>
+              <w:t>You can update your preferences or withdraw your consent at any time. The privacy notice below explains how we use and protect your information.</w:t>
             </w:r>
           </w:p>
         </w:tc>
@@ -129,13 +162,13 @@
     </w:p>
     <w:p>
       <w:pPr>
-        <w:spacing w:before="240" w:after="80"/>
+        <w:spacing w:before="200" w:after="80"/>
       </w:pPr>
       <w:r>
         <w:rPr>
           <w:b/>
           <w:color w:val="142A28"/>
-          <w:sz w:val="28"/>
+          <w:sz w:val="26"/>
         </w:rPr>
         <w:t>Registration form</w:t>
       </w:r>
@@ -164,7 +197,7 @@
                 <w:b/>
                 <w:sz w:val="21"/>
               </w:rPr>
-              <w:t>☐  I confirm my details are accurate and I understand how The Schoeman Clinic will use my information to provide my care, as set out below and in the Privacy Policy.   [REQUIRED]</w:t>
+              <w:t>☐  I confirm my details are accurate and I understand how The Schoeman Clinic will use my information to provide my care, as set out in the privacy notice below.   [REQUIRED]</w:t>
             </w:r>
           </w:p>
           <w:p>
@@ -173,7 +206,7 @@
             </w:pPr>
             <w:r>
               <w:rPr>
-                <w:sz w:val="20"/>
+                <w:sz w:val="21"/>
               </w:rPr>
               <w:t>☐  Keep me updated with clinic news and updates by email.   [OPTIONAL]</w:t>
             </w:r>
@@ -184,7 +217,7 @@
             </w:pPr>
             <w:r>
               <w:rPr>
-                <w:sz w:val="20"/>
+                <w:sz w:val="21"/>
               </w:rPr>
               <w:t>☐ Email     ☐ WhatsApp     ☐ SMS / phone.   How we contact you about your care.</w:t>
             </w:r>
@@ -197,30 +230,58 @@
         <w:spacing w:after="120" w:before="0"/>
       </w:pPr>
     </w:p>
+    <w:tbl>
+      <w:tblPr>
+        <w:tblStyle w:val="TableGrid"/>
+        <w:tblW w:type="auto" w:w="0"/>
+        <w:tblLook w:firstColumn="1" w:firstRow="1" w:lastColumn="0" w:lastRow="0" w:noHBand="0" w:noVBand="1" w:val="04A0"/>
+      </w:tblPr>
+      <w:tblGrid>
+        <w:gridCol w:w="9648"/>
+      </w:tblGrid>
+      <w:tr>
+        <w:tc>
+          <w:tcPr>
+            <w:tcW w:type="dxa" w:w="9648"/>
+            <w:shd w:val="clear" w:fill="142A28"/>
+          </w:tcPr>
+          <w:p>
+            <w:r>
+              <w:rPr>
+                <w:b/>
+                <w:color w:val="FFFFFF"/>
+                <w:sz w:val="26"/>
+              </w:rPr>
+              <w:t>Privacy Notice — how we use and protect your information</w:t>
+            </w:r>
+          </w:p>
+        </w:tc>
+      </w:tr>
+    </w:tbl>
     <w:p>
       <w:pPr>
-        <w:spacing w:before="240" w:after="80"/>
+        <w:spacing w:after="80" w:before="0"/>
+      </w:pPr>
+    </w:p>
+    <w:p>
+      <w:pPr>
+        <w:spacing w:before="160" w:after="20"/>
       </w:pPr>
       <w:r>
         <w:rPr>
           <w:b/>
-          <w:color w:val="142A28"/>
-          <w:sz w:val="28"/>
+          <w:color w:val="0E6E68"/>
+          <w:sz w:val="22"/>
         </w:rPr>
-        <w:t>The details — how we use and protect your information</w:t>
+        <w:t xml:space="preserve">1.  </w:t>
       </w:r>
-    </w:p>
-    <w:p>
-      <w:pPr>
-        <w:spacing w:after="20" w:before="120"/>
-      </w:pPr>
       <w:r>
         <w:rPr>
           <w:b/>
           <w:color w:val="0B534E"/>
-          <w:sz w:val="21"/>
+          <w:sz w:val="22"/>
         </w:rPr>
-        <w:t>What we collect</w:t>
+        <w:t>Who we are</w:t>
       </w:r>
     </w:p>
     <w:p>
@@ -231,20 +292,28 @@
         <w:rPr>
           <w:sz w:val="21"/>
         </w:rPr>
-        <w:t>Your contact details and the health information you choose to share, so we can respond to you and provide your care.</w:t>
+        <w:t>The Schoeman Clinic is the data controller for the information we hold about you. We are a UK private clinic, registered with the Care Quality Commission. For any question about your information, or to exercise your rights, contact [clinic address, data-protection contact and email].</w:t>
       </w:r>
     </w:p>
     <w:p>
       <w:pPr>
-        <w:spacing w:after="20" w:before="120"/>
+        <w:spacing w:before="160" w:after="20"/>
       </w:pPr>
       <w:r>
         <w:rPr>
           <w:b/>
+          <w:color w:val="0E6E68"/>
+          <w:sz w:val="22"/>
+        </w:rPr>
+        <w:t xml:space="preserve">2.  </w:t>
+      </w:r>
+      <w:r>
+        <w:rPr>
+          <w:b/>
           <w:color w:val="0B534E"/>
-          <w:sz w:val="21"/>
+          <w:sz w:val="22"/>
         </w:rPr>
-        <w:t>Why we can use it (our lawful basis)</w:t>
+        <w:t>The information we collect</w:t>
       </w:r>
     </w:p>
     <w:p>
@@ -255,20 +324,76 @@
         <w:rPr>
           <w:sz w:val="21"/>
         </w:rPr>
-        <w:t>Because health information is sensitive, we ask for your explicit consent to use it when you enquire (UK GDPR Article 9(2)(a)). Once you are a patient, we use it to provide your healthcare under UK GDPR Article 9(2)(h) and the Data Protection Act 2018.</w:t>
+        <w:t>We collect the details you give us and the information created as we care for you, including:</w:t>
       </w:r>
     </w:p>
     <w:p>
       <w:pPr>
-        <w:spacing w:after="20" w:before="120"/>
+        <w:pStyle w:val="ListBullet"/>
+        <w:spacing w:after="20"/>
+      </w:pPr>
+      <w:r>
+        <w:rPr>
+          <w:sz w:val="21"/>
+        </w:rPr>
+        <w:t>Identity and contact details (name, email, phone, sex at birth).</w:t>
+      </w:r>
+    </w:p>
+    <w:p>
+      <w:pPr>
+        <w:pStyle w:val="ListBullet"/>
+        <w:spacing w:after="20"/>
+      </w:pPr>
+      <w:r>
+        <w:rPr>
+          <w:sz w:val="21"/>
+        </w:rPr>
+        <w:t>Health information you share, your medical history, test results and treatment plans.</w:t>
+      </w:r>
+    </w:p>
+    <w:p>
+      <w:pPr>
+        <w:pStyle w:val="ListBullet"/>
+        <w:spacing w:after="20"/>
+      </w:pPr>
+      <w:r>
+        <w:rPr>
+          <w:sz w:val="21"/>
+        </w:rPr>
+        <w:t>Appointment, payment and billing details.</w:t>
+      </w:r>
+    </w:p>
+    <w:p>
+      <w:pPr>
+        <w:pStyle w:val="ListBullet"/>
+        <w:spacing w:after="20"/>
+      </w:pPr>
+      <w:r>
+        <w:rPr>
+          <w:sz w:val="21"/>
+        </w:rPr>
+        <w:t>Your messages and communications with us.</w:t>
+      </w:r>
+    </w:p>
+    <w:p>
+      <w:pPr>
+        <w:spacing w:before="160" w:after="20"/>
       </w:pPr>
       <w:r>
         <w:rPr>
           <w:b/>
+          <w:color w:val="0E6E68"/>
+          <w:sz w:val="22"/>
+        </w:rPr>
+        <w:t xml:space="preserve">3.  </w:t>
+      </w:r>
+      <w:r>
+        <w:rPr>
+          <w:b/>
           <w:color w:val="0B534E"/>
-          <w:sz w:val="21"/>
+          <w:sz w:val="22"/>
         </w:rPr>
-        <w:t>How we contact you</w:t>
+        <w:t>How and why we use it</w:t>
       </w:r>
     </w:p>
     <w:p>
@@ -279,20 +404,28 @@
         <w:rPr>
           <w:sz w:val="21"/>
         </w:rPr>
-        <w:t>Only in the ways you choose above. We use WhatsApp, SMS and email for appointment reminders and service messages. We send marketing or newsletters only if you opt in, and you can unsubscribe at any time.</w:t>
+        <w:t>We use your information to respond to your enquiry, provide and coordinate your care, arrange tests and prescriptions, manage your appointments and payments, meet our legal and regulatory duties, and, only if you opt in, send you clinic news and updates.</w:t>
       </w:r>
     </w:p>
     <w:p>
       <w:pPr>
-        <w:spacing w:after="20" w:before="120"/>
+        <w:spacing w:before="160" w:after="20"/>
       </w:pPr>
       <w:r>
         <w:rPr>
           <w:b/>
+          <w:color w:val="0E6E68"/>
+          <w:sz w:val="22"/>
+        </w:rPr>
+        <w:t xml:space="preserve">4.  </w:t>
+      </w:r>
+      <w:r>
+        <w:rPr>
+          <w:b/>
           <w:color w:val="0B534E"/>
-          <w:sz w:val="21"/>
+          <w:sz w:val="22"/>
         </w:rPr>
-        <w:t>Where your information is kept</w:t>
+        <w:t>Our lawful basis</w:t>
       </w:r>
     </w:p>
     <w:p>
@@ -301,20 +434,113 @@
       </w:pPr>
       <w:r>
         <w:rPr>
+          <w:b w:val="0"/>
           <w:sz w:val="21"/>
         </w:rPr>
-        <w:t>Your clinical record is held securely in our clinical system; our day-to-day messaging and admin are handled in our secure practice system. Both are protected with access controls and appropriate safeguards, including for any storage outside the UK.</w:t>
+        <w:t xml:space="preserve">Under UK GDPR we rely on your </w:t>
+      </w:r>
+      <w:r>
+        <w:rPr>
+          <w:b/>
+          <w:sz w:val="21"/>
+        </w:rPr>
+        <w:t>consent</w:t>
+      </w:r>
+      <w:r>
+        <w:rPr>
+          <w:b w:val="0"/>
+          <w:sz w:val="21"/>
+        </w:rPr>
+        <w:t xml:space="preserve"> (Article 6(1)(a)) to respond to enquiries and to send marketing; </w:t>
+      </w:r>
+      <w:r>
+        <w:rPr>
+          <w:b/>
+          <w:sz w:val="21"/>
+        </w:rPr>
+        <w:t>contract</w:t>
+      </w:r>
+      <w:r>
+        <w:rPr>
+          <w:b w:val="0"/>
+          <w:sz w:val="21"/>
+        </w:rPr>
+        <w:t xml:space="preserve"> (Article 6(1)(b)) to provide your care and take payment; </w:t>
+      </w:r>
+      <w:r>
+        <w:rPr>
+          <w:b/>
+          <w:sz w:val="21"/>
+        </w:rPr>
+        <w:t>legal obligation</w:t>
+      </w:r>
+      <w:r>
+        <w:rPr>
+          <w:b w:val="0"/>
+          <w:sz w:val="21"/>
+        </w:rPr>
+        <w:t xml:space="preserve"> (Article 6(1)(c)) where the law requires; and our </w:t>
+      </w:r>
+      <w:r>
+        <w:rPr>
+          <w:b/>
+          <w:sz w:val="21"/>
+        </w:rPr>
+        <w:t>legitimate interests</w:t>
+      </w:r>
+      <w:r>
+        <w:rPr>
+          <w:b w:val="0"/>
+          <w:sz w:val="21"/>
+        </w:rPr>
+        <w:t xml:space="preserve"> (Article 6(1)(f)) to run the clinic and send service messages. Because health information is special-category data, we also rely on your </w:t>
+      </w:r>
+      <w:r>
+        <w:rPr>
+          <w:b/>
+          <w:sz w:val="21"/>
+        </w:rPr>
+        <w:t>explicit consent</w:t>
+      </w:r>
+      <w:r>
+        <w:rPr>
+          <w:b w:val="0"/>
+          <w:sz w:val="21"/>
+        </w:rPr>
+        <w:t xml:space="preserve"> when you enquire (Article 9(2)(a)) and on </w:t>
+      </w:r>
+      <w:r>
+        <w:rPr>
+          <w:b/>
+          <w:sz w:val="21"/>
+        </w:rPr>
+        <w:t>provision of health care</w:t>
+      </w:r>
+      <w:r>
+        <w:rPr>
+          <w:b w:val="0"/>
+          <w:sz w:val="21"/>
+        </w:rPr>
+        <w:t xml:space="preserve"> once you are a patient (Article 9(2)(h)), together with the Data Protection Act 2018.</w:t>
       </w:r>
     </w:p>
     <w:p>
       <w:pPr>
-        <w:spacing w:after="20" w:before="120"/>
+        <w:spacing w:before="160" w:after="20"/>
       </w:pPr>
       <w:r>
         <w:rPr>
           <w:b/>
+          <w:color w:val="0E6E68"/>
+          <w:sz w:val="22"/>
+        </w:rPr>
+        <w:t xml:space="preserve">5.  </w:t>
+      </w:r>
+      <w:r>
+        <w:rPr>
+          <w:b/>
           <w:color w:val="0B534E"/>
-          <w:sz w:val="21"/>
+          <w:sz w:val="22"/>
         </w:rPr>
         <w:t>Who we share it with</w:t>
       </w:r>
@@ -327,18 +553,58 @@
         <w:rPr>
           <w:sz w:val="21"/>
         </w:rPr>
-        <w:t>Only trusted providers who help deliver your care — such as laboratories and pharmacies — under contract. We never sell your information.</w:t>
+        <w:t>We share your information only where needed to deliver your care: with laboratories and pharmacies, with the secure systems we use to run the clinic and message you (which act for us under contract), with our payment provider, and with regulators or authorities where the law requires. We never sell your information.</w:t>
       </w:r>
     </w:p>
     <w:p>
       <w:pPr>
-        <w:spacing w:after="20" w:before="120"/>
+        <w:spacing w:before="160" w:after="20"/>
       </w:pPr>
       <w:r>
         <w:rPr>
           <w:b/>
+          <w:color w:val="0E6E68"/>
+          <w:sz w:val="22"/>
+        </w:rPr>
+        <w:t xml:space="preserve">6.  </w:t>
+      </w:r>
+      <w:r>
+        <w:rPr>
+          <w:b/>
           <w:color w:val="0B534E"/>
+          <w:sz w:val="22"/>
+        </w:rPr>
+        <w:t>Storing your information and international transfers</w:t>
+      </w:r>
+    </w:p>
+    <w:p>
+      <w:pPr>
+        <w:spacing w:after="40"/>
+      </w:pPr>
+      <w:r>
+        <w:rPr>
           <w:sz w:val="21"/>
+        </w:rPr>
+        <w:t>Your clinical record is held securely in our clinical system in the UK. Some of the service providers we use store information outside the UK; where they do, we put appropriate safeguards in place, such as the UK International Data Transfer Agreement, so your information stays protected.</w:t>
+      </w:r>
+    </w:p>
+    <w:p>
+      <w:pPr>
+        <w:spacing w:before="160" w:after="20"/>
+      </w:pPr>
+      <w:r>
+        <w:rPr>
+          <w:b/>
+          <w:color w:val="0E6E68"/>
+          <w:sz w:val="22"/>
+        </w:rPr>
+        <w:t xml:space="preserve">7.  </w:t>
+      </w:r>
+      <w:r>
+        <w:rPr>
+          <w:b/>
+          <w:color w:val="0B534E"/>
+          <w:sz w:val="22"/>
         </w:rPr>
         <w:t>How long we keep it</w:t>
       </w:r>
@@ -351,18 +617,58 @@
         <w:rPr>
           <w:sz w:val="21"/>
         </w:rPr>
-        <w:t>Only as long as needed. Clinical records are kept in line with healthcare guidance; enquiries that do not proceed are kept for a limited period and then deleted.</w:t>
+        <w:t>We keep your information only as long as needed. Adult clinical records are kept for around eight years after your last treatment, in line with healthcare guidance; enquiries that do not proceed are kept for a limited period and then deleted; financial records are kept for around six years; and marketing contacts are kept until you unsubscribe.</w:t>
       </w:r>
     </w:p>
     <w:p>
       <w:pPr>
-        <w:spacing w:after="20" w:before="120"/>
+        <w:spacing w:before="160" w:after="20"/>
       </w:pPr>
       <w:r>
         <w:rPr>
           <w:b/>
+          <w:color w:val="0E6E68"/>
+          <w:sz w:val="22"/>
+        </w:rPr>
+        <w:t xml:space="preserve">8.  </w:t>
+      </w:r>
+      <w:r>
+        <w:rPr>
+          <w:b/>
           <w:color w:val="0B534E"/>
+          <w:sz w:val="22"/>
+        </w:rPr>
+        <w:t>Keeping your information secure</w:t>
+      </w:r>
+    </w:p>
+    <w:p>
+      <w:pPr>
+        <w:spacing w:after="40"/>
+      </w:pPr>
+      <w:r>
+        <w:rPr>
           <w:sz w:val="21"/>
+        </w:rPr>
+        <w:t>We protect your information with access controls, staff confidentiality obligations and appropriate technical and organisational measures, and we limit access to those who need it to care for you.</w:t>
+      </w:r>
+    </w:p>
+    <w:p>
+      <w:pPr>
+        <w:spacing w:before="160" w:after="20"/>
+      </w:pPr>
+      <w:r>
+        <w:rPr>
+          <w:b/>
+          <w:color w:val="0E6E68"/>
+          <w:sz w:val="22"/>
+        </w:rPr>
+        <w:t xml:space="preserve">9.  </w:t>
+      </w:r>
+      <w:r>
+        <w:rPr>
+          <w:b/>
+          <w:color w:val="0B534E"/>
+          <w:sz w:val="22"/>
         </w:rPr>
         <w:t>Your rights</w:t>
       </w:r>
@@ -375,20 +681,28 @@
         <w:rPr>
           <w:sz w:val="21"/>
         </w:rPr>
-        <w:t>You can ask to see, correct or delete your information, and withdraw consent at any time — as easily as you gave it. Withdrawing marketing consent never affects your care. We respond within one month.</w:t>
+        <w:t>You can ask to access, correct or delete your information, restrict or object to how we use it, ask for a copy to reuse elsewhere, and withdraw consent at any time, as easily as you gave it. Withdrawing marketing consent never affects your care. We respond within one month. The right to erasure is limited where we must keep records for clinical or legal reasons.</w:t>
       </w:r>
     </w:p>
     <w:p>
       <w:pPr>
-        <w:spacing w:after="20" w:before="120"/>
+        <w:spacing w:before="160" w:after="20"/>
       </w:pPr>
       <w:r>
         <w:rPr>
           <w:b/>
+          <w:color w:val="0E6E68"/>
+          <w:sz w:val="22"/>
+        </w:rPr>
+        <w:t xml:space="preserve">10.  </w:t>
+      </w:r>
+      <w:r>
+        <w:rPr>
+          <w:b/>
           <w:color w:val="0B534E"/>
-          <w:sz w:val="21"/>
+          <w:sz w:val="22"/>
         </w:rPr>
-        <w:t>Contact</w:t>
+        <w:t>Marketing and your choices</w:t>
       </w:r>
     </w:p>
     <w:p>
@@ -399,7 +713,71 @@
         <w:rPr>
           <w:sz w:val="21"/>
         </w:rPr>
-        <w:t>To exercise any of these, or to ask a question about your information, contact [data-protection contact and email].</w:t>
+        <w:t>We send clinic news and newsletters only to patients who have opted in, and you can unsubscribe at any time. We use WhatsApp, SMS and email for appointment reminders and service messages; these are separate from marketing.</w:t>
+      </w:r>
+    </w:p>
+    <w:p>
+      <w:pPr>
+        <w:spacing w:before="160" w:after="20"/>
+      </w:pPr>
+      <w:r>
+        <w:rPr>
+          <w:b/>
+          <w:color w:val="0E6E68"/>
+          <w:sz w:val="22"/>
+        </w:rPr>
+        <w:t xml:space="preserve">11.  </w:t>
+      </w:r>
+      <w:r>
+        <w:rPr>
+          <w:b/>
+          <w:color w:val="0B534E"/>
+          <w:sz w:val="22"/>
+        </w:rPr>
+        <w:t>Your right to complain</w:t>
+      </w:r>
+    </w:p>
+    <w:p>
+      <w:pPr>
+        <w:spacing w:after="40"/>
+      </w:pPr>
+      <w:r>
+        <w:rPr>
+          <w:sz w:val="21"/>
+        </w:rPr>
+        <w:t>If you have a concern about how we handle your information, please tell us first so we can put it right. You also have the right to complain to the Information Commissioner’s Office at ico.org.uk or on 0303 123 1113.</w:t>
+      </w:r>
+    </w:p>
+    <w:p>
+      <w:pPr>
+        <w:spacing w:before="160" w:after="20"/>
+      </w:pPr>
+      <w:r>
+        <w:rPr>
+          <w:b/>
+          <w:color w:val="0E6E68"/>
+          <w:sz w:val="22"/>
+        </w:rPr>
+        <w:t xml:space="preserve">12.  </w:t>
+      </w:r>
+      <w:r>
+        <w:rPr>
+          <w:b/>
+          <w:color w:val="0B534E"/>
+          <w:sz w:val="22"/>
+        </w:rPr>
+        <w:t>Changes to this notice</w:t>
+      </w:r>
+    </w:p>
+    <w:p>
+      <w:pPr>
+        <w:spacing w:after="40"/>
+      </w:pPr>
+      <w:r>
+        <w:rPr>
+          <w:sz w:val="21"/>
+        </w:rPr>
+        <w:t>We may update this notice from time to time. The current version applies from [date].</w:t>
       </w:r>
     </w:p>
     <w:p>
@@ -418,7 +796,7 @@
           <w:color w:val="A33A2C"/>
           <w:sz w:val="18"/>
         </w:rPr>
-        <w:t>This is a working draft to speed up your compliance process. Have a qualified lawyer or your data-protection adviser review and sign it off before it goes live. Governing regime: UK GDPR, Data Protection Act 2018 and PECR.</w:t>
+        <w:t>This is a working draft to speed up your compliance process. Have a qualified lawyer or your data-protection adviser review and sign it off before it goes live. Governing regime: UK GDPR, Data Protection Act 2018 and PECR. Items in [brackets] are for the clinic to confirm.</w:t>
       </w:r>
     </w:p>
     <w:sectPr>

</xml_diff>